<commit_message>
Docs: static TOC for LibreOffice, keep tables/headings together, game title on cover
</commit_message>
<xml_diff>
--- a/docs/Historia_O_Coracao_de_Eter.docx
+++ b/docs/Historia_O_Coracao_de_Eter.docx
@@ -88,6 +88,7 @@
       </w:tblGrid>
       <w:tr>
         <w:trPr>
+          <w:cantSplit/>
           <w:tblHeader/>
         </w:trPr>
         <w:tc>
@@ -109,6 +110,9 @@
             <w:vAlign w:val="center"/>
           </w:tcPr>
           <w:p>
+            <w:pPr>
+              <w:keepNext/>
+            </w:pPr>
             <w:r>
               <w:rPr>
                 <w:b/>
@@ -140,6 +144,9 @@
             <w:vAlign w:val="center"/>
           </w:tcPr>
           <w:p>
+            <w:pPr>
+              <w:keepNext/>
+            </w:pPr>
             <w:r>
               <w:rPr>
                 <w:b/>
@@ -154,6 +161,9 @@
         </w:tc>
       </w:tr>
       <w:tr>
+        <w:trPr>
+          <w:cantSplit/>
+        </w:trPr>
         <w:tc>
           <w:tcPr>
             <w:tcW w:type="dxa" w:w="3373"/>
@@ -172,6 +182,9 @@
             <w:vAlign w:val="center"/>
           </w:tcPr>
           <w:p>
+            <w:pPr>
+              <w:keepNext/>
+            </w:pPr>
             <w:r>
               <w:rPr>
                 <w:sz w:val="19"/>
@@ -199,6 +212,9 @@
             <w:vAlign w:val="center"/>
           </w:tcPr>
           <w:p>
+            <w:pPr>
+              <w:keepNext/>
+            </w:pPr>
             <w:r>
               <w:rPr>
                 <w:sz w:val="19"/>
@@ -210,6 +226,9 @@
         </w:tc>
       </w:tr>
       <w:tr>
+        <w:trPr>
+          <w:cantSplit/>
+        </w:trPr>
         <w:tc>
           <w:tcPr>
             <w:tcW w:type="dxa" w:w="3373"/>
@@ -228,6 +247,9 @@
             <w:vAlign w:val="center"/>
           </w:tcPr>
           <w:p>
+            <w:pPr>
+              <w:keepNext/>
+            </w:pPr>
             <w:r>
               <w:rPr>
                 <w:sz w:val="19"/>
@@ -255,6 +277,9 @@
             <w:vAlign w:val="center"/>
           </w:tcPr>
           <w:p>
+            <w:pPr>
+              <w:keepNext/>
+            </w:pPr>
             <w:r>
               <w:rPr>
                 <w:sz w:val="19"/>
@@ -266,6 +291,9 @@
         </w:tc>
       </w:tr>
       <w:tr>
+        <w:trPr>
+          <w:cantSplit/>
+        </w:trPr>
         <w:tc>
           <w:tcPr>
             <w:tcW w:type="dxa" w:w="3373"/>
@@ -284,6 +312,9 @@
             <w:vAlign w:val="center"/>
           </w:tcPr>
           <w:p>
+            <w:pPr>
+              <w:keepNext/>
+            </w:pPr>
             <w:r>
               <w:rPr>
                 <w:sz w:val="19"/>
@@ -311,6 +342,9 @@
             <w:vAlign w:val="center"/>
           </w:tcPr>
           <w:p>
+            <w:pPr>
+              <w:keepNext/>
+            </w:pPr>
             <w:r>
               <w:rPr>
                 <w:sz w:val="19"/>
@@ -322,6 +356,9 @@
         </w:tc>
       </w:tr>
       <w:tr>
+        <w:trPr>
+          <w:cantSplit/>
+        </w:trPr>
         <w:tc>
           <w:tcPr>
             <w:tcW w:type="dxa" w:w="3373"/>
@@ -340,6 +377,9 @@
             <w:vAlign w:val="center"/>
           </w:tcPr>
           <w:p>
+            <w:pPr>
+              <w:keepNext w:val="false"/>
+            </w:pPr>
             <w:r>
               <w:rPr>
                 <w:sz w:val="19"/>
@@ -367,6 +407,9 @@
             <w:vAlign w:val="center"/>
           </w:tcPr>
           <w:p>
+            <w:pPr>
+              <w:keepNext w:val="false"/>
+            </w:pPr>
             <w:r>
               <w:rPr>
                 <w:sz w:val="19"/>
@@ -400,38 +443,88 @@
     </w:p>
     <w:p>
       <w:pPr>
-        <w:spacing w:after="120"/>
+        <w:spacing w:after="140"/>
       </w:pPr>
       <w:r>
         <w:rPr>
-          <w:i/>
-          <w:iCs/>
-          <w:color w:val="777777"/>
-          <w:sz w:val="18"/>
-          <w:szCs w:val="18"/>
+          <w:sz w:val="24"/>
+          <w:szCs w:val="24"/>
         </w:rPr>
-        <w:t xml:space="preserve">Clique com o botão direito no sumário e escolha "Atualizar campo" para gerar os números de página.</w:t>
+        <w:t xml:space="preserve">1. A história em uma página</w:t>
       </w:r>
     </w:p>
-    <w:sdt>
-      <w:sdtPr>
-        <w:alias w:val="Sumário"/>
-      </w:sdtPr>
-      <w:sdtContent>
-        <w:p>
-          <w:r>
-            <w:fldChar w:fldCharType="begin" w:dirty="true"/>
-            <w:instrText xml:space="preserve">TOC \h \o "1-2"</w:instrText>
-            <w:fldChar w:fldCharType="separate"/>
-          </w:r>
-        </w:p>
-        <w:p>
-          <w:r>
-            <w:fldChar w:fldCharType="end"/>
-          </w:r>
-        </w:p>
-      </w:sdtContent>
-    </w:sdt>
+    <w:p>
+      <w:pPr>
+        <w:spacing w:after="140"/>
+      </w:pPr>
+      <w:r>
+        <w:rPr>
+          <w:sz w:val="24"/>
+          <w:szCs w:val="24"/>
+        </w:rPr>
+        <w:t xml:space="preserve">2. O mundo de Velmora</w:t>
+      </w:r>
+    </w:p>
+    <w:p>
+      <w:pPr>
+        <w:spacing w:after="140"/>
+      </w:pPr>
+      <w:r>
+        <w:rPr>
+          <w:sz w:val="24"/>
+          <w:szCs w:val="24"/>
+        </w:rPr>
+        <w:t xml:space="preserve">3. O grupo</w:t>
+      </w:r>
+    </w:p>
+    <w:p>
+      <w:pPr>
+        <w:spacing w:after="140"/>
+      </w:pPr>
+      <w:r>
+        <w:rPr>
+          <w:sz w:val="24"/>
+          <w:szCs w:val="24"/>
+        </w:rPr>
+        <w:t xml:space="preserve">4. Antagonistas</w:t>
+      </w:r>
+    </w:p>
+    <w:p>
+      <w:pPr>
+        <w:spacing w:after="140"/>
+      </w:pPr>
+      <w:r>
+        <w:rPr>
+          <w:sz w:val="24"/>
+          <w:szCs w:val="24"/>
+        </w:rPr>
+        <w:t xml:space="preserve">5. Estrutura em atos</w:t>
+      </w:r>
+    </w:p>
+    <w:p>
+      <w:pPr>
+        <w:spacing w:after="140"/>
+      </w:pPr>
+      <w:r>
+        <w:rPr>
+          <w:sz w:val="24"/>
+          <w:szCs w:val="24"/>
+        </w:rPr>
+        <w:t xml:space="preserve">6. Técnicas combinadas (exemplos)</w:t>
+      </w:r>
+    </w:p>
+    <w:p>
+      <w:pPr>
+        <w:spacing w:after="140"/>
+      </w:pPr>
+      <w:r>
+        <w:rPr>
+          <w:sz w:val="24"/>
+          <w:szCs w:val="24"/>
+        </w:rPr>
+        <w:t xml:space="preserve">7. Pontos em aberto para o Diretor</w:t>
+      </w:r>
+    </w:p>
     <w:p>
       <w:pPr>
         <w:pStyle w:val="Heading1"/>
@@ -457,6 +550,7 @@
     </w:p>
     <w:p>
       <w:pPr>
+        <w:keepNext w:val="false"/>
         <w:spacing w:after="120"/>
       </w:pPr>
       <w:r>
@@ -495,6 +589,7 @@
     </w:p>
     <w:p>
       <w:pPr>
+        <w:keepNext w:val="false"/>
         <w:spacing w:after="120"/>
       </w:pPr>
       <w:r>
@@ -533,6 +628,7 @@
     </w:p>
     <w:p>
       <w:pPr>
+        <w:keepNext w:val="false"/>
         <w:spacing w:after="120"/>
       </w:pPr>
       <w:r>
@@ -591,6 +687,7 @@
     </w:p>
     <w:p>
       <w:pPr>
+        <w:keepNext w:val="false"/>
         <w:spacing w:after="120"/>
       </w:pPr>
       <w:r>
@@ -711,6 +808,7 @@
       </w:tblGrid>
       <w:tr>
         <w:trPr>
+          <w:cantSplit/>
           <w:tblHeader/>
         </w:trPr>
         <w:tc>
@@ -732,6 +830,9 @@
             <w:vAlign w:val="center"/>
           </w:tcPr>
           <w:p>
+            <w:pPr>
+              <w:keepNext/>
+            </w:pPr>
             <w:r>
               <w:rPr>
                 <w:b/>
@@ -763,6 +864,9 @@
             <w:vAlign w:val="center"/>
           </w:tcPr>
           <w:p>
+            <w:pPr>
+              <w:keepNext/>
+            </w:pPr>
             <w:r>
               <w:rPr>
                 <w:b/>
@@ -777,6 +881,9 @@
         </w:tc>
       </w:tr>
       <w:tr>
+        <w:trPr>
+          <w:cantSplit/>
+        </w:trPr>
         <w:tc>
           <w:tcPr>
             <w:tcW w:type="dxa" w:w="2891"/>
@@ -795,6 +902,9 @@
             <w:vAlign w:val="center"/>
           </w:tcPr>
           <w:p>
+            <w:pPr>
+              <w:keepNext/>
+            </w:pPr>
             <w:r>
               <w:rPr>
                 <w:sz w:val="19"/>
@@ -822,6 +932,9 @@
             <w:vAlign w:val="center"/>
           </w:tcPr>
           <w:p>
+            <w:pPr>
+              <w:keepNext/>
+            </w:pPr>
             <w:r>
               <w:rPr>
                 <w:sz w:val="19"/>
@@ -833,6 +946,9 @@
         </w:tc>
       </w:tr>
       <w:tr>
+        <w:trPr>
+          <w:cantSplit/>
+        </w:trPr>
         <w:tc>
           <w:tcPr>
             <w:tcW w:type="dxa" w:w="2891"/>
@@ -851,6 +967,9 @@
             <w:vAlign w:val="center"/>
           </w:tcPr>
           <w:p>
+            <w:pPr>
+              <w:keepNext/>
+            </w:pPr>
             <w:r>
               <w:rPr>
                 <w:sz w:val="19"/>
@@ -878,6 +997,9 @@
             <w:vAlign w:val="center"/>
           </w:tcPr>
           <w:p>
+            <w:pPr>
+              <w:keepNext/>
+            </w:pPr>
             <w:r>
               <w:rPr>
                 <w:sz w:val="19"/>
@@ -889,6 +1011,9 @@
         </w:tc>
       </w:tr>
       <w:tr>
+        <w:trPr>
+          <w:cantSplit/>
+        </w:trPr>
         <w:tc>
           <w:tcPr>
             <w:tcW w:type="dxa" w:w="2891"/>
@@ -907,6 +1032,9 @@
             <w:vAlign w:val="center"/>
           </w:tcPr>
           <w:p>
+            <w:pPr>
+              <w:keepNext/>
+            </w:pPr>
             <w:r>
               <w:rPr>
                 <w:sz w:val="19"/>
@@ -934,6 +1062,9 @@
             <w:vAlign w:val="center"/>
           </w:tcPr>
           <w:p>
+            <w:pPr>
+              <w:keepNext/>
+            </w:pPr>
             <w:r>
               <w:rPr>
                 <w:sz w:val="19"/>
@@ -945,6 +1076,9 @@
         </w:tc>
       </w:tr>
       <w:tr>
+        <w:trPr>
+          <w:cantSplit/>
+        </w:trPr>
         <w:tc>
           <w:tcPr>
             <w:tcW w:type="dxa" w:w="2891"/>
@@ -963,6 +1097,9 @@
             <w:vAlign w:val="center"/>
           </w:tcPr>
           <w:p>
+            <w:pPr>
+              <w:keepNext/>
+            </w:pPr>
             <w:r>
               <w:rPr>
                 <w:sz w:val="19"/>
@@ -990,6 +1127,9 @@
             <w:vAlign w:val="center"/>
           </w:tcPr>
           <w:p>
+            <w:pPr>
+              <w:keepNext/>
+            </w:pPr>
             <w:r>
               <w:rPr>
                 <w:sz w:val="19"/>
@@ -1001,6 +1141,9 @@
         </w:tc>
       </w:tr>
       <w:tr>
+        <w:trPr>
+          <w:cantSplit/>
+        </w:trPr>
         <w:tc>
           <w:tcPr>
             <w:tcW w:type="dxa" w:w="2891"/>
@@ -1019,6 +1162,9 @@
             <w:vAlign w:val="center"/>
           </w:tcPr>
           <w:p>
+            <w:pPr>
+              <w:keepNext w:val="false"/>
+            </w:pPr>
             <w:r>
               <w:rPr>
                 <w:sz w:val="19"/>
@@ -1046,6 +1192,9 @@
             <w:vAlign w:val="center"/>
           </w:tcPr>
           <w:p>
+            <w:pPr>
+              <w:keepNext w:val="false"/>
+            </w:pPr>
             <w:r>
               <w:rPr>
                 <w:sz w:val="19"/>
@@ -1177,6 +1326,7 @@
       </w:tblGrid>
       <w:tr>
         <w:trPr>
+          <w:cantSplit/>
           <w:tblHeader/>
         </w:trPr>
         <w:tc>
@@ -1198,6 +1348,9 @@
             <w:vAlign w:val="center"/>
           </w:tcPr>
           <w:p>
+            <w:pPr>
+              <w:keepNext/>
+            </w:pPr>
             <w:r>
               <w:rPr>
                 <w:b/>
@@ -1229,6 +1382,9 @@
             <w:vAlign w:val="center"/>
           </w:tcPr>
           <w:p>
+            <w:pPr>
+              <w:keepNext/>
+            </w:pPr>
             <w:r>
               <w:rPr>
                 <w:b/>
@@ -1260,6 +1416,9 @@
             <w:vAlign w:val="center"/>
           </w:tcPr>
           <w:p>
+            <w:pPr>
+              <w:keepNext/>
+            </w:pPr>
             <w:r>
               <w:rPr>
                 <w:b/>
@@ -1274,6 +1433,9 @@
         </w:tc>
       </w:tr>
       <w:tr>
+        <w:trPr>
+          <w:cantSplit/>
+        </w:trPr>
         <w:tc>
           <w:tcPr>
             <w:tcW w:type="dxa" w:w="2120"/>
@@ -1292,6 +1454,9 @@
             <w:vAlign w:val="center"/>
           </w:tcPr>
           <w:p>
+            <w:pPr>
+              <w:keepNext/>
+            </w:pPr>
             <w:r>
               <w:rPr>
                 <w:sz w:val="19"/>
@@ -1319,6 +1484,9 @@
             <w:vAlign w:val="center"/>
           </w:tcPr>
           <w:p>
+            <w:pPr>
+              <w:keepNext/>
+            </w:pPr>
             <w:r>
               <w:rPr>
                 <w:sz w:val="19"/>
@@ -1346,6 +1514,9 @@
             <w:vAlign w:val="center"/>
           </w:tcPr>
           <w:p>
+            <w:pPr>
+              <w:keepNext/>
+            </w:pPr>
             <w:r>
               <w:rPr>
                 <w:sz w:val="19"/>
@@ -1357,6 +1528,9 @@
         </w:tc>
       </w:tr>
       <w:tr>
+        <w:trPr>
+          <w:cantSplit/>
+        </w:trPr>
         <w:tc>
           <w:tcPr>
             <w:tcW w:type="dxa" w:w="2120"/>
@@ -1375,6 +1549,9 @@
             <w:vAlign w:val="center"/>
           </w:tcPr>
           <w:p>
+            <w:pPr>
+              <w:keepNext/>
+            </w:pPr>
             <w:r>
               <w:rPr>
                 <w:sz w:val="19"/>
@@ -1402,6 +1579,9 @@
             <w:vAlign w:val="center"/>
           </w:tcPr>
           <w:p>
+            <w:pPr>
+              <w:keepNext/>
+            </w:pPr>
             <w:r>
               <w:rPr>
                 <w:sz w:val="19"/>
@@ -1429,6 +1609,9 @@
             <w:vAlign w:val="center"/>
           </w:tcPr>
           <w:p>
+            <w:pPr>
+              <w:keepNext/>
+            </w:pPr>
             <w:r>
               <w:rPr>
                 <w:sz w:val="19"/>
@@ -1440,6 +1623,9 @@
         </w:tc>
       </w:tr>
       <w:tr>
+        <w:trPr>
+          <w:cantSplit/>
+        </w:trPr>
         <w:tc>
           <w:tcPr>
             <w:tcW w:type="dxa" w:w="2120"/>
@@ -1458,6 +1644,9 @@
             <w:vAlign w:val="center"/>
           </w:tcPr>
           <w:p>
+            <w:pPr>
+              <w:keepNext/>
+            </w:pPr>
             <w:r>
               <w:rPr>
                 <w:sz w:val="19"/>
@@ -1485,6 +1674,9 @@
             <w:vAlign w:val="center"/>
           </w:tcPr>
           <w:p>
+            <w:pPr>
+              <w:keepNext/>
+            </w:pPr>
             <w:r>
               <w:rPr>
                 <w:sz w:val="19"/>
@@ -1512,6 +1704,9 @@
             <w:vAlign w:val="center"/>
           </w:tcPr>
           <w:p>
+            <w:pPr>
+              <w:keepNext/>
+            </w:pPr>
             <w:r>
               <w:rPr>
                 <w:sz w:val="19"/>
@@ -1523,6 +1718,9 @@
         </w:tc>
       </w:tr>
       <w:tr>
+        <w:trPr>
+          <w:cantSplit/>
+        </w:trPr>
         <w:tc>
           <w:tcPr>
             <w:tcW w:type="dxa" w:w="2120"/>
@@ -1541,6 +1739,9 @@
             <w:vAlign w:val="center"/>
           </w:tcPr>
           <w:p>
+            <w:pPr>
+              <w:keepNext/>
+            </w:pPr>
             <w:r>
               <w:rPr>
                 <w:sz w:val="19"/>
@@ -1568,6 +1769,9 @@
             <w:vAlign w:val="center"/>
           </w:tcPr>
           <w:p>
+            <w:pPr>
+              <w:keepNext/>
+            </w:pPr>
             <w:r>
               <w:rPr>
                 <w:sz w:val="19"/>
@@ -1595,6 +1799,9 @@
             <w:vAlign w:val="center"/>
           </w:tcPr>
           <w:p>
+            <w:pPr>
+              <w:keepNext/>
+            </w:pPr>
             <w:r>
               <w:rPr>
                 <w:sz w:val="19"/>
@@ -1606,6 +1813,9 @@
         </w:tc>
       </w:tr>
       <w:tr>
+        <w:trPr>
+          <w:cantSplit/>
+        </w:trPr>
         <w:tc>
           <w:tcPr>
             <w:tcW w:type="dxa" w:w="2120"/>
@@ -1624,6 +1834,9 @@
             <w:vAlign w:val="center"/>
           </w:tcPr>
           <w:p>
+            <w:pPr>
+              <w:keepNext w:val="false"/>
+            </w:pPr>
             <w:r>
               <w:rPr>
                 <w:sz w:val="19"/>
@@ -1651,6 +1864,9 @@
             <w:vAlign w:val="center"/>
           </w:tcPr>
           <w:p>
+            <w:pPr>
+              <w:keepNext w:val="false"/>
+            </w:pPr>
             <w:r>
               <w:rPr>
                 <w:sz w:val="19"/>
@@ -1678,6 +1894,9 @@
             <w:vAlign w:val="center"/>
           </w:tcPr>
           <w:p>
+            <w:pPr>
+              <w:keepNext w:val="false"/>
+            </w:pPr>
             <w:r>
               <w:rPr>
                 <w:sz w:val="19"/>
@@ -1721,6 +1940,7 @@
       </w:tblGrid>
       <w:tr>
         <w:trPr>
+          <w:cantSplit/>
           <w:tblHeader/>
         </w:trPr>
         <w:tc>
@@ -1742,6 +1962,9 @@
             <w:vAlign w:val="center"/>
           </w:tcPr>
           <w:p>
+            <w:pPr>
+              <w:keepNext/>
+            </w:pPr>
             <w:r>
               <w:rPr>
                 <w:b/>
@@ -1773,6 +1996,9 @@
             <w:vAlign w:val="center"/>
           </w:tcPr>
           <w:p>
+            <w:pPr>
+              <w:keepNext/>
+            </w:pPr>
             <w:r>
               <w:rPr>
                 <w:b/>
@@ -1804,6 +2030,9 @@
             <w:vAlign w:val="center"/>
           </w:tcPr>
           <w:p>
+            <w:pPr>
+              <w:keepNext/>
+            </w:pPr>
             <w:r>
               <w:rPr>
                 <w:b/>
@@ -1818,6 +2047,9 @@
         </w:tc>
       </w:tr>
       <w:tr>
+        <w:trPr>
+          <w:cantSplit/>
+        </w:trPr>
         <w:tc>
           <w:tcPr>
             <w:tcW w:type="dxa" w:w="2699"/>
@@ -1836,6 +2068,9 @@
             <w:vAlign w:val="center"/>
           </w:tcPr>
           <w:p>
+            <w:pPr>
+              <w:keepNext/>
+            </w:pPr>
             <w:r>
               <w:rPr>
                 <w:sz w:val="19"/>
@@ -1863,6 +2098,9 @@
             <w:vAlign w:val="center"/>
           </w:tcPr>
           <w:p>
+            <w:pPr>
+              <w:keepNext/>
+            </w:pPr>
             <w:r>
               <w:rPr>
                 <w:sz w:val="19"/>
@@ -1890,6 +2128,9 @@
             <w:vAlign w:val="center"/>
           </w:tcPr>
           <w:p>
+            <w:pPr>
+              <w:keepNext/>
+            </w:pPr>
             <w:r>
               <w:rPr>
                 <w:sz w:val="19"/>
@@ -1901,6 +2142,9 @@
         </w:tc>
       </w:tr>
       <w:tr>
+        <w:trPr>
+          <w:cantSplit/>
+        </w:trPr>
         <w:tc>
           <w:tcPr>
             <w:tcW w:type="dxa" w:w="2699"/>
@@ -1919,6 +2163,9 @@
             <w:vAlign w:val="center"/>
           </w:tcPr>
           <w:p>
+            <w:pPr>
+              <w:keepNext/>
+            </w:pPr>
             <w:r>
               <w:rPr>
                 <w:sz w:val="19"/>
@@ -1946,6 +2193,9 @@
             <w:vAlign w:val="center"/>
           </w:tcPr>
           <w:p>
+            <w:pPr>
+              <w:keepNext/>
+            </w:pPr>
             <w:r>
               <w:rPr>
                 <w:sz w:val="19"/>
@@ -1973,6 +2223,9 @@
             <w:vAlign w:val="center"/>
           </w:tcPr>
           <w:p>
+            <w:pPr>
+              <w:keepNext/>
+            </w:pPr>
             <w:r>
               <w:rPr>
                 <w:sz w:val="19"/>
@@ -1984,6 +2237,9 @@
         </w:tc>
       </w:tr>
       <w:tr>
+        <w:trPr>
+          <w:cantSplit/>
+        </w:trPr>
         <w:tc>
           <w:tcPr>
             <w:tcW w:type="dxa" w:w="2699"/>
@@ -2002,6 +2258,9 @@
             <w:vAlign w:val="center"/>
           </w:tcPr>
           <w:p>
+            <w:pPr>
+              <w:keepNext/>
+            </w:pPr>
             <w:r>
               <w:rPr>
                 <w:sz w:val="19"/>
@@ -2029,6 +2288,9 @@
             <w:vAlign w:val="center"/>
           </w:tcPr>
           <w:p>
+            <w:pPr>
+              <w:keepNext/>
+            </w:pPr>
             <w:r>
               <w:rPr>
                 <w:sz w:val="19"/>
@@ -2056,6 +2318,9 @@
             <w:vAlign w:val="center"/>
           </w:tcPr>
           <w:p>
+            <w:pPr>
+              <w:keepNext/>
+            </w:pPr>
             <w:r>
               <w:rPr>
                 <w:sz w:val="19"/>
@@ -2067,6 +2332,9 @@
         </w:tc>
       </w:tr>
       <w:tr>
+        <w:trPr>
+          <w:cantSplit/>
+        </w:trPr>
         <w:tc>
           <w:tcPr>
             <w:tcW w:type="dxa" w:w="2699"/>
@@ -2085,6 +2353,9 @@
             <w:vAlign w:val="center"/>
           </w:tcPr>
           <w:p>
+            <w:pPr>
+              <w:keepNext/>
+            </w:pPr>
             <w:r>
               <w:rPr>
                 <w:sz w:val="19"/>
@@ -2112,6 +2383,9 @@
             <w:vAlign w:val="center"/>
           </w:tcPr>
           <w:p>
+            <w:pPr>
+              <w:keepNext/>
+            </w:pPr>
             <w:r>
               <w:rPr>
                 <w:sz w:val="19"/>
@@ -2139,6 +2413,9 @@
             <w:vAlign w:val="center"/>
           </w:tcPr>
           <w:p>
+            <w:pPr>
+              <w:keepNext/>
+            </w:pPr>
             <w:r>
               <w:rPr>
                 <w:sz w:val="19"/>
@@ -2150,6 +2427,9 @@
         </w:tc>
       </w:tr>
       <w:tr>
+        <w:trPr>
+          <w:cantSplit/>
+        </w:trPr>
         <w:tc>
           <w:tcPr>
             <w:tcW w:type="dxa" w:w="2699"/>
@@ -2168,6 +2448,9 @@
             <w:vAlign w:val="center"/>
           </w:tcPr>
           <w:p>
+            <w:pPr>
+              <w:keepNext/>
+            </w:pPr>
             <w:r>
               <w:rPr>
                 <w:sz w:val="19"/>
@@ -2195,6 +2478,9 @@
             <w:vAlign w:val="center"/>
           </w:tcPr>
           <w:p>
+            <w:pPr>
+              <w:keepNext/>
+            </w:pPr>
             <w:r>
               <w:rPr>
                 <w:sz w:val="19"/>
@@ -2222,6 +2508,9 @@
             <w:vAlign w:val="center"/>
           </w:tcPr>
           <w:p>
+            <w:pPr>
+              <w:keepNext/>
+            </w:pPr>
             <w:r>
               <w:rPr>
                 <w:sz w:val="19"/>
@@ -2233,6 +2522,9 @@
         </w:tc>
       </w:tr>
       <w:tr>
+        <w:trPr>
+          <w:cantSplit/>
+        </w:trPr>
         <w:tc>
           <w:tcPr>
             <w:tcW w:type="dxa" w:w="2699"/>
@@ -2251,6 +2543,9 @@
             <w:vAlign w:val="center"/>
           </w:tcPr>
           <w:p>
+            <w:pPr>
+              <w:keepNext/>
+            </w:pPr>
             <w:r>
               <w:rPr>
                 <w:sz w:val="19"/>
@@ -2278,6 +2573,9 @@
             <w:vAlign w:val="center"/>
           </w:tcPr>
           <w:p>
+            <w:pPr>
+              <w:keepNext/>
+            </w:pPr>
             <w:r>
               <w:rPr>
                 <w:sz w:val="19"/>
@@ -2305,6 +2603,9 @@
             <w:vAlign w:val="center"/>
           </w:tcPr>
           <w:p>
+            <w:pPr>
+              <w:keepNext/>
+            </w:pPr>
             <w:r>
               <w:rPr>
                 <w:sz w:val="19"/>
@@ -2316,6 +2617,9 @@
         </w:tc>
       </w:tr>
       <w:tr>
+        <w:trPr>
+          <w:cantSplit/>
+        </w:trPr>
         <w:tc>
           <w:tcPr>
             <w:tcW w:type="dxa" w:w="2699"/>
@@ -2334,6 +2638,9 @@
             <w:vAlign w:val="center"/>
           </w:tcPr>
           <w:p>
+            <w:pPr>
+              <w:keepNext/>
+            </w:pPr>
             <w:r>
               <w:rPr>
                 <w:sz w:val="19"/>
@@ -2361,6 +2668,9 @@
             <w:vAlign w:val="center"/>
           </w:tcPr>
           <w:p>
+            <w:pPr>
+              <w:keepNext/>
+            </w:pPr>
             <w:r>
               <w:rPr>
                 <w:sz w:val="19"/>
@@ -2388,6 +2698,9 @@
             <w:vAlign w:val="center"/>
           </w:tcPr>
           <w:p>
+            <w:pPr>
+              <w:keepNext/>
+            </w:pPr>
             <w:r>
               <w:rPr>
                 <w:sz w:val="19"/>
@@ -2399,6 +2712,9 @@
         </w:tc>
       </w:tr>
       <w:tr>
+        <w:trPr>
+          <w:cantSplit/>
+        </w:trPr>
         <w:tc>
           <w:tcPr>
             <w:tcW w:type="dxa" w:w="2699"/>
@@ -2417,6 +2733,9 @@
             <w:vAlign w:val="center"/>
           </w:tcPr>
           <w:p>
+            <w:pPr>
+              <w:keepNext/>
+            </w:pPr>
             <w:r>
               <w:rPr>
                 <w:sz w:val="19"/>
@@ -2444,6 +2763,9 @@
             <w:vAlign w:val="center"/>
           </w:tcPr>
           <w:p>
+            <w:pPr>
+              <w:keepNext/>
+            </w:pPr>
             <w:r>
               <w:rPr>
                 <w:sz w:val="19"/>
@@ -2471,6 +2793,9 @@
             <w:vAlign w:val="center"/>
           </w:tcPr>
           <w:p>
+            <w:pPr>
+              <w:keepNext/>
+            </w:pPr>
             <w:r>
               <w:rPr>
                 <w:sz w:val="19"/>
@@ -2482,6 +2807,9 @@
         </w:tc>
       </w:tr>
       <w:tr>
+        <w:trPr>
+          <w:cantSplit/>
+        </w:trPr>
         <w:tc>
           <w:tcPr>
             <w:tcW w:type="dxa" w:w="2699"/>
@@ -2500,6 +2828,9 @@
             <w:vAlign w:val="center"/>
           </w:tcPr>
           <w:p>
+            <w:pPr>
+              <w:keepNext/>
+            </w:pPr>
             <w:r>
               <w:rPr>
                 <w:sz w:val="19"/>
@@ -2527,6 +2858,9 @@
             <w:vAlign w:val="center"/>
           </w:tcPr>
           <w:p>
+            <w:pPr>
+              <w:keepNext/>
+            </w:pPr>
             <w:r>
               <w:rPr>
                 <w:sz w:val="19"/>
@@ -2554,6 +2888,9 @@
             <w:vAlign w:val="center"/>
           </w:tcPr>
           <w:p>
+            <w:pPr>
+              <w:keepNext/>
+            </w:pPr>
             <w:r>
               <w:rPr>
                 <w:sz w:val="19"/>
@@ -2565,6 +2902,9 @@
         </w:tc>
       </w:tr>
       <w:tr>
+        <w:trPr>
+          <w:cantSplit/>
+        </w:trPr>
         <w:tc>
           <w:tcPr>
             <w:tcW w:type="dxa" w:w="2699"/>
@@ -2583,6 +2923,9 @@
             <w:vAlign w:val="center"/>
           </w:tcPr>
           <w:p>
+            <w:pPr>
+              <w:keepNext w:val="false"/>
+            </w:pPr>
             <w:r>
               <w:rPr>
                 <w:sz w:val="19"/>
@@ -2610,6 +2953,9 @@
             <w:vAlign w:val="center"/>
           </w:tcPr>
           <w:p>
+            <w:pPr>
+              <w:keepNext w:val="false"/>
+            </w:pPr>
             <w:r>
               <w:rPr>
                 <w:sz w:val="19"/>
@@ -2637,6 +2983,9 @@
             <w:vAlign w:val="center"/>
           </w:tcPr>
           <w:p>
+            <w:pPr>
+              <w:keepNext w:val="false"/>
+            </w:pPr>
             <w:r>
               <w:rPr>
                 <w:sz w:val="19"/>
@@ -2659,6 +3008,7 @@
     </w:p>
     <w:p>
       <w:pPr>
+        <w:keepNext w:val="false"/>
         <w:spacing w:after="120"/>
       </w:pPr>
       <w:r>
@@ -2685,6 +3035,7 @@
       </w:tblGrid>
       <w:tr>
         <w:trPr>
+          <w:cantSplit/>
           <w:tblHeader/>
         </w:trPr>
         <w:tc>
@@ -2706,6 +3057,9 @@
             <w:vAlign w:val="center"/>
           </w:tcPr>
           <w:p>
+            <w:pPr>
+              <w:keepNext/>
+            </w:pPr>
             <w:r>
               <w:rPr>
                 <w:b/>
@@ -2737,6 +3091,9 @@
             <w:vAlign w:val="center"/>
           </w:tcPr>
           <w:p>
+            <w:pPr>
+              <w:keepNext/>
+            </w:pPr>
             <w:r>
               <w:rPr>
                 <w:b/>
@@ -2768,6 +3125,9 @@
             <w:vAlign w:val="center"/>
           </w:tcPr>
           <w:p>
+            <w:pPr>
+              <w:keepNext/>
+            </w:pPr>
             <w:r>
               <w:rPr>
                 <w:b/>
@@ -2799,6 +3159,9 @@
             <w:vAlign w:val="center"/>
           </w:tcPr>
           <w:p>
+            <w:pPr>
+              <w:keepNext/>
+            </w:pPr>
             <w:r>
               <w:rPr>
                 <w:b/>
@@ -2813,6 +3176,9 @@
         </w:tc>
       </w:tr>
       <w:tr>
+        <w:trPr>
+          <w:cantSplit/>
+        </w:trPr>
         <w:tc>
           <w:tcPr>
             <w:tcW w:type="dxa" w:w="1542"/>
@@ -2831,6 +3197,9 @@
             <w:vAlign w:val="center"/>
           </w:tcPr>
           <w:p>
+            <w:pPr>
+              <w:keepNext/>
+            </w:pPr>
             <w:r>
               <w:rPr>
                 <w:sz w:val="19"/>
@@ -2858,6 +3227,9 @@
             <w:vAlign w:val="center"/>
           </w:tcPr>
           <w:p>
+            <w:pPr>
+              <w:keepNext/>
+            </w:pPr>
             <w:r>
               <w:rPr>
                 <w:sz w:val="19"/>
@@ -2885,6 +3257,9 @@
             <w:vAlign w:val="center"/>
           </w:tcPr>
           <w:p>
+            <w:pPr>
+              <w:keepNext/>
+            </w:pPr>
             <w:r>
               <w:rPr>
                 <w:sz w:val="19"/>
@@ -2912,6 +3287,9 @@
             <w:vAlign w:val="center"/>
           </w:tcPr>
           <w:p>
+            <w:pPr>
+              <w:keepNext/>
+            </w:pPr>
             <w:r>
               <w:rPr>
                 <w:sz w:val="19"/>
@@ -2923,6 +3301,9 @@
         </w:tc>
       </w:tr>
       <w:tr>
+        <w:trPr>
+          <w:cantSplit/>
+        </w:trPr>
         <w:tc>
           <w:tcPr>
             <w:tcW w:type="dxa" w:w="1542"/>
@@ -2941,6 +3322,9 @@
             <w:vAlign w:val="center"/>
           </w:tcPr>
           <w:p>
+            <w:pPr>
+              <w:keepNext/>
+            </w:pPr>
             <w:r>
               <w:rPr>
                 <w:sz w:val="19"/>
@@ -2968,6 +3352,9 @@
             <w:vAlign w:val="center"/>
           </w:tcPr>
           <w:p>
+            <w:pPr>
+              <w:keepNext/>
+            </w:pPr>
             <w:r>
               <w:rPr>
                 <w:sz w:val="19"/>
@@ -2995,6 +3382,9 @@
             <w:vAlign w:val="center"/>
           </w:tcPr>
           <w:p>
+            <w:pPr>
+              <w:keepNext/>
+            </w:pPr>
             <w:r>
               <w:rPr>
                 <w:sz w:val="19"/>
@@ -3022,6 +3412,9 @@
             <w:vAlign w:val="center"/>
           </w:tcPr>
           <w:p>
+            <w:pPr>
+              <w:keepNext/>
+            </w:pPr>
             <w:r>
               <w:rPr>
                 <w:sz w:val="19"/>
@@ -3033,6 +3426,9 @@
         </w:tc>
       </w:tr>
       <w:tr>
+        <w:trPr>
+          <w:cantSplit/>
+        </w:trPr>
         <w:tc>
           <w:tcPr>
             <w:tcW w:type="dxa" w:w="1542"/>
@@ -3051,6 +3447,9 @@
             <w:vAlign w:val="center"/>
           </w:tcPr>
           <w:p>
+            <w:pPr>
+              <w:keepNext/>
+            </w:pPr>
             <w:r>
               <w:rPr>
                 <w:sz w:val="19"/>
@@ -3078,6 +3477,9 @@
             <w:vAlign w:val="center"/>
           </w:tcPr>
           <w:p>
+            <w:pPr>
+              <w:keepNext/>
+            </w:pPr>
             <w:r>
               <w:rPr>
                 <w:sz w:val="19"/>
@@ -3105,6 +3507,9 @@
             <w:vAlign w:val="center"/>
           </w:tcPr>
           <w:p>
+            <w:pPr>
+              <w:keepNext/>
+            </w:pPr>
             <w:r>
               <w:rPr>
                 <w:sz w:val="19"/>
@@ -3132,6 +3537,9 @@
             <w:vAlign w:val="center"/>
           </w:tcPr>
           <w:p>
+            <w:pPr>
+              <w:keepNext/>
+            </w:pPr>
             <w:r>
               <w:rPr>
                 <w:sz w:val="19"/>
@@ -3143,6 +3551,9 @@
         </w:tc>
       </w:tr>
       <w:tr>
+        <w:trPr>
+          <w:cantSplit/>
+        </w:trPr>
         <w:tc>
           <w:tcPr>
             <w:tcW w:type="dxa" w:w="1542"/>
@@ -3161,6 +3572,9 @@
             <w:vAlign w:val="center"/>
           </w:tcPr>
           <w:p>
+            <w:pPr>
+              <w:keepNext/>
+            </w:pPr>
             <w:r>
               <w:rPr>
                 <w:sz w:val="19"/>
@@ -3188,6 +3602,9 @@
             <w:vAlign w:val="center"/>
           </w:tcPr>
           <w:p>
+            <w:pPr>
+              <w:keepNext/>
+            </w:pPr>
             <w:r>
               <w:rPr>
                 <w:sz w:val="19"/>
@@ -3215,6 +3632,9 @@
             <w:vAlign w:val="center"/>
           </w:tcPr>
           <w:p>
+            <w:pPr>
+              <w:keepNext/>
+            </w:pPr>
             <w:r>
               <w:rPr>
                 <w:sz w:val="19"/>
@@ -3242,6 +3662,9 @@
             <w:vAlign w:val="center"/>
           </w:tcPr>
           <w:p>
+            <w:pPr>
+              <w:keepNext/>
+            </w:pPr>
             <w:r>
               <w:rPr>
                 <w:sz w:val="19"/>
@@ -3253,6 +3676,9 @@
         </w:tc>
       </w:tr>
       <w:tr>
+        <w:trPr>
+          <w:cantSplit/>
+        </w:trPr>
         <w:tc>
           <w:tcPr>
             <w:tcW w:type="dxa" w:w="1542"/>
@@ -3271,6 +3697,9 @@
             <w:vAlign w:val="center"/>
           </w:tcPr>
           <w:p>
+            <w:pPr>
+              <w:keepNext/>
+            </w:pPr>
             <w:r>
               <w:rPr>
                 <w:sz w:val="19"/>
@@ -3298,6 +3727,9 @@
             <w:vAlign w:val="center"/>
           </w:tcPr>
           <w:p>
+            <w:pPr>
+              <w:keepNext/>
+            </w:pPr>
             <w:r>
               <w:rPr>
                 <w:sz w:val="19"/>
@@ -3325,6 +3757,9 @@
             <w:vAlign w:val="center"/>
           </w:tcPr>
           <w:p>
+            <w:pPr>
+              <w:keepNext/>
+            </w:pPr>
             <w:r>
               <w:rPr>
                 <w:sz w:val="19"/>
@@ -3352,6 +3787,9 @@
             <w:vAlign w:val="center"/>
           </w:tcPr>
           <w:p>
+            <w:pPr>
+              <w:keepNext/>
+            </w:pPr>
             <w:r>
               <w:rPr>
                 <w:sz w:val="19"/>
@@ -3363,6 +3801,9 @@
         </w:tc>
       </w:tr>
       <w:tr>
+        <w:trPr>
+          <w:cantSplit/>
+        </w:trPr>
         <w:tc>
           <w:tcPr>
             <w:tcW w:type="dxa" w:w="1542"/>
@@ -3381,6 +3822,9 @@
             <w:vAlign w:val="center"/>
           </w:tcPr>
           <w:p>
+            <w:pPr>
+              <w:keepNext/>
+            </w:pPr>
             <w:r>
               <w:rPr>
                 <w:sz w:val="19"/>
@@ -3408,6 +3852,9 @@
             <w:vAlign w:val="center"/>
           </w:tcPr>
           <w:p>
+            <w:pPr>
+              <w:keepNext/>
+            </w:pPr>
             <w:r>
               <w:rPr>
                 <w:sz w:val="19"/>
@@ -3435,6 +3882,9 @@
             <w:vAlign w:val="center"/>
           </w:tcPr>
           <w:p>
+            <w:pPr>
+              <w:keepNext/>
+            </w:pPr>
             <w:r>
               <w:rPr>
                 <w:sz w:val="19"/>
@@ -3462,6 +3912,9 @@
             <w:vAlign w:val="center"/>
           </w:tcPr>
           <w:p>
+            <w:pPr>
+              <w:keepNext/>
+            </w:pPr>
             <w:r>
               <w:rPr>
                 <w:sz w:val="19"/>
@@ -3473,6 +3926,9 @@
         </w:tc>
       </w:tr>
       <w:tr>
+        <w:trPr>
+          <w:cantSplit/>
+        </w:trPr>
         <w:tc>
           <w:tcPr>
             <w:tcW w:type="dxa" w:w="1542"/>
@@ -3491,6 +3947,9 @@
             <w:vAlign w:val="center"/>
           </w:tcPr>
           <w:p>
+            <w:pPr>
+              <w:keepNext w:val="false"/>
+            </w:pPr>
             <w:r>
               <w:rPr>
                 <w:sz w:val="19"/>
@@ -3518,6 +3977,9 @@
             <w:vAlign w:val="center"/>
           </w:tcPr>
           <w:p>
+            <w:pPr>
+              <w:keepNext w:val="false"/>
+            </w:pPr>
             <w:r>
               <w:rPr>
                 <w:sz w:val="19"/>
@@ -3545,6 +4007,9 @@
             <w:vAlign w:val="center"/>
           </w:tcPr>
           <w:p>
+            <w:pPr>
+              <w:keepNext w:val="false"/>
+            </w:pPr>
             <w:r>
               <w:rPr>
                 <w:sz w:val="19"/>
@@ -3572,6 +4037,9 @@
             <w:vAlign w:val="center"/>
           </w:tcPr>
           <w:p>
+            <w:pPr>
+              <w:keepNext w:val="false"/>
+            </w:pPr>
             <w:r>
               <w:rPr>
                 <w:sz w:val="19"/>
@@ -3598,6 +4066,7 @@
     </w:p>
     <w:p>
       <w:pPr>
+        <w:keepNext/>
         <w:spacing w:after="120"/>
       </w:pPr>
       <w:r>
@@ -3627,6 +4096,7 @@
       </w:tblGrid>
       <w:tr>
         <w:trPr>
+          <w:cantSplit/>
           <w:tblHeader/>
         </w:trPr>
         <w:tc>
@@ -3648,6 +4118,9 @@
             <w:vAlign w:val="center"/>
           </w:tcPr>
           <w:p>
+            <w:pPr>
+              <w:keepNext/>
+            </w:pPr>
             <w:r>
               <w:rPr>
                 <w:b/>
@@ -3679,6 +4152,9 @@
             <w:vAlign w:val="center"/>
           </w:tcPr>
           <w:p>
+            <w:pPr>
+              <w:keepNext/>
+            </w:pPr>
             <w:r>
               <w:rPr>
                 <w:b/>
@@ -3693,6 +4169,9 @@
         </w:tc>
       </w:tr>
       <w:tr>
+        <w:trPr>
+          <w:cantSplit/>
+        </w:trPr>
         <w:tc>
           <w:tcPr>
             <w:tcW w:type="dxa" w:w="2506"/>
@@ -3711,6 +4190,9 @@
             <w:vAlign w:val="center"/>
           </w:tcPr>
           <w:p>
+            <w:pPr>
+              <w:keepNext/>
+            </w:pPr>
             <w:r>
               <w:rPr>
                 <w:sz w:val="19"/>
@@ -3738,6 +4220,9 @@
             <w:vAlign w:val="center"/>
           </w:tcPr>
           <w:p>
+            <w:pPr>
+              <w:keepNext/>
+            </w:pPr>
             <w:r>
               <w:rPr>
                 <w:sz w:val="19"/>
@@ -3749,6 +4234,9 @@
         </w:tc>
       </w:tr>
       <w:tr>
+        <w:trPr>
+          <w:cantSplit/>
+        </w:trPr>
         <w:tc>
           <w:tcPr>
             <w:tcW w:type="dxa" w:w="2506"/>
@@ -3767,6 +4255,9 @@
             <w:vAlign w:val="center"/>
           </w:tcPr>
           <w:p>
+            <w:pPr>
+              <w:keepNext/>
+            </w:pPr>
             <w:r>
               <w:rPr>
                 <w:sz w:val="19"/>
@@ -3794,6 +4285,9 @@
             <w:vAlign w:val="center"/>
           </w:tcPr>
           <w:p>
+            <w:pPr>
+              <w:keepNext/>
+            </w:pPr>
             <w:r>
               <w:rPr>
                 <w:sz w:val="19"/>
@@ -3805,6 +4299,9 @@
         </w:tc>
       </w:tr>
       <w:tr>
+        <w:trPr>
+          <w:cantSplit/>
+        </w:trPr>
         <w:tc>
           <w:tcPr>
             <w:tcW w:type="dxa" w:w="2506"/>
@@ -3823,6 +4320,9 @@
             <w:vAlign w:val="center"/>
           </w:tcPr>
           <w:p>
+            <w:pPr>
+              <w:keepNext/>
+            </w:pPr>
             <w:r>
               <w:rPr>
                 <w:sz w:val="19"/>
@@ -3850,6 +4350,9 @@
             <w:vAlign w:val="center"/>
           </w:tcPr>
           <w:p>
+            <w:pPr>
+              <w:keepNext/>
+            </w:pPr>
             <w:r>
               <w:rPr>
                 <w:sz w:val="19"/>
@@ -3861,6 +4364,9 @@
         </w:tc>
       </w:tr>
       <w:tr>
+        <w:trPr>
+          <w:cantSplit/>
+        </w:trPr>
         <w:tc>
           <w:tcPr>
             <w:tcW w:type="dxa" w:w="2506"/>
@@ -3879,6 +4385,9 @@
             <w:vAlign w:val="center"/>
           </w:tcPr>
           <w:p>
+            <w:pPr>
+              <w:keepNext/>
+            </w:pPr>
             <w:r>
               <w:rPr>
                 <w:sz w:val="19"/>
@@ -3906,6 +4415,9 @@
             <w:vAlign w:val="center"/>
           </w:tcPr>
           <w:p>
+            <w:pPr>
+              <w:keepNext/>
+            </w:pPr>
             <w:r>
               <w:rPr>
                 <w:sz w:val="19"/>
@@ -3917,6 +4429,9 @@
         </w:tc>
       </w:tr>
       <w:tr>
+        <w:trPr>
+          <w:cantSplit/>
+        </w:trPr>
         <w:tc>
           <w:tcPr>
             <w:tcW w:type="dxa" w:w="2506"/>
@@ -3935,6 +4450,9 @@
             <w:vAlign w:val="center"/>
           </w:tcPr>
           <w:p>
+            <w:pPr>
+              <w:keepNext/>
+            </w:pPr>
             <w:r>
               <w:rPr>
                 <w:sz w:val="19"/>
@@ -3962,6 +4480,9 @@
             <w:vAlign w:val="center"/>
           </w:tcPr>
           <w:p>
+            <w:pPr>
+              <w:keepNext/>
+            </w:pPr>
             <w:r>
               <w:rPr>
                 <w:sz w:val="19"/>
@@ -3973,6 +4494,9 @@
         </w:tc>
       </w:tr>
       <w:tr>
+        <w:trPr>
+          <w:cantSplit/>
+        </w:trPr>
         <w:tc>
           <w:tcPr>
             <w:tcW w:type="dxa" w:w="2506"/>
@@ -3991,6 +4515,9 @@
             <w:vAlign w:val="center"/>
           </w:tcPr>
           <w:p>
+            <w:pPr>
+              <w:keepNext/>
+            </w:pPr>
             <w:r>
               <w:rPr>
                 <w:sz w:val="19"/>
@@ -4018,6 +4545,9 @@
             <w:vAlign w:val="center"/>
           </w:tcPr>
           <w:p>
+            <w:pPr>
+              <w:keepNext/>
+            </w:pPr>
             <w:r>
               <w:rPr>
                 <w:sz w:val="19"/>
@@ -4029,6 +4559,9 @@
         </w:tc>
       </w:tr>
       <w:tr>
+        <w:trPr>
+          <w:cantSplit/>
+        </w:trPr>
         <w:tc>
           <w:tcPr>
             <w:tcW w:type="dxa" w:w="2506"/>
@@ -4047,6 +4580,9 @@
             <w:vAlign w:val="center"/>
           </w:tcPr>
           <w:p>
+            <w:pPr>
+              <w:keepNext/>
+            </w:pPr>
             <w:r>
               <w:rPr>
                 <w:sz w:val="19"/>
@@ -4074,6 +4610,9 @@
             <w:vAlign w:val="center"/>
           </w:tcPr>
           <w:p>
+            <w:pPr>
+              <w:keepNext/>
+            </w:pPr>
             <w:r>
               <w:rPr>
                 <w:sz w:val="19"/>
@@ -4101,6 +4640,9 @@
         </w:tc>
       </w:tr>
       <w:tr>
+        <w:trPr>
+          <w:cantSplit/>
+        </w:trPr>
         <w:tc>
           <w:tcPr>
             <w:tcW w:type="dxa" w:w="2506"/>
@@ -4119,6 +4661,9 @@
             <w:vAlign w:val="center"/>
           </w:tcPr>
           <w:p>
+            <w:pPr>
+              <w:keepNext/>
+            </w:pPr>
             <w:r>
               <w:rPr>
                 <w:sz w:val="19"/>
@@ -4146,6 +4691,9 @@
             <w:vAlign w:val="center"/>
           </w:tcPr>
           <w:p>
+            <w:pPr>
+              <w:keepNext/>
+            </w:pPr>
             <w:r>
               <w:rPr>
                 <w:sz w:val="19"/>
@@ -4157,6 +4705,9 @@
         </w:tc>
       </w:tr>
       <w:tr>
+        <w:trPr>
+          <w:cantSplit/>
+        </w:trPr>
         <w:tc>
           <w:tcPr>
             <w:tcW w:type="dxa" w:w="2506"/>
@@ -4175,6 +4726,9 @@
             <w:vAlign w:val="center"/>
           </w:tcPr>
           <w:p>
+            <w:pPr>
+              <w:keepNext w:val="false"/>
+            </w:pPr>
             <w:r>
               <w:rPr>
                 <w:sz w:val="19"/>
@@ -4202,6 +4756,9 @@
             <w:vAlign w:val="center"/>
           </w:tcPr>
           <w:p>
+            <w:pPr>
+              <w:keepNext w:val="false"/>
+            </w:pPr>
             <w:r>
               <w:rPr>
                 <w:sz w:val="19"/>
@@ -4228,6 +4785,7 @@
     </w:p>
     <w:p>
       <w:pPr>
+        <w:keepNext/>
         <w:spacing w:after="120"/>
       </w:pPr>
       <w:r>
@@ -4257,6 +4815,7 @@
       </w:tblGrid>
       <w:tr>
         <w:trPr>
+          <w:cantSplit/>
           <w:tblHeader/>
         </w:trPr>
         <w:tc>
@@ -4278,6 +4837,9 @@
             <w:vAlign w:val="center"/>
           </w:tcPr>
           <w:p>
+            <w:pPr>
+              <w:keepNext/>
+            </w:pPr>
             <w:r>
               <w:rPr>
                 <w:b/>
@@ -4309,6 +4871,9 @@
             <w:vAlign w:val="center"/>
           </w:tcPr>
           <w:p>
+            <w:pPr>
+              <w:keepNext/>
+            </w:pPr>
             <w:r>
               <w:rPr>
                 <w:b/>
@@ -4323,6 +4888,9 @@
         </w:tc>
       </w:tr>
       <w:tr>
+        <w:trPr>
+          <w:cantSplit/>
+        </w:trPr>
         <w:tc>
           <w:tcPr>
             <w:tcW w:type="dxa" w:w="2506"/>
@@ -4341,6 +4909,9 @@
             <w:vAlign w:val="center"/>
           </w:tcPr>
           <w:p>
+            <w:pPr>
+              <w:keepNext/>
+            </w:pPr>
             <w:r>
               <w:rPr>
                 <w:sz w:val="19"/>
@@ -4368,6 +4939,9 @@
             <w:vAlign w:val="center"/>
           </w:tcPr>
           <w:p>
+            <w:pPr>
+              <w:keepNext/>
+            </w:pPr>
             <w:r>
               <w:rPr>
                 <w:sz w:val="19"/>
@@ -4379,6 +4953,9 @@
         </w:tc>
       </w:tr>
       <w:tr>
+        <w:trPr>
+          <w:cantSplit/>
+        </w:trPr>
         <w:tc>
           <w:tcPr>
             <w:tcW w:type="dxa" w:w="2506"/>
@@ -4397,6 +4974,9 @@
             <w:vAlign w:val="center"/>
           </w:tcPr>
           <w:p>
+            <w:pPr>
+              <w:keepNext/>
+            </w:pPr>
             <w:r>
               <w:rPr>
                 <w:sz w:val="19"/>
@@ -4424,6 +5004,9 @@
             <w:vAlign w:val="center"/>
           </w:tcPr>
           <w:p>
+            <w:pPr>
+              <w:keepNext/>
+            </w:pPr>
             <w:r>
               <w:rPr>
                 <w:sz w:val="19"/>
@@ -4435,6 +5018,9 @@
         </w:tc>
       </w:tr>
       <w:tr>
+        <w:trPr>
+          <w:cantSplit/>
+        </w:trPr>
         <w:tc>
           <w:tcPr>
             <w:tcW w:type="dxa" w:w="2506"/>
@@ -4453,6 +5039,9 @@
             <w:vAlign w:val="center"/>
           </w:tcPr>
           <w:p>
+            <w:pPr>
+              <w:keepNext/>
+            </w:pPr>
             <w:r>
               <w:rPr>
                 <w:sz w:val="19"/>
@@ -4480,6 +5069,9 @@
             <w:vAlign w:val="center"/>
           </w:tcPr>
           <w:p>
+            <w:pPr>
+              <w:keepNext/>
+            </w:pPr>
             <w:r>
               <w:rPr>
                 <w:sz w:val="19"/>
@@ -4491,6 +5083,9 @@
         </w:tc>
       </w:tr>
       <w:tr>
+        <w:trPr>
+          <w:cantSplit/>
+        </w:trPr>
         <w:tc>
           <w:tcPr>
             <w:tcW w:type="dxa" w:w="2506"/>
@@ -4509,6 +5104,9 @@
             <w:vAlign w:val="center"/>
           </w:tcPr>
           <w:p>
+            <w:pPr>
+              <w:keepNext/>
+            </w:pPr>
             <w:r>
               <w:rPr>
                 <w:sz w:val="19"/>
@@ -4536,6 +5134,9 @@
             <w:vAlign w:val="center"/>
           </w:tcPr>
           <w:p>
+            <w:pPr>
+              <w:keepNext/>
+            </w:pPr>
             <w:r>
               <w:rPr>
                 <w:sz w:val="19"/>
@@ -4547,6 +5148,9 @@
         </w:tc>
       </w:tr>
       <w:tr>
+        <w:trPr>
+          <w:cantSplit/>
+        </w:trPr>
         <w:tc>
           <w:tcPr>
             <w:tcW w:type="dxa" w:w="2506"/>
@@ -4565,6 +5169,9 @@
             <w:vAlign w:val="center"/>
           </w:tcPr>
           <w:p>
+            <w:pPr>
+              <w:keepNext/>
+            </w:pPr>
             <w:r>
               <w:rPr>
                 <w:sz w:val="19"/>
@@ -4592,6 +5199,9 @@
             <w:vAlign w:val="center"/>
           </w:tcPr>
           <w:p>
+            <w:pPr>
+              <w:keepNext/>
+            </w:pPr>
             <w:r>
               <w:rPr>
                 <w:sz w:val="19"/>
@@ -4603,6 +5213,9 @@
         </w:tc>
       </w:tr>
       <w:tr>
+        <w:trPr>
+          <w:cantSplit/>
+        </w:trPr>
         <w:tc>
           <w:tcPr>
             <w:tcW w:type="dxa" w:w="2506"/>
@@ -4621,6 +5234,9 @@
             <w:vAlign w:val="center"/>
           </w:tcPr>
           <w:p>
+            <w:pPr>
+              <w:keepNext/>
+            </w:pPr>
             <w:r>
               <w:rPr>
                 <w:sz w:val="19"/>
@@ -4648,6 +5264,9 @@
             <w:vAlign w:val="center"/>
           </w:tcPr>
           <w:p>
+            <w:pPr>
+              <w:keepNext/>
+            </w:pPr>
             <w:r>
               <w:rPr>
                 <w:sz w:val="19"/>
@@ -4675,6 +5294,9 @@
         </w:tc>
       </w:tr>
       <w:tr>
+        <w:trPr>
+          <w:cantSplit/>
+        </w:trPr>
         <w:tc>
           <w:tcPr>
             <w:tcW w:type="dxa" w:w="2506"/>
@@ -4693,6 +5315,9 @@
             <w:vAlign w:val="center"/>
           </w:tcPr>
           <w:p>
+            <w:pPr>
+              <w:keepNext/>
+            </w:pPr>
             <w:r>
               <w:rPr>
                 <w:sz w:val="19"/>
@@ -4720,6 +5345,9 @@
             <w:vAlign w:val="center"/>
           </w:tcPr>
           <w:p>
+            <w:pPr>
+              <w:keepNext/>
+            </w:pPr>
             <w:r>
               <w:rPr>
                 <w:sz w:val="19"/>
@@ -4731,6 +5359,9 @@
         </w:tc>
       </w:tr>
       <w:tr>
+        <w:trPr>
+          <w:cantSplit/>
+        </w:trPr>
         <w:tc>
           <w:tcPr>
             <w:tcW w:type="dxa" w:w="2506"/>
@@ -4749,6 +5380,9 @@
             <w:vAlign w:val="center"/>
           </w:tcPr>
           <w:p>
+            <w:pPr>
+              <w:keepNext w:val="false"/>
+            </w:pPr>
             <w:r>
               <w:rPr>
                 <w:sz w:val="19"/>
@@ -4776,6 +5410,9 @@
             <w:vAlign w:val="center"/>
           </w:tcPr>
           <w:p>
+            <w:pPr>
+              <w:keepNext w:val="false"/>
+            </w:pPr>
             <w:r>
               <w:rPr>
                 <w:sz w:val="19"/>
@@ -4802,6 +5439,7 @@
     </w:p>
     <w:p>
       <w:pPr>
+        <w:keepNext/>
         <w:spacing w:after="120"/>
       </w:pPr>
       <w:r>
@@ -4831,6 +5469,7 @@
       </w:tblGrid>
       <w:tr>
         <w:trPr>
+          <w:cantSplit/>
           <w:tblHeader/>
         </w:trPr>
         <w:tc>
@@ -4852,6 +5491,9 @@
             <w:vAlign w:val="center"/>
           </w:tcPr>
           <w:p>
+            <w:pPr>
+              <w:keepNext/>
+            </w:pPr>
             <w:r>
               <w:rPr>
                 <w:b/>
@@ -4883,6 +5525,9 @@
             <w:vAlign w:val="center"/>
           </w:tcPr>
           <w:p>
+            <w:pPr>
+              <w:keepNext/>
+            </w:pPr>
             <w:r>
               <w:rPr>
                 <w:b/>
@@ -4897,6 +5542,9 @@
         </w:tc>
       </w:tr>
       <w:tr>
+        <w:trPr>
+          <w:cantSplit/>
+        </w:trPr>
         <w:tc>
           <w:tcPr>
             <w:tcW w:type="dxa" w:w="2506"/>
@@ -4915,6 +5563,9 @@
             <w:vAlign w:val="center"/>
           </w:tcPr>
           <w:p>
+            <w:pPr>
+              <w:keepNext/>
+            </w:pPr>
             <w:r>
               <w:rPr>
                 <w:sz w:val="19"/>
@@ -4942,6 +5593,9 @@
             <w:vAlign w:val="center"/>
           </w:tcPr>
           <w:p>
+            <w:pPr>
+              <w:keepNext/>
+            </w:pPr>
             <w:r>
               <w:rPr>
                 <w:sz w:val="19"/>
@@ -4953,6 +5607,9 @@
         </w:tc>
       </w:tr>
       <w:tr>
+        <w:trPr>
+          <w:cantSplit/>
+        </w:trPr>
         <w:tc>
           <w:tcPr>
             <w:tcW w:type="dxa" w:w="2506"/>
@@ -4971,6 +5628,9 @@
             <w:vAlign w:val="center"/>
           </w:tcPr>
           <w:p>
+            <w:pPr>
+              <w:keepNext/>
+            </w:pPr>
             <w:r>
               <w:rPr>
                 <w:sz w:val="19"/>
@@ -4998,6 +5658,9 @@
             <w:vAlign w:val="center"/>
           </w:tcPr>
           <w:p>
+            <w:pPr>
+              <w:keepNext/>
+            </w:pPr>
             <w:r>
               <w:rPr>
                 <w:sz w:val="19"/>
@@ -5009,6 +5672,9 @@
         </w:tc>
       </w:tr>
       <w:tr>
+        <w:trPr>
+          <w:cantSplit/>
+        </w:trPr>
         <w:tc>
           <w:tcPr>
             <w:tcW w:type="dxa" w:w="2506"/>
@@ -5027,6 +5693,9 @@
             <w:vAlign w:val="center"/>
           </w:tcPr>
           <w:p>
+            <w:pPr>
+              <w:keepNext/>
+            </w:pPr>
             <w:r>
               <w:rPr>
                 <w:sz w:val="19"/>
@@ -5054,6 +5723,9 @@
             <w:vAlign w:val="center"/>
           </w:tcPr>
           <w:p>
+            <w:pPr>
+              <w:keepNext/>
+            </w:pPr>
             <w:r>
               <w:rPr>
                 <w:sz w:val="19"/>
@@ -5065,6 +5737,9 @@
         </w:tc>
       </w:tr>
       <w:tr>
+        <w:trPr>
+          <w:cantSplit/>
+        </w:trPr>
         <w:tc>
           <w:tcPr>
             <w:tcW w:type="dxa" w:w="2506"/>
@@ -5083,6 +5758,9 @@
             <w:vAlign w:val="center"/>
           </w:tcPr>
           <w:p>
+            <w:pPr>
+              <w:keepNext/>
+            </w:pPr>
             <w:r>
               <w:rPr>
                 <w:sz w:val="19"/>
@@ -5110,6 +5788,9 @@
             <w:vAlign w:val="center"/>
           </w:tcPr>
           <w:p>
+            <w:pPr>
+              <w:keepNext/>
+            </w:pPr>
             <w:r>
               <w:rPr>
                 <w:sz w:val="19"/>
@@ -5121,6 +5802,9 @@
         </w:tc>
       </w:tr>
       <w:tr>
+        <w:trPr>
+          <w:cantSplit/>
+        </w:trPr>
         <w:tc>
           <w:tcPr>
             <w:tcW w:type="dxa" w:w="2506"/>
@@ -5139,6 +5823,9 @@
             <w:vAlign w:val="center"/>
           </w:tcPr>
           <w:p>
+            <w:pPr>
+              <w:keepNext/>
+            </w:pPr>
             <w:r>
               <w:rPr>
                 <w:sz w:val="19"/>
@@ -5166,6 +5853,9 @@
             <w:vAlign w:val="center"/>
           </w:tcPr>
           <w:p>
+            <w:pPr>
+              <w:keepNext/>
+            </w:pPr>
             <w:r>
               <w:rPr>
                 <w:sz w:val="19"/>
@@ -5177,6 +5867,9 @@
         </w:tc>
       </w:tr>
       <w:tr>
+        <w:trPr>
+          <w:cantSplit/>
+        </w:trPr>
         <w:tc>
           <w:tcPr>
             <w:tcW w:type="dxa" w:w="2506"/>
@@ -5195,6 +5888,9 @@
             <w:vAlign w:val="center"/>
           </w:tcPr>
           <w:p>
+            <w:pPr>
+              <w:keepNext/>
+            </w:pPr>
             <w:r>
               <w:rPr>
                 <w:sz w:val="19"/>
@@ -5222,6 +5918,9 @@
             <w:vAlign w:val="center"/>
           </w:tcPr>
           <w:p>
+            <w:pPr>
+              <w:keepNext/>
+            </w:pPr>
             <w:r>
               <w:rPr>
                 <w:sz w:val="19"/>
@@ -5233,6 +5932,9 @@
         </w:tc>
       </w:tr>
       <w:tr>
+        <w:trPr>
+          <w:cantSplit/>
+        </w:trPr>
         <w:tc>
           <w:tcPr>
             <w:tcW w:type="dxa" w:w="2506"/>
@@ -5251,6 +5953,9 @@
             <w:vAlign w:val="center"/>
           </w:tcPr>
           <w:p>
+            <w:pPr>
+              <w:keepNext w:val="false"/>
+            </w:pPr>
             <w:r>
               <w:rPr>
                 <w:sz w:val="19"/>
@@ -5278,6 +5983,9 @@
             <w:vAlign w:val="center"/>
           </w:tcPr>
           <w:p>
+            <w:pPr>
+              <w:keepNext w:val="false"/>
+            </w:pPr>
             <w:r>
               <w:rPr>
                 <w:sz w:val="19"/>
@@ -5304,6 +6012,7 @@
     </w:p>
     <w:p>
       <w:pPr>
+        <w:keepNext/>
         <w:spacing w:after="120"/>
       </w:pPr>
       <w:r>
@@ -5333,6 +6042,7 @@
       </w:tblGrid>
       <w:tr>
         <w:trPr>
+          <w:cantSplit/>
           <w:tblHeader/>
         </w:trPr>
         <w:tc>
@@ -5354,6 +6064,9 @@
             <w:vAlign w:val="center"/>
           </w:tcPr>
           <w:p>
+            <w:pPr>
+              <w:keepNext/>
+            </w:pPr>
             <w:r>
               <w:rPr>
                 <w:b/>
@@ -5385,6 +6098,9 @@
             <w:vAlign w:val="center"/>
           </w:tcPr>
           <w:p>
+            <w:pPr>
+              <w:keepNext/>
+            </w:pPr>
             <w:r>
               <w:rPr>
                 <w:b/>
@@ -5399,6 +6115,9 @@
         </w:tc>
       </w:tr>
       <w:tr>
+        <w:trPr>
+          <w:cantSplit/>
+        </w:trPr>
         <w:tc>
           <w:tcPr>
             <w:tcW w:type="dxa" w:w="2506"/>
@@ -5417,6 +6136,9 @@
             <w:vAlign w:val="center"/>
           </w:tcPr>
           <w:p>
+            <w:pPr>
+              <w:keepNext/>
+            </w:pPr>
             <w:r>
               <w:rPr>
                 <w:sz w:val="19"/>
@@ -5444,6 +6166,9 @@
             <w:vAlign w:val="center"/>
           </w:tcPr>
           <w:p>
+            <w:pPr>
+              <w:keepNext/>
+            </w:pPr>
             <w:r>
               <w:rPr>
                 <w:sz w:val="19"/>
@@ -5455,6 +6180,9 @@
         </w:tc>
       </w:tr>
       <w:tr>
+        <w:trPr>
+          <w:cantSplit/>
+        </w:trPr>
         <w:tc>
           <w:tcPr>
             <w:tcW w:type="dxa" w:w="2506"/>
@@ -5473,6 +6201,9 @@
             <w:vAlign w:val="center"/>
           </w:tcPr>
           <w:p>
+            <w:pPr>
+              <w:keepNext/>
+            </w:pPr>
             <w:r>
               <w:rPr>
                 <w:sz w:val="19"/>
@@ -5500,6 +6231,9 @@
             <w:vAlign w:val="center"/>
           </w:tcPr>
           <w:p>
+            <w:pPr>
+              <w:keepNext/>
+            </w:pPr>
             <w:r>
               <w:rPr>
                 <w:sz w:val="19"/>
@@ -5511,6 +6245,9 @@
         </w:tc>
       </w:tr>
       <w:tr>
+        <w:trPr>
+          <w:cantSplit/>
+        </w:trPr>
         <w:tc>
           <w:tcPr>
             <w:tcW w:type="dxa" w:w="2506"/>
@@ -5529,6 +6266,9 @@
             <w:vAlign w:val="center"/>
           </w:tcPr>
           <w:p>
+            <w:pPr>
+              <w:keepNext/>
+            </w:pPr>
             <w:r>
               <w:rPr>
                 <w:sz w:val="19"/>
@@ -5556,6 +6296,9 @@
             <w:vAlign w:val="center"/>
           </w:tcPr>
           <w:p>
+            <w:pPr>
+              <w:keepNext/>
+            </w:pPr>
             <w:r>
               <w:rPr>
                 <w:sz w:val="19"/>
@@ -5567,6 +6310,9 @@
         </w:tc>
       </w:tr>
       <w:tr>
+        <w:trPr>
+          <w:cantSplit/>
+        </w:trPr>
         <w:tc>
           <w:tcPr>
             <w:tcW w:type="dxa" w:w="2506"/>
@@ -5585,6 +6331,9 @@
             <w:vAlign w:val="center"/>
           </w:tcPr>
           <w:p>
+            <w:pPr>
+              <w:keepNext/>
+            </w:pPr>
             <w:r>
               <w:rPr>
                 <w:sz w:val="19"/>
@@ -5612,6 +6361,9 @@
             <w:vAlign w:val="center"/>
           </w:tcPr>
           <w:p>
+            <w:pPr>
+              <w:keepNext/>
+            </w:pPr>
             <w:r>
               <w:rPr>
                 <w:sz w:val="19"/>
@@ -5623,6 +6375,9 @@
         </w:tc>
       </w:tr>
       <w:tr>
+        <w:trPr>
+          <w:cantSplit/>
+        </w:trPr>
         <w:tc>
           <w:tcPr>
             <w:tcW w:type="dxa" w:w="2506"/>
@@ -5641,6 +6396,9 @@
             <w:vAlign w:val="center"/>
           </w:tcPr>
           <w:p>
+            <w:pPr>
+              <w:keepNext/>
+            </w:pPr>
             <w:r>
               <w:rPr>
                 <w:sz w:val="19"/>
@@ -5668,6 +6426,9 @@
             <w:vAlign w:val="center"/>
           </w:tcPr>
           <w:p>
+            <w:pPr>
+              <w:keepNext/>
+            </w:pPr>
             <w:r>
               <w:rPr>
                 <w:sz w:val="19"/>
@@ -5679,6 +6440,9 @@
         </w:tc>
       </w:tr>
       <w:tr>
+        <w:trPr>
+          <w:cantSplit/>
+        </w:trPr>
         <w:tc>
           <w:tcPr>
             <w:tcW w:type="dxa" w:w="2506"/>
@@ -5697,6 +6461,9 @@
             <w:vAlign w:val="center"/>
           </w:tcPr>
           <w:p>
+            <w:pPr>
+              <w:keepNext/>
+            </w:pPr>
             <w:r>
               <w:rPr>
                 <w:sz w:val="19"/>
@@ -5724,6 +6491,9 @@
             <w:vAlign w:val="center"/>
           </w:tcPr>
           <w:p>
+            <w:pPr>
+              <w:keepNext/>
+            </w:pPr>
             <w:r>
               <w:rPr>
                 <w:sz w:val="19"/>
@@ -5735,6 +6505,9 @@
         </w:tc>
       </w:tr>
       <w:tr>
+        <w:trPr>
+          <w:cantSplit/>
+        </w:trPr>
         <w:tc>
           <w:tcPr>
             <w:tcW w:type="dxa" w:w="2506"/>
@@ -5753,6 +6526,9 @@
             <w:vAlign w:val="center"/>
           </w:tcPr>
           <w:p>
+            <w:pPr>
+              <w:keepNext w:val="false"/>
+            </w:pPr>
             <w:r>
               <w:rPr>
                 <w:sz w:val="19"/>
@@ -5780,6 +6556,9 @@
             <w:vAlign w:val="center"/>
           </w:tcPr>
           <w:p>
+            <w:pPr>
+              <w:keepNext w:val="false"/>
+            </w:pPr>
             <w:r>
               <w:rPr>
                 <w:sz w:val="19"/>
@@ -5806,6 +6585,7 @@
     </w:p>
     <w:p>
       <w:pPr>
+        <w:keepNext/>
         <w:spacing w:after="120"/>
       </w:pPr>
       <w:r>
@@ -5835,6 +6615,7 @@
       </w:tblGrid>
       <w:tr>
         <w:trPr>
+          <w:cantSplit/>
           <w:tblHeader/>
         </w:trPr>
         <w:tc>
@@ -5856,6 +6637,9 @@
             <w:vAlign w:val="center"/>
           </w:tcPr>
           <w:p>
+            <w:pPr>
+              <w:keepNext/>
+            </w:pPr>
             <w:r>
               <w:rPr>
                 <w:b/>
@@ -5887,6 +6671,9 @@
             <w:vAlign w:val="center"/>
           </w:tcPr>
           <w:p>
+            <w:pPr>
+              <w:keepNext/>
+            </w:pPr>
             <w:r>
               <w:rPr>
                 <w:b/>
@@ -5901,6 +6688,9 @@
         </w:tc>
       </w:tr>
       <w:tr>
+        <w:trPr>
+          <w:cantSplit/>
+        </w:trPr>
         <w:tc>
           <w:tcPr>
             <w:tcW w:type="dxa" w:w="2506"/>
@@ -5919,6 +6709,9 @@
             <w:vAlign w:val="center"/>
           </w:tcPr>
           <w:p>
+            <w:pPr>
+              <w:keepNext/>
+            </w:pPr>
             <w:r>
               <w:rPr>
                 <w:sz w:val="19"/>
@@ -5946,6 +6739,9 @@
             <w:vAlign w:val="center"/>
           </w:tcPr>
           <w:p>
+            <w:pPr>
+              <w:keepNext/>
+            </w:pPr>
             <w:r>
               <w:rPr>
                 <w:sz w:val="19"/>
@@ -5957,6 +6753,9 @@
         </w:tc>
       </w:tr>
       <w:tr>
+        <w:trPr>
+          <w:cantSplit/>
+        </w:trPr>
         <w:tc>
           <w:tcPr>
             <w:tcW w:type="dxa" w:w="2506"/>
@@ -5975,6 +6774,9 @@
             <w:vAlign w:val="center"/>
           </w:tcPr>
           <w:p>
+            <w:pPr>
+              <w:keepNext/>
+            </w:pPr>
             <w:r>
               <w:rPr>
                 <w:sz w:val="19"/>
@@ -6002,6 +6804,9 @@
             <w:vAlign w:val="center"/>
           </w:tcPr>
           <w:p>
+            <w:pPr>
+              <w:keepNext/>
+            </w:pPr>
             <w:r>
               <w:rPr>
                 <w:sz w:val="19"/>
@@ -6013,6 +6818,9 @@
         </w:tc>
       </w:tr>
       <w:tr>
+        <w:trPr>
+          <w:cantSplit/>
+        </w:trPr>
         <w:tc>
           <w:tcPr>
             <w:tcW w:type="dxa" w:w="2506"/>
@@ -6031,6 +6839,9 @@
             <w:vAlign w:val="center"/>
           </w:tcPr>
           <w:p>
+            <w:pPr>
+              <w:keepNext/>
+            </w:pPr>
             <w:r>
               <w:rPr>
                 <w:sz w:val="19"/>
@@ -6058,6 +6869,9 @@
             <w:vAlign w:val="center"/>
           </w:tcPr>
           <w:p>
+            <w:pPr>
+              <w:keepNext/>
+            </w:pPr>
             <w:r>
               <w:rPr>
                 <w:sz w:val="19"/>
@@ -6069,6 +6883,9 @@
         </w:tc>
       </w:tr>
       <w:tr>
+        <w:trPr>
+          <w:cantSplit/>
+        </w:trPr>
         <w:tc>
           <w:tcPr>
             <w:tcW w:type="dxa" w:w="2506"/>
@@ -6087,6 +6904,9 @@
             <w:vAlign w:val="center"/>
           </w:tcPr>
           <w:p>
+            <w:pPr>
+              <w:keepNext/>
+            </w:pPr>
             <w:r>
               <w:rPr>
                 <w:sz w:val="19"/>
@@ -6114,6 +6934,9 @@
             <w:vAlign w:val="center"/>
           </w:tcPr>
           <w:p>
+            <w:pPr>
+              <w:keepNext/>
+            </w:pPr>
             <w:r>
               <w:rPr>
                 <w:sz w:val="19"/>
@@ -6125,6 +6948,9 @@
         </w:tc>
       </w:tr>
       <w:tr>
+        <w:trPr>
+          <w:cantSplit/>
+        </w:trPr>
         <w:tc>
           <w:tcPr>
             <w:tcW w:type="dxa" w:w="2506"/>
@@ -6143,6 +6969,9 @@
             <w:vAlign w:val="center"/>
           </w:tcPr>
           <w:p>
+            <w:pPr>
+              <w:keepNext/>
+            </w:pPr>
             <w:r>
               <w:rPr>
                 <w:sz w:val="19"/>
@@ -6170,6 +6999,9 @@
             <w:vAlign w:val="center"/>
           </w:tcPr>
           <w:p>
+            <w:pPr>
+              <w:keepNext/>
+            </w:pPr>
             <w:r>
               <w:rPr>
                 <w:sz w:val="19"/>
@@ -6181,6 +7013,9 @@
         </w:tc>
       </w:tr>
       <w:tr>
+        <w:trPr>
+          <w:cantSplit/>
+        </w:trPr>
         <w:tc>
           <w:tcPr>
             <w:tcW w:type="dxa" w:w="2506"/>
@@ -6199,6 +7034,9 @@
             <w:vAlign w:val="center"/>
           </w:tcPr>
           <w:p>
+            <w:pPr>
+              <w:keepNext/>
+            </w:pPr>
             <w:r>
               <w:rPr>
                 <w:sz w:val="19"/>
@@ -6226,6 +7064,9 @@
             <w:vAlign w:val="center"/>
           </w:tcPr>
           <w:p>
+            <w:pPr>
+              <w:keepNext/>
+            </w:pPr>
             <w:r>
               <w:rPr>
                 <w:sz w:val="19"/>
@@ -6237,6 +7078,9 @@
         </w:tc>
       </w:tr>
       <w:tr>
+        <w:trPr>
+          <w:cantSplit/>
+        </w:trPr>
         <w:tc>
           <w:tcPr>
             <w:tcW w:type="dxa" w:w="2506"/>
@@ -6255,6 +7099,9 @@
             <w:vAlign w:val="center"/>
           </w:tcPr>
           <w:p>
+            <w:pPr>
+              <w:keepNext/>
+            </w:pPr>
             <w:r>
               <w:rPr>
                 <w:sz w:val="19"/>
@@ -6282,6 +7129,9 @@
             <w:vAlign w:val="center"/>
           </w:tcPr>
           <w:p>
+            <w:pPr>
+              <w:keepNext/>
+            </w:pPr>
             <w:r>
               <w:rPr>
                 <w:sz w:val="19"/>
@@ -6293,6 +7143,9 @@
         </w:tc>
       </w:tr>
       <w:tr>
+        <w:trPr>
+          <w:cantSplit/>
+        </w:trPr>
         <w:tc>
           <w:tcPr>
             <w:tcW w:type="dxa" w:w="2506"/>
@@ -6311,6 +7164,9 @@
             <w:vAlign w:val="center"/>
           </w:tcPr>
           <w:p>
+            <w:pPr>
+              <w:keepNext w:val="false"/>
+            </w:pPr>
             <w:r>
               <w:rPr>
                 <w:sz w:val="19"/>
@@ -6338,6 +7194,9 @@
             <w:vAlign w:val="center"/>
           </w:tcPr>
           <w:p>
+            <w:pPr>
+              <w:keepNext w:val="false"/>
+            </w:pPr>
             <w:r>
               <w:rPr>
                 <w:sz w:val="19"/>
@@ -6364,6 +7223,7 @@
     </w:p>
     <w:p>
       <w:pPr>
+        <w:keepNext/>
         <w:spacing w:after="120"/>
       </w:pPr>
       <w:r>
@@ -6393,6 +7253,7 @@
       </w:tblGrid>
       <w:tr>
         <w:trPr>
+          <w:cantSplit/>
           <w:tblHeader/>
         </w:trPr>
         <w:tc>
@@ -6414,6 +7275,9 @@
             <w:vAlign w:val="center"/>
           </w:tcPr>
           <w:p>
+            <w:pPr>
+              <w:keepNext/>
+            </w:pPr>
             <w:r>
               <w:rPr>
                 <w:b/>
@@ -6445,6 +7309,9 @@
             <w:vAlign w:val="center"/>
           </w:tcPr>
           <w:p>
+            <w:pPr>
+              <w:keepNext/>
+            </w:pPr>
             <w:r>
               <w:rPr>
                 <w:b/>
@@ -6459,6 +7326,9 @@
         </w:tc>
       </w:tr>
       <w:tr>
+        <w:trPr>
+          <w:cantSplit/>
+        </w:trPr>
         <w:tc>
           <w:tcPr>
             <w:tcW w:type="dxa" w:w="2506"/>
@@ -6477,6 +7347,9 @@
             <w:vAlign w:val="center"/>
           </w:tcPr>
           <w:p>
+            <w:pPr>
+              <w:keepNext/>
+            </w:pPr>
             <w:r>
               <w:rPr>
                 <w:sz w:val="19"/>
@@ -6504,6 +7377,9 @@
             <w:vAlign w:val="center"/>
           </w:tcPr>
           <w:p>
+            <w:pPr>
+              <w:keepNext/>
+            </w:pPr>
             <w:r>
               <w:rPr>
                 <w:sz w:val="19"/>
@@ -6515,6 +7391,9 @@
         </w:tc>
       </w:tr>
       <w:tr>
+        <w:trPr>
+          <w:cantSplit/>
+        </w:trPr>
         <w:tc>
           <w:tcPr>
             <w:tcW w:type="dxa" w:w="2506"/>
@@ -6533,6 +7412,9 @@
             <w:vAlign w:val="center"/>
           </w:tcPr>
           <w:p>
+            <w:pPr>
+              <w:keepNext/>
+            </w:pPr>
             <w:r>
               <w:rPr>
                 <w:sz w:val="19"/>
@@ -6560,6 +7442,9 @@
             <w:vAlign w:val="center"/>
           </w:tcPr>
           <w:p>
+            <w:pPr>
+              <w:keepNext/>
+            </w:pPr>
             <w:r>
               <w:rPr>
                 <w:sz w:val="19"/>
@@ -6571,6 +7456,9 @@
         </w:tc>
       </w:tr>
       <w:tr>
+        <w:trPr>
+          <w:cantSplit/>
+        </w:trPr>
         <w:tc>
           <w:tcPr>
             <w:tcW w:type="dxa" w:w="2506"/>
@@ -6589,6 +7477,9 @@
             <w:vAlign w:val="center"/>
           </w:tcPr>
           <w:p>
+            <w:pPr>
+              <w:keepNext/>
+            </w:pPr>
             <w:r>
               <w:rPr>
                 <w:sz w:val="19"/>
@@ -6616,6 +7507,9 @@
             <w:vAlign w:val="center"/>
           </w:tcPr>
           <w:p>
+            <w:pPr>
+              <w:keepNext/>
+            </w:pPr>
             <w:r>
               <w:rPr>
                 <w:sz w:val="19"/>
@@ -6627,6 +7521,9 @@
         </w:tc>
       </w:tr>
       <w:tr>
+        <w:trPr>
+          <w:cantSplit/>
+        </w:trPr>
         <w:tc>
           <w:tcPr>
             <w:tcW w:type="dxa" w:w="2506"/>
@@ -6645,6 +7542,9 @@
             <w:vAlign w:val="center"/>
           </w:tcPr>
           <w:p>
+            <w:pPr>
+              <w:keepNext/>
+            </w:pPr>
             <w:r>
               <w:rPr>
                 <w:sz w:val="19"/>
@@ -6672,6 +7572,9 @@
             <w:vAlign w:val="center"/>
           </w:tcPr>
           <w:p>
+            <w:pPr>
+              <w:keepNext/>
+            </w:pPr>
             <w:r>
               <w:rPr>
                 <w:sz w:val="19"/>
@@ -6683,6 +7586,9 @@
         </w:tc>
       </w:tr>
       <w:tr>
+        <w:trPr>
+          <w:cantSplit/>
+        </w:trPr>
         <w:tc>
           <w:tcPr>
             <w:tcW w:type="dxa" w:w="2506"/>
@@ -6701,6 +7607,9 @@
             <w:vAlign w:val="center"/>
           </w:tcPr>
           <w:p>
+            <w:pPr>
+              <w:keepNext/>
+            </w:pPr>
             <w:r>
               <w:rPr>
                 <w:sz w:val="19"/>
@@ -6728,6 +7637,9 @@
             <w:vAlign w:val="center"/>
           </w:tcPr>
           <w:p>
+            <w:pPr>
+              <w:keepNext/>
+            </w:pPr>
             <w:r>
               <w:rPr>
                 <w:sz w:val="19"/>
@@ -6739,6 +7651,9 @@
         </w:tc>
       </w:tr>
       <w:tr>
+        <w:trPr>
+          <w:cantSplit/>
+        </w:trPr>
         <w:tc>
           <w:tcPr>
             <w:tcW w:type="dxa" w:w="2506"/>
@@ -6757,6 +7672,9 @@
             <w:vAlign w:val="center"/>
           </w:tcPr>
           <w:p>
+            <w:pPr>
+              <w:keepNext/>
+            </w:pPr>
             <w:r>
               <w:rPr>
                 <w:sz w:val="19"/>
@@ -6784,6 +7702,9 @@
             <w:vAlign w:val="center"/>
           </w:tcPr>
           <w:p>
+            <w:pPr>
+              <w:keepNext/>
+            </w:pPr>
             <w:r>
               <w:rPr>
                 <w:sz w:val="19"/>
@@ -6795,6 +7716,9 @@
         </w:tc>
       </w:tr>
       <w:tr>
+        <w:trPr>
+          <w:cantSplit/>
+        </w:trPr>
         <w:tc>
           <w:tcPr>
             <w:tcW w:type="dxa" w:w="2506"/>
@@ -6813,6 +7737,9 @@
             <w:vAlign w:val="center"/>
           </w:tcPr>
           <w:p>
+            <w:pPr>
+              <w:keepNext w:val="false"/>
+            </w:pPr>
             <w:r>
               <w:rPr>
                 <w:sz w:val="19"/>
@@ -6840,6 +7767,9 @@
             <w:vAlign w:val="center"/>
           </w:tcPr>
           <w:p>
+            <w:pPr>
+              <w:keepNext w:val="false"/>
+            </w:pPr>
             <w:r>
               <w:rPr>
                 <w:sz w:val="19"/>
@@ -6866,6 +7796,7 @@
     </w:p>
     <w:p>
       <w:pPr>
+        <w:keepNext/>
         <w:spacing w:after="120"/>
       </w:pPr>
       <w:r>
@@ -6895,6 +7826,7 @@
       </w:tblGrid>
       <w:tr>
         <w:trPr>
+          <w:cantSplit/>
           <w:tblHeader/>
         </w:trPr>
         <w:tc>
@@ -6916,6 +7848,9 @@
             <w:vAlign w:val="center"/>
           </w:tcPr>
           <w:p>
+            <w:pPr>
+              <w:keepNext/>
+            </w:pPr>
             <w:r>
               <w:rPr>
                 <w:b/>
@@ -6947,6 +7882,9 @@
             <w:vAlign w:val="center"/>
           </w:tcPr>
           <w:p>
+            <w:pPr>
+              <w:keepNext/>
+            </w:pPr>
             <w:r>
               <w:rPr>
                 <w:b/>
@@ -6961,6 +7899,9 @@
         </w:tc>
       </w:tr>
       <w:tr>
+        <w:trPr>
+          <w:cantSplit/>
+        </w:trPr>
         <w:tc>
           <w:tcPr>
             <w:tcW w:type="dxa" w:w="2506"/>
@@ -6979,6 +7920,9 @@
             <w:vAlign w:val="center"/>
           </w:tcPr>
           <w:p>
+            <w:pPr>
+              <w:keepNext/>
+            </w:pPr>
             <w:r>
               <w:rPr>
                 <w:sz w:val="19"/>
@@ -7006,6 +7950,9 @@
             <w:vAlign w:val="center"/>
           </w:tcPr>
           <w:p>
+            <w:pPr>
+              <w:keepNext/>
+            </w:pPr>
             <w:r>
               <w:rPr>
                 <w:sz w:val="19"/>
@@ -7017,6 +7964,9 @@
         </w:tc>
       </w:tr>
       <w:tr>
+        <w:trPr>
+          <w:cantSplit/>
+        </w:trPr>
         <w:tc>
           <w:tcPr>
             <w:tcW w:type="dxa" w:w="2506"/>
@@ -7035,6 +7985,9 @@
             <w:vAlign w:val="center"/>
           </w:tcPr>
           <w:p>
+            <w:pPr>
+              <w:keepNext/>
+            </w:pPr>
             <w:r>
               <w:rPr>
                 <w:sz w:val="19"/>
@@ -7062,6 +8015,9 @@
             <w:vAlign w:val="center"/>
           </w:tcPr>
           <w:p>
+            <w:pPr>
+              <w:keepNext/>
+            </w:pPr>
             <w:r>
               <w:rPr>
                 <w:sz w:val="19"/>
@@ -7073,6 +8029,9 @@
         </w:tc>
       </w:tr>
       <w:tr>
+        <w:trPr>
+          <w:cantSplit/>
+        </w:trPr>
         <w:tc>
           <w:tcPr>
             <w:tcW w:type="dxa" w:w="2506"/>
@@ -7091,6 +8050,9 @@
             <w:vAlign w:val="center"/>
           </w:tcPr>
           <w:p>
+            <w:pPr>
+              <w:keepNext/>
+            </w:pPr>
             <w:r>
               <w:rPr>
                 <w:sz w:val="19"/>
@@ -7118,6 +8080,9 @@
             <w:vAlign w:val="center"/>
           </w:tcPr>
           <w:p>
+            <w:pPr>
+              <w:keepNext/>
+            </w:pPr>
             <w:r>
               <w:rPr>
                 <w:sz w:val="19"/>
@@ -7129,6 +8094,9 @@
         </w:tc>
       </w:tr>
       <w:tr>
+        <w:trPr>
+          <w:cantSplit/>
+        </w:trPr>
         <w:tc>
           <w:tcPr>
             <w:tcW w:type="dxa" w:w="2506"/>
@@ -7147,6 +8115,9 @@
             <w:vAlign w:val="center"/>
           </w:tcPr>
           <w:p>
+            <w:pPr>
+              <w:keepNext/>
+            </w:pPr>
             <w:r>
               <w:rPr>
                 <w:sz w:val="19"/>
@@ -7174,6 +8145,9 @@
             <w:vAlign w:val="center"/>
           </w:tcPr>
           <w:p>
+            <w:pPr>
+              <w:keepNext/>
+            </w:pPr>
             <w:r>
               <w:rPr>
                 <w:sz w:val="19"/>
@@ -7185,6 +8159,9 @@
         </w:tc>
       </w:tr>
       <w:tr>
+        <w:trPr>
+          <w:cantSplit/>
+        </w:trPr>
         <w:tc>
           <w:tcPr>
             <w:tcW w:type="dxa" w:w="2506"/>
@@ -7203,6 +8180,9 @@
             <w:vAlign w:val="center"/>
           </w:tcPr>
           <w:p>
+            <w:pPr>
+              <w:keepNext/>
+            </w:pPr>
             <w:r>
               <w:rPr>
                 <w:sz w:val="19"/>
@@ -7230,6 +8210,9 @@
             <w:vAlign w:val="center"/>
           </w:tcPr>
           <w:p>
+            <w:pPr>
+              <w:keepNext/>
+            </w:pPr>
             <w:r>
               <w:rPr>
                 <w:sz w:val="19"/>
@@ -7241,6 +8224,9 @@
         </w:tc>
       </w:tr>
       <w:tr>
+        <w:trPr>
+          <w:cantSplit/>
+        </w:trPr>
         <w:tc>
           <w:tcPr>
             <w:tcW w:type="dxa" w:w="2506"/>
@@ -7259,6 +8245,9 @@
             <w:vAlign w:val="center"/>
           </w:tcPr>
           <w:p>
+            <w:pPr>
+              <w:keepNext/>
+            </w:pPr>
             <w:r>
               <w:rPr>
                 <w:sz w:val="19"/>
@@ -7286,6 +8275,9 @@
             <w:vAlign w:val="center"/>
           </w:tcPr>
           <w:p>
+            <w:pPr>
+              <w:keepNext/>
+            </w:pPr>
             <w:r>
               <w:rPr>
                 <w:sz w:val="19"/>
@@ -7297,6 +8289,9 @@
         </w:tc>
       </w:tr>
       <w:tr>
+        <w:trPr>
+          <w:cantSplit/>
+        </w:trPr>
         <w:tc>
           <w:tcPr>
             <w:tcW w:type="dxa" w:w="2506"/>
@@ -7315,6 +8310,9 @@
             <w:vAlign w:val="center"/>
           </w:tcPr>
           <w:p>
+            <w:pPr>
+              <w:keepNext w:val="false"/>
+            </w:pPr>
             <w:r>
               <w:rPr>
                 <w:sz w:val="19"/>
@@ -7342,6 +8340,9 @@
             <w:vAlign w:val="center"/>
           </w:tcPr>
           <w:p>
+            <w:pPr>
+              <w:keepNext w:val="false"/>
+            </w:pPr>
             <w:r>
               <w:rPr>
                 <w:sz w:val="19"/>
@@ -7386,6 +8387,7 @@
       </w:tblGrid>
       <w:tr>
         <w:trPr>
+          <w:cantSplit/>
           <w:tblHeader/>
         </w:trPr>
         <w:tc>
@@ -7407,6 +8409,9 @@
             <w:vAlign w:val="center"/>
           </w:tcPr>
           <w:p>
+            <w:pPr>
+              <w:keepNext/>
+            </w:pPr>
             <w:r>
               <w:rPr>
                 <w:b/>
@@ -7438,6 +8443,9 @@
             <w:vAlign w:val="center"/>
           </w:tcPr>
           <w:p>
+            <w:pPr>
+              <w:keepNext/>
+            </w:pPr>
             <w:r>
               <w:rPr>
                 <w:b/>
@@ -7469,6 +8477,9 @@
             <w:vAlign w:val="center"/>
           </w:tcPr>
           <w:p>
+            <w:pPr>
+              <w:keepNext/>
+            </w:pPr>
             <w:r>
               <w:rPr>
                 <w:b/>
@@ -7483,6 +8494,9 @@
         </w:tc>
       </w:tr>
       <w:tr>
+        <w:trPr>
+          <w:cantSplit/>
+        </w:trPr>
         <w:tc>
           <w:tcPr>
             <w:tcW w:type="dxa" w:w="2506"/>
@@ -7501,6 +8515,9 @@
             <w:vAlign w:val="center"/>
           </w:tcPr>
           <w:p>
+            <w:pPr>
+              <w:keepNext/>
+            </w:pPr>
             <w:r>
               <w:rPr>
                 <w:sz w:val="19"/>
@@ -7528,6 +8545,9 @@
             <w:vAlign w:val="center"/>
           </w:tcPr>
           <w:p>
+            <w:pPr>
+              <w:keepNext/>
+            </w:pPr>
             <w:r>
               <w:rPr>
                 <w:sz w:val="19"/>
@@ -7555,6 +8575,9 @@
             <w:vAlign w:val="center"/>
           </w:tcPr>
           <w:p>
+            <w:pPr>
+              <w:keepNext/>
+            </w:pPr>
             <w:r>
               <w:rPr>
                 <w:sz w:val="19"/>
@@ -7566,6 +8589,9 @@
         </w:tc>
       </w:tr>
       <w:tr>
+        <w:trPr>
+          <w:cantSplit/>
+        </w:trPr>
         <w:tc>
           <w:tcPr>
             <w:tcW w:type="dxa" w:w="2506"/>
@@ -7584,6 +8610,9 @@
             <w:vAlign w:val="center"/>
           </w:tcPr>
           <w:p>
+            <w:pPr>
+              <w:keepNext/>
+            </w:pPr>
             <w:r>
               <w:rPr>
                 <w:sz w:val="19"/>
@@ -7611,6 +8640,9 @@
             <w:vAlign w:val="center"/>
           </w:tcPr>
           <w:p>
+            <w:pPr>
+              <w:keepNext/>
+            </w:pPr>
             <w:r>
               <w:rPr>
                 <w:sz w:val="19"/>
@@ -7638,6 +8670,9 @@
             <w:vAlign w:val="center"/>
           </w:tcPr>
           <w:p>
+            <w:pPr>
+              <w:keepNext/>
+            </w:pPr>
             <w:r>
               <w:rPr>
                 <w:sz w:val="19"/>
@@ -7649,6 +8684,9 @@
         </w:tc>
       </w:tr>
       <w:tr>
+        <w:trPr>
+          <w:cantSplit/>
+        </w:trPr>
         <w:tc>
           <w:tcPr>
             <w:tcW w:type="dxa" w:w="2506"/>
@@ -7667,6 +8705,9 @@
             <w:vAlign w:val="center"/>
           </w:tcPr>
           <w:p>
+            <w:pPr>
+              <w:keepNext/>
+            </w:pPr>
             <w:r>
               <w:rPr>
                 <w:sz w:val="19"/>
@@ -7694,6 +8735,9 @@
             <w:vAlign w:val="center"/>
           </w:tcPr>
           <w:p>
+            <w:pPr>
+              <w:keepNext/>
+            </w:pPr>
             <w:r>
               <w:rPr>
                 <w:sz w:val="19"/>
@@ -7721,6 +8765,9 @@
             <w:vAlign w:val="center"/>
           </w:tcPr>
           <w:p>
+            <w:pPr>
+              <w:keepNext/>
+            </w:pPr>
             <w:r>
               <w:rPr>
                 <w:sz w:val="19"/>
@@ -7732,6 +8779,9 @@
         </w:tc>
       </w:tr>
       <w:tr>
+        <w:trPr>
+          <w:cantSplit/>
+        </w:trPr>
         <w:tc>
           <w:tcPr>
             <w:tcW w:type="dxa" w:w="2506"/>
@@ -7750,6 +8800,9 @@
             <w:vAlign w:val="center"/>
           </w:tcPr>
           <w:p>
+            <w:pPr>
+              <w:keepNext w:val="false"/>
+            </w:pPr>
             <w:r>
               <w:rPr>
                 <w:sz w:val="19"/>
@@ -7777,6 +8830,9 @@
             <w:vAlign w:val="center"/>
           </w:tcPr>
           <w:p>
+            <w:pPr>
+              <w:keepNext w:val="false"/>
+            </w:pPr>
             <w:r>
               <w:rPr>
                 <w:sz w:val="19"/>
@@ -7804,6 +8860,9 @@
             <w:vAlign w:val="center"/>
           </w:tcPr>
           <w:p>
+            <w:pPr>
+              <w:keepNext w:val="false"/>
+            </w:pPr>
             <w:r>
               <w:rPr>
                 <w:sz w:val="19"/>
@@ -7830,6 +8889,7 @@
     </w:p>
     <w:p>
       <w:pPr>
+        <w:keepNext w:val="false"/>
         <w:spacing w:after="120"/>
       </w:pPr>
       <w:r>
@@ -8233,6 +9293,7 @@
     </w:p>
     <w:p>
       <w:pPr>
+        <w:keepNext w:val="false"/>
         <w:spacing w:after="120"/>
       </w:pPr>
       <w:r>
@@ -8258,6 +9319,7 @@
       </w:tblGrid>
       <w:tr>
         <w:trPr>
+          <w:cantSplit/>
           <w:tblHeader/>
         </w:trPr>
         <w:tc>
@@ -8279,6 +9341,9 @@
             <w:vAlign w:val="center"/>
           </w:tcPr>
           <w:p>
+            <w:pPr>
+              <w:keepNext/>
+            </w:pPr>
             <w:r>
               <w:rPr>
                 <w:b/>
@@ -8310,6 +9375,9 @@
             <w:vAlign w:val="center"/>
           </w:tcPr>
           <w:p>
+            <w:pPr>
+              <w:keepNext/>
+            </w:pPr>
             <w:r>
               <w:rPr>
                 <w:b/>
@@ -8341,6 +9409,9 @@
             <w:vAlign w:val="center"/>
           </w:tcPr>
           <w:p>
+            <w:pPr>
+              <w:keepNext/>
+            </w:pPr>
             <w:r>
               <w:rPr>
                 <w:b/>
@@ -8355,6 +9426,9 @@
         </w:tc>
       </w:tr>
       <w:tr>
+        <w:trPr>
+          <w:cantSplit/>
+        </w:trPr>
         <w:tc>
           <w:tcPr>
             <w:tcW w:type="dxa" w:w="2699"/>
@@ -8373,6 +9447,9 @@
             <w:vAlign w:val="center"/>
           </w:tcPr>
           <w:p>
+            <w:pPr>
+              <w:keepNext/>
+            </w:pPr>
             <w:r>
               <w:rPr>
                 <w:sz w:val="19"/>
@@ -8400,6 +9477,9 @@
             <w:vAlign w:val="center"/>
           </w:tcPr>
           <w:p>
+            <w:pPr>
+              <w:keepNext/>
+            </w:pPr>
             <w:r>
               <w:rPr>
                 <w:sz w:val="19"/>
@@ -8427,6 +9507,9 @@
             <w:vAlign w:val="center"/>
           </w:tcPr>
           <w:p>
+            <w:pPr>
+              <w:keepNext/>
+            </w:pPr>
             <w:r>
               <w:rPr>
                 <w:sz w:val="19"/>
@@ -8438,6 +9521,9 @@
         </w:tc>
       </w:tr>
       <w:tr>
+        <w:trPr>
+          <w:cantSplit/>
+        </w:trPr>
         <w:tc>
           <w:tcPr>
             <w:tcW w:type="dxa" w:w="2699"/>
@@ -8456,6 +9542,9 @@
             <w:vAlign w:val="center"/>
           </w:tcPr>
           <w:p>
+            <w:pPr>
+              <w:keepNext/>
+            </w:pPr>
             <w:r>
               <w:rPr>
                 <w:sz w:val="19"/>
@@ -8483,6 +9572,9 @@
             <w:vAlign w:val="center"/>
           </w:tcPr>
           <w:p>
+            <w:pPr>
+              <w:keepNext/>
+            </w:pPr>
             <w:r>
               <w:rPr>
                 <w:sz w:val="19"/>
@@ -8510,6 +9602,9 @@
             <w:vAlign w:val="center"/>
           </w:tcPr>
           <w:p>
+            <w:pPr>
+              <w:keepNext/>
+            </w:pPr>
             <w:r>
               <w:rPr>
                 <w:sz w:val="19"/>
@@ -8521,6 +9616,9 @@
         </w:tc>
       </w:tr>
       <w:tr>
+        <w:trPr>
+          <w:cantSplit/>
+        </w:trPr>
         <w:tc>
           <w:tcPr>
             <w:tcW w:type="dxa" w:w="2699"/>
@@ -8539,6 +9637,9 @@
             <w:vAlign w:val="center"/>
           </w:tcPr>
           <w:p>
+            <w:pPr>
+              <w:keepNext/>
+            </w:pPr>
             <w:r>
               <w:rPr>
                 <w:sz w:val="19"/>
@@ -8566,6 +9667,9 @@
             <w:vAlign w:val="center"/>
           </w:tcPr>
           <w:p>
+            <w:pPr>
+              <w:keepNext/>
+            </w:pPr>
             <w:r>
               <w:rPr>
                 <w:sz w:val="19"/>
@@ -8593,6 +9697,9 @@
             <w:vAlign w:val="center"/>
           </w:tcPr>
           <w:p>
+            <w:pPr>
+              <w:keepNext/>
+            </w:pPr>
             <w:r>
               <w:rPr>
                 <w:sz w:val="19"/>
@@ -8604,6 +9711,9 @@
         </w:tc>
       </w:tr>
       <w:tr>
+        <w:trPr>
+          <w:cantSplit/>
+        </w:trPr>
         <w:tc>
           <w:tcPr>
             <w:tcW w:type="dxa" w:w="2699"/>
@@ -8622,6 +9732,9 @@
             <w:vAlign w:val="center"/>
           </w:tcPr>
           <w:p>
+            <w:pPr>
+              <w:keepNext/>
+            </w:pPr>
             <w:r>
               <w:rPr>
                 <w:sz w:val="19"/>
@@ -8649,6 +9762,9 @@
             <w:vAlign w:val="center"/>
           </w:tcPr>
           <w:p>
+            <w:pPr>
+              <w:keepNext/>
+            </w:pPr>
             <w:r>
               <w:rPr>
                 <w:sz w:val="19"/>
@@ -8676,6 +9792,9 @@
             <w:vAlign w:val="center"/>
           </w:tcPr>
           <w:p>
+            <w:pPr>
+              <w:keepNext/>
+            </w:pPr>
             <w:r>
               <w:rPr>
                 <w:sz w:val="19"/>
@@ -8687,6 +9806,9 @@
         </w:tc>
       </w:tr>
       <w:tr>
+        <w:trPr>
+          <w:cantSplit/>
+        </w:trPr>
         <w:tc>
           <w:tcPr>
             <w:tcW w:type="dxa" w:w="2699"/>
@@ -8705,6 +9827,9 @@
             <w:vAlign w:val="center"/>
           </w:tcPr>
           <w:p>
+            <w:pPr>
+              <w:keepNext/>
+            </w:pPr>
             <w:r>
               <w:rPr>
                 <w:sz w:val="19"/>
@@ -8732,6 +9857,9 @@
             <w:vAlign w:val="center"/>
           </w:tcPr>
           <w:p>
+            <w:pPr>
+              <w:keepNext/>
+            </w:pPr>
             <w:r>
               <w:rPr>
                 <w:sz w:val="19"/>
@@ -8759,6 +9887,9 @@
             <w:vAlign w:val="center"/>
           </w:tcPr>
           <w:p>
+            <w:pPr>
+              <w:keepNext/>
+            </w:pPr>
             <w:r>
               <w:rPr>
                 <w:sz w:val="19"/>
@@ -8770,6 +9901,9 @@
         </w:tc>
       </w:tr>
       <w:tr>
+        <w:trPr>
+          <w:cantSplit/>
+        </w:trPr>
         <w:tc>
           <w:tcPr>
             <w:tcW w:type="dxa" w:w="2699"/>
@@ -8788,6 +9922,9 @@
             <w:vAlign w:val="center"/>
           </w:tcPr>
           <w:p>
+            <w:pPr>
+              <w:keepNext w:val="false"/>
+            </w:pPr>
             <w:r>
               <w:rPr>
                 <w:sz w:val="19"/>
@@ -8815,6 +9952,9 @@
             <w:vAlign w:val="center"/>
           </w:tcPr>
           <w:p>
+            <w:pPr>
+              <w:keepNext w:val="false"/>
+            </w:pPr>
             <w:r>
               <w:rPr>
                 <w:sz w:val="19"/>
@@ -8842,6 +9982,9 @@
             <w:vAlign w:val="center"/>
           </w:tcPr>
           <w:p>
+            <w:pPr>
+              <w:keepNext w:val="false"/>
+            </w:pPr>
             <w:r>
               <w:rPr>
                 <w:sz w:val="19"/>
@@ -8881,6 +10024,7 @@
       </w:tblGrid>
       <w:tr>
         <w:trPr>
+          <w:cantSplit/>
           <w:tblHeader/>
         </w:trPr>
         <w:tc>
@@ -8902,6 +10046,9 @@
             <w:vAlign w:val="center"/>
           </w:tcPr>
           <w:p>
+            <w:pPr>
+              <w:keepNext/>
+            </w:pPr>
             <w:r>
               <w:rPr>
                 <w:b/>
@@ -8933,6 +10080,9 @@
             <w:vAlign w:val="center"/>
           </w:tcPr>
           <w:p>
+            <w:pPr>
+              <w:keepNext/>
+            </w:pPr>
             <w:r>
               <w:rPr>
                 <w:b/>
@@ -8964,6 +10114,9 @@
             <w:vAlign w:val="center"/>
           </w:tcPr>
           <w:p>
+            <w:pPr>
+              <w:keepNext/>
+            </w:pPr>
             <w:r>
               <w:rPr>
                 <w:b/>
@@ -8978,6 +10131,9 @@
         </w:tc>
       </w:tr>
       <w:tr>
+        <w:trPr>
+          <w:cantSplit/>
+        </w:trPr>
         <w:tc>
           <w:tcPr>
             <w:tcW w:type="dxa" w:w="964"/>
@@ -8996,6 +10152,9 @@
             <w:vAlign w:val="center"/>
           </w:tcPr>
           <w:p>
+            <w:pPr>
+              <w:keepNext/>
+            </w:pPr>
             <w:r>
               <w:rPr>
                 <w:sz w:val="19"/>
@@ -9023,6 +10182,9 @@
             <w:vAlign w:val="center"/>
           </w:tcPr>
           <w:p>
+            <w:pPr>
+              <w:keepNext/>
+            </w:pPr>
             <w:r>
               <w:rPr>
                 <w:sz w:val="19"/>
@@ -9050,6 +10212,9 @@
             <w:vAlign w:val="center"/>
           </w:tcPr>
           <w:p>
+            <w:pPr>
+              <w:keepNext/>
+            </w:pPr>
             <w:r>
               <w:rPr>
                 <w:sz w:val="19"/>
@@ -9061,6 +10226,9 @@
         </w:tc>
       </w:tr>
       <w:tr>
+        <w:trPr>
+          <w:cantSplit/>
+        </w:trPr>
         <w:tc>
           <w:tcPr>
             <w:tcW w:type="dxa" w:w="964"/>
@@ -9079,6 +10247,9 @@
             <w:vAlign w:val="center"/>
           </w:tcPr>
           <w:p>
+            <w:pPr>
+              <w:keepNext/>
+            </w:pPr>
             <w:r>
               <w:rPr>
                 <w:sz w:val="19"/>
@@ -9106,6 +10277,9 @@
             <w:vAlign w:val="center"/>
           </w:tcPr>
           <w:p>
+            <w:pPr>
+              <w:keepNext/>
+            </w:pPr>
             <w:r>
               <w:rPr>
                 <w:sz w:val="19"/>
@@ -9133,6 +10307,9 @@
             <w:vAlign w:val="center"/>
           </w:tcPr>
           <w:p>
+            <w:pPr>
+              <w:keepNext/>
+            </w:pPr>
             <w:r>
               <w:rPr>
                 <w:sz w:val="19"/>
@@ -9144,6 +10321,9 @@
         </w:tc>
       </w:tr>
       <w:tr>
+        <w:trPr>
+          <w:cantSplit/>
+        </w:trPr>
         <w:tc>
           <w:tcPr>
             <w:tcW w:type="dxa" w:w="964"/>
@@ -9162,6 +10342,9 @@
             <w:vAlign w:val="center"/>
           </w:tcPr>
           <w:p>
+            <w:pPr>
+              <w:keepNext/>
+            </w:pPr>
             <w:r>
               <w:rPr>
                 <w:sz w:val="19"/>
@@ -9189,6 +10372,9 @@
             <w:vAlign w:val="center"/>
           </w:tcPr>
           <w:p>
+            <w:pPr>
+              <w:keepNext/>
+            </w:pPr>
             <w:r>
               <w:rPr>
                 <w:sz w:val="19"/>
@@ -9216,6 +10402,9 @@
             <w:vAlign w:val="center"/>
           </w:tcPr>
           <w:p>
+            <w:pPr>
+              <w:keepNext/>
+            </w:pPr>
             <w:r>
               <w:rPr>
                 <w:sz w:val="19"/>
@@ -9227,6 +10416,9 @@
         </w:tc>
       </w:tr>
       <w:tr>
+        <w:trPr>
+          <w:cantSplit/>
+        </w:trPr>
         <w:tc>
           <w:tcPr>
             <w:tcW w:type="dxa" w:w="964"/>
@@ -9245,6 +10437,9 @@
             <w:vAlign w:val="center"/>
           </w:tcPr>
           <w:p>
+            <w:pPr>
+              <w:keepNext/>
+            </w:pPr>
             <w:r>
               <w:rPr>
                 <w:sz w:val="19"/>
@@ -9272,6 +10467,9 @@
             <w:vAlign w:val="center"/>
           </w:tcPr>
           <w:p>
+            <w:pPr>
+              <w:keepNext/>
+            </w:pPr>
             <w:r>
               <w:rPr>
                 <w:sz w:val="19"/>
@@ -9299,6 +10497,9 @@
             <w:vAlign w:val="center"/>
           </w:tcPr>
           <w:p>
+            <w:pPr>
+              <w:keepNext/>
+            </w:pPr>
             <w:r>
               <w:rPr>
                 <w:sz w:val="19"/>
@@ -9310,6 +10511,9 @@
         </w:tc>
       </w:tr>
       <w:tr>
+        <w:trPr>
+          <w:cantSplit/>
+        </w:trPr>
         <w:tc>
           <w:tcPr>
             <w:tcW w:type="dxa" w:w="964"/>
@@ -9328,6 +10532,9 @@
             <w:vAlign w:val="center"/>
           </w:tcPr>
           <w:p>
+            <w:pPr>
+              <w:keepNext/>
+            </w:pPr>
             <w:r>
               <w:rPr>
                 <w:sz w:val="19"/>
@@ -9355,6 +10562,9 @@
             <w:vAlign w:val="center"/>
           </w:tcPr>
           <w:p>
+            <w:pPr>
+              <w:keepNext/>
+            </w:pPr>
             <w:r>
               <w:rPr>
                 <w:sz w:val="19"/>
@@ -9382,6 +10592,9 @@
             <w:vAlign w:val="center"/>
           </w:tcPr>
           <w:p>
+            <w:pPr>
+              <w:keepNext/>
+            </w:pPr>
             <w:r>
               <w:rPr>
                 <w:sz w:val="19"/>
@@ -9393,6 +10606,9 @@
         </w:tc>
       </w:tr>
       <w:tr>
+        <w:trPr>
+          <w:cantSplit/>
+        </w:trPr>
         <w:tc>
           <w:tcPr>
             <w:tcW w:type="dxa" w:w="964"/>
@@ -9411,6 +10627,9 @@
             <w:vAlign w:val="center"/>
           </w:tcPr>
           <w:p>
+            <w:pPr>
+              <w:keepNext w:val="false"/>
+            </w:pPr>
             <w:r>
               <w:rPr>
                 <w:sz w:val="19"/>
@@ -9438,6 +10657,9 @@
             <w:vAlign w:val="center"/>
           </w:tcPr>
           <w:p>
+            <w:pPr>
+              <w:keepNext w:val="false"/>
+            </w:pPr>
             <w:r>
               <w:rPr>
                 <w:sz w:val="19"/>
@@ -9465,6 +10687,9 @@
             <w:vAlign w:val="center"/>
           </w:tcPr>
           <w:p>
+            <w:pPr>
+              <w:keepNext w:val="false"/>
+            </w:pPr>
             <w:r>
               <w:rPr>
                 <w:sz w:val="19"/>
@@ -9934,6 +11159,8 @@
     <w:next w:val="Normal"/>
     <w:qFormat/>
     <w:pPr>
+      <w:keepNext/>
+      <w:keepLines/>
       <w:spacing w:after="80" w:before="280"/>
       <w:outlineLvl w:val="1"/>
     </w:pPr>
@@ -9951,6 +11178,8 @@
     <w:next w:val="Normal"/>
     <w:qFormat/>
     <w:pPr>
+      <w:keepNext/>
+      <w:keepLines/>
       <w:spacing w:after="80" w:before="160"/>
       <w:outlineLvl w:val="2"/>
     </w:pPr>

</xml_diff>

<commit_message>
Story bible v0.2: Gerd's faked death, Kael-Lyra-Isolde love triangle, endings matrix
</commit_message>
<xml_diff>
--- a/docs/Historia_O_Coracao_de_Eter.docx
+++ b/docs/Historia_O_Coracao_de_Eter.docx
@@ -220,7 +220,7 @@
                 <w:sz w:val="19"/>
                 <w:szCs w:val="19"/>
               </w:rPr>
-              <w:t xml:space="preserve">0.1 — proposta inicial (tudo aberto a ajustes)</w:t>
+              <w:t xml:space="preserve">0.2 — pontos H-01 a H-06 decididos</w:t>
             </w:r>
           </w:p>
         </w:tc>
@@ -522,7 +522,7 @@
           <w:sz w:val="24"/>
           <w:szCs w:val="24"/>
         </w:rPr>
-        <w:t xml:space="preserve">7. Pontos em aberto para o Diretor</w:t>
+        <w:t xml:space="preserve">7. Decisões da história</w:t>
       </w:r>
     </w:p>
     <w:p>
@@ -780,6 +780,26 @@
       </w:r>
       <w:r>
         <w:t xml:space="preserve"> — Eco descobre se tem alma; Brann e Isolde decidem quem são além do Império.</w:t>
+      </w:r>
+    </w:p>
+    <w:p>
+      <w:pPr>
+        <w:pStyle w:val="ListParagraph"/>
+        <w:numPr>
+          <w:ilvl w:val="0"/>
+          <w:numId w:val="2"/>
+        </w:numPr>
+        <w:spacing w:after="60"/>
+      </w:pPr>
+      <w:r>
+        <w:rPr>
+          <w:b/>
+          <w:bCs/>
+        </w:rPr>
+        <w:t xml:space="preserve">Coração dividido</w:t>
+      </w:r>
+      <w:r>
+        <w:t xml:space="preserve"> — o triângulo Kael–Lyra–Isolde espelha o conflito do mundo: magia ou progresso.</w:t>
       </w:r>
     </w:p>
     <w:p>
@@ -8361,6 +8381,1167 @@
     </w:p>
     <w:p>
       <w:pPr>
+        <w:pStyle w:val="Heading2"/>
+      </w:pPr>
+      <w:r>
+        <w:t xml:space="preserve">Mestre Gerd Brunor — coadjuvante</w:t>
+      </w:r>
+    </w:p>
+    <w:p>
+      <w:pPr>
+        <w:keepNext/>
+        <w:spacing w:after="120"/>
+      </w:pPr>
+      <w:r>
+        <w:rPr>
+          <w:i/>
+          <w:iCs/>
+          <w:color w:val="666666"/>
+        </w:rPr>
+        <w:t xml:space="preserve">61 anos · mestre mecânico de Vila Caldeira · tutor de Kael</w:t>
+      </w:r>
+    </w:p>
+    <w:tbl>
+      <w:tblPr>
+        <w:tblW w:type="dxa" w:w="9638"/>
+        <w:tblBorders>
+          <w:top w:val="single" w:color="auto" w:sz="4"/>
+          <w:left w:val="single" w:color="auto" w:sz="4"/>
+          <w:bottom w:val="single" w:color="auto" w:sz="4"/>
+          <w:right w:val="single" w:color="auto" w:sz="4"/>
+          <w:insideH w:val="single" w:color="auto" w:sz="4"/>
+          <w:insideV w:val="single" w:color="auto" w:sz="4"/>
+        </w:tblBorders>
+      </w:tblPr>
+      <w:tblGrid>
+        <w:gridCol w:w="2506"/>
+        <w:gridCol w:w="7132"/>
+      </w:tblGrid>
+      <w:tr>
+        <w:trPr>
+          <w:cantSplit/>
+          <w:tblHeader/>
+        </w:trPr>
+        <w:tc>
+          <w:tcPr>
+            <w:tcW w:type="dxa" w:w="2506"/>
+            <w:tcBorders>
+              <w:top w:val="single" w:color="C9B8A0" w:sz="4"/>
+              <w:left w:val="single" w:color="C9B8A0" w:sz="4"/>
+              <w:bottom w:val="single" w:color="C9B8A0" w:sz="4"/>
+              <w:right w:val="single" w:color="C9B8A0" w:sz="4"/>
+            </w:tcBorders>
+            <w:shd w:fill="5A3A1A" w:color="auto" w:val="clear"/>
+            <w:tcMar>
+              <w:top w:type="dxa" w:w="60"/>
+              <w:left w:type="dxa" w:w="100"/>
+              <w:bottom w:type="dxa" w:w="60"/>
+              <w:right w:type="dxa" w:w="100"/>
+            </w:tcMar>
+            <w:vAlign w:val="center"/>
+          </w:tcPr>
+          <w:p>
+            <w:pPr>
+              <w:keepNext/>
+            </w:pPr>
+            <w:r>
+              <w:rPr>
+                <w:b/>
+                <w:bCs/>
+                <w:color w:val="FFFFFF"/>
+                <w:sz w:val="19"/>
+                <w:szCs w:val="19"/>
+              </w:rPr>
+              <w:t xml:space="preserve">Campo</w:t>
+            </w:r>
+          </w:p>
+        </w:tc>
+        <w:tc>
+          <w:tcPr>
+            <w:tcW w:type="dxa" w:w="7132"/>
+            <w:tcBorders>
+              <w:top w:val="single" w:color="C9B8A0" w:sz="4"/>
+              <w:left w:val="single" w:color="C9B8A0" w:sz="4"/>
+              <w:bottom w:val="single" w:color="C9B8A0" w:sz="4"/>
+              <w:right w:val="single" w:color="C9B8A0" w:sz="4"/>
+            </w:tcBorders>
+            <w:shd w:fill="5A3A1A" w:color="auto" w:val="clear"/>
+            <w:tcMar>
+              <w:top w:type="dxa" w:w="60"/>
+              <w:left w:type="dxa" w:w="100"/>
+              <w:bottom w:type="dxa" w:w="60"/>
+              <w:right w:type="dxa" w:w="100"/>
+            </w:tcMar>
+            <w:vAlign w:val="center"/>
+          </w:tcPr>
+          <w:p>
+            <w:pPr>
+              <w:keepNext/>
+            </w:pPr>
+            <w:r>
+              <w:rPr>
+                <w:b/>
+                <w:bCs/>
+                <w:color w:val="FFFFFF"/>
+                <w:sz w:val="19"/>
+                <w:szCs w:val="19"/>
+              </w:rPr>
+              <w:t xml:space="preserve">Descrição</w:t>
+            </w:r>
+          </w:p>
+        </w:tc>
+      </w:tr>
+      <w:tr>
+        <w:trPr>
+          <w:cantSplit/>
+        </w:trPr>
+        <w:tc>
+          <w:tcPr>
+            <w:tcW w:type="dxa" w:w="2506"/>
+            <w:tcBorders>
+              <w:top w:val="single" w:color="C9B8A0" w:sz="4"/>
+              <w:left w:val="single" w:color="C9B8A0" w:sz="4"/>
+              <w:bottom w:val="single" w:color="C9B8A0" w:sz="4"/>
+              <w:right w:val="single" w:color="C9B8A0" w:sz="4"/>
+            </w:tcBorders>
+            <w:tcMar>
+              <w:top w:type="dxa" w:w="60"/>
+              <w:left w:type="dxa" w:w="100"/>
+              <w:bottom w:type="dxa" w:w="60"/>
+              <w:right w:type="dxa" w:w="100"/>
+            </w:tcMar>
+            <w:vAlign w:val="center"/>
+          </w:tcPr>
+          <w:p>
+            <w:pPr>
+              <w:keepNext/>
+            </w:pPr>
+            <w:r>
+              <w:rPr>
+                <w:sz w:val="19"/>
+                <w:szCs w:val="19"/>
+              </w:rPr>
+              <w:t xml:space="preserve">Aparência</w:t>
+            </w:r>
+          </w:p>
+        </w:tc>
+        <w:tc>
+          <w:tcPr>
+            <w:tcW w:type="dxa" w:w="7132"/>
+            <w:tcBorders>
+              <w:top w:val="single" w:color="C9B8A0" w:sz="4"/>
+              <w:left w:val="single" w:color="C9B8A0" w:sz="4"/>
+              <w:bottom w:val="single" w:color="C9B8A0" w:sz="4"/>
+              <w:right w:val="single" w:color="C9B8A0" w:sz="4"/>
+            </w:tcBorders>
+            <w:tcMar>
+              <w:top w:type="dxa" w:w="60"/>
+              <w:left w:type="dxa" w:w="100"/>
+              <w:bottom w:type="dxa" w:w="60"/>
+              <w:right w:type="dxa" w:w="100"/>
+            </w:tcMar>
+            <w:vAlign w:val="center"/>
+          </w:tcPr>
+          <w:p>
+            <w:pPr>
+              <w:keepNext/>
+            </w:pPr>
+            <w:r>
+              <w:rPr>
+                <w:sz w:val="19"/>
+                <w:szCs w:val="19"/>
+              </w:rPr>
+              <w:t xml:space="preserve">Baixo e robusto, careca com costeletas brancas, avental de couro chamuscado, braço esquerdo mecânico antigo, cachimbo apagado</w:t>
+            </w:r>
+          </w:p>
+        </w:tc>
+      </w:tr>
+      <w:tr>
+        <w:trPr>
+          <w:cantSplit/>
+        </w:trPr>
+        <w:tc>
+          <w:tcPr>
+            <w:tcW w:type="dxa" w:w="2506"/>
+            <w:tcBorders>
+              <w:top w:val="single" w:color="C9B8A0" w:sz="4"/>
+              <w:left w:val="single" w:color="C9B8A0" w:sz="4"/>
+              <w:bottom w:val="single" w:color="C9B8A0" w:sz="4"/>
+              <w:right w:val="single" w:color="C9B8A0" w:sz="4"/>
+            </w:tcBorders>
+            <w:tcMar>
+              <w:top w:type="dxa" w:w="60"/>
+              <w:left w:type="dxa" w:w="100"/>
+              <w:bottom w:type="dxa" w:w="60"/>
+              <w:right w:type="dxa" w:w="100"/>
+            </w:tcMar>
+            <w:vAlign w:val="center"/>
+          </w:tcPr>
+          <w:p>
+            <w:pPr>
+              <w:keepNext/>
+            </w:pPr>
+            <w:r>
+              <w:rPr>
+                <w:sz w:val="19"/>
+                <w:szCs w:val="19"/>
+              </w:rPr>
+              <w:t xml:space="preserve">Personalidade</w:t>
+            </w:r>
+          </w:p>
+        </w:tc>
+        <w:tc>
+          <w:tcPr>
+            <w:tcW w:type="dxa" w:w="7132"/>
+            <w:tcBorders>
+              <w:top w:val="single" w:color="C9B8A0" w:sz="4"/>
+              <w:left w:val="single" w:color="C9B8A0" w:sz="4"/>
+              <w:bottom w:val="single" w:color="C9B8A0" w:sz="4"/>
+              <w:right w:val="single" w:color="C9B8A0" w:sz="4"/>
+            </w:tcBorders>
+            <w:tcMar>
+              <w:top w:type="dxa" w:w="60"/>
+              <w:left w:type="dxa" w:w="100"/>
+              <w:bottom w:type="dxa" w:w="60"/>
+              <w:right w:type="dxa" w:w="100"/>
+            </w:tcMar>
+            <w:vAlign w:val="center"/>
+          </w:tcPr>
+          <w:p>
+            <w:pPr>
+              <w:keepNext/>
+            </w:pPr>
+            <w:r>
+              <w:rPr>
+                <w:sz w:val="19"/>
+                <w:szCs w:val="19"/>
+              </w:rPr>
+              <w:t xml:space="preserve">Rabugento, sábio, carinhoso de um jeito desajeitado; fala com as máquinas como se fossem pessoas</w:t>
+            </w:r>
+          </w:p>
+        </w:tc>
+      </w:tr>
+      <w:tr>
+        <w:trPr>
+          <w:cantSplit/>
+        </w:trPr>
+        <w:tc>
+          <w:tcPr>
+            <w:tcW w:type="dxa" w:w="2506"/>
+            <w:tcBorders>
+              <w:top w:val="single" w:color="C9B8A0" w:sz="4"/>
+              <w:left w:val="single" w:color="C9B8A0" w:sz="4"/>
+              <w:bottom w:val="single" w:color="C9B8A0" w:sz="4"/>
+              <w:right w:val="single" w:color="C9B8A0" w:sz="4"/>
+            </w:tcBorders>
+            <w:tcMar>
+              <w:top w:type="dxa" w:w="60"/>
+              <w:left w:type="dxa" w:w="100"/>
+              <w:bottom w:type="dxa" w:w="60"/>
+              <w:right w:type="dxa" w:w="100"/>
+            </w:tcMar>
+            <w:vAlign w:val="center"/>
+          </w:tcPr>
+          <w:p>
+            <w:pPr>
+              <w:keepNext/>
+            </w:pPr>
+            <w:r>
+              <w:rPr>
+                <w:sz w:val="19"/>
+                <w:szCs w:val="19"/>
+              </w:rPr>
+              <w:t xml:space="preserve">Papel</w:t>
+            </w:r>
+          </w:p>
+        </w:tc>
+        <w:tc>
+          <w:tcPr>
+            <w:tcW w:type="dxa" w:w="7132"/>
+            <w:tcBorders>
+              <w:top w:val="single" w:color="C9B8A0" w:sz="4"/>
+              <w:left w:val="single" w:color="C9B8A0" w:sz="4"/>
+              <w:bottom w:val="single" w:color="C9B8A0" w:sz="4"/>
+              <w:right w:val="single" w:color="C9B8A0" w:sz="4"/>
+            </w:tcBorders>
+            <w:tcMar>
+              <w:top w:type="dxa" w:w="60"/>
+              <w:left w:type="dxa" w:w="100"/>
+              <w:bottom w:type="dxa" w:w="60"/>
+              <w:right w:type="dxa" w:w="100"/>
+            </w:tcMar>
+            <w:vAlign w:val="center"/>
+          </w:tcPr>
+          <w:p>
+            <w:pPr>
+              <w:keepNext/>
+            </w:pPr>
+            <w:r>
+              <w:rPr>
+                <w:sz w:val="19"/>
+                <w:szCs w:val="19"/>
+              </w:rPr>
+              <w:t xml:space="preserve">Criou Kael como neto. Ex-engenheiro imperial que fugiu ao perceber para que servia o Éter</w:t>
+            </w:r>
+          </w:p>
+        </w:tc>
+      </w:tr>
+      <w:tr>
+        <w:trPr>
+          <w:cantSplit/>
+        </w:trPr>
+        <w:tc>
+          <w:tcPr>
+            <w:tcW w:type="dxa" w:w="2506"/>
+            <w:tcBorders>
+              <w:top w:val="single" w:color="C9B8A0" w:sz="4"/>
+              <w:left w:val="single" w:color="C9B8A0" w:sz="4"/>
+              <w:bottom w:val="single" w:color="C9B8A0" w:sz="4"/>
+              <w:right w:val="single" w:color="C9B8A0" w:sz="4"/>
+            </w:tcBorders>
+            <w:tcMar>
+              <w:top w:type="dxa" w:w="60"/>
+              <w:left w:type="dxa" w:w="100"/>
+              <w:bottom w:type="dxa" w:w="60"/>
+              <w:right w:type="dxa" w:w="100"/>
+            </w:tcMar>
+            <w:vAlign w:val="center"/>
+          </w:tcPr>
+          <w:p>
+            <w:pPr>
+              <w:keepNext/>
+            </w:pPr>
+            <w:r>
+              <w:rPr>
+                <w:sz w:val="19"/>
+                <w:szCs w:val="19"/>
+              </w:rPr>
+              <w:t xml:space="preserve">Segredo</w:t>
+            </w:r>
+          </w:p>
+        </w:tc>
+        <w:tc>
+          <w:tcPr>
+            <w:tcW w:type="dxa" w:w="7132"/>
+            <w:tcBorders>
+              <w:top w:val="single" w:color="C9B8A0" w:sz="4"/>
+              <w:left w:val="single" w:color="C9B8A0" w:sz="4"/>
+              <w:bottom w:val="single" w:color="C9B8A0" w:sz="4"/>
+              <w:right w:val="single" w:color="C9B8A0" w:sz="4"/>
+            </w:tcBorders>
+            <w:tcMar>
+              <w:top w:type="dxa" w:w="60"/>
+              <w:left w:type="dxa" w:w="100"/>
+              <w:bottom w:type="dxa" w:w="60"/>
+              <w:right w:type="dxa" w:w="100"/>
+            </w:tcMar>
+            <w:vAlign w:val="center"/>
+          </w:tcPr>
+          <w:p>
+            <w:pPr>
+              <w:keepNext/>
+            </w:pPr>
+            <w:r>
+              <w:rPr>
+                <w:sz w:val="19"/>
+                <w:szCs w:val="19"/>
+              </w:rPr>
+              <w:t xml:space="preserve">Sabe da linhagem aetheliana de Kael e escondeu Eco no ferro-velho há anos</w:t>
+            </w:r>
+          </w:p>
+        </w:tc>
+      </w:tr>
+      <w:tr>
+        <w:trPr>
+          <w:cantSplit/>
+        </w:trPr>
+        <w:tc>
+          <w:tcPr>
+            <w:tcW w:type="dxa" w:w="2506"/>
+            <w:tcBorders>
+              <w:top w:val="single" w:color="C9B8A0" w:sz="4"/>
+              <w:left w:val="single" w:color="C9B8A0" w:sz="4"/>
+              <w:bottom w:val="single" w:color="C9B8A0" w:sz="4"/>
+              <w:right w:val="single" w:color="C9B8A0" w:sz="4"/>
+            </w:tcBorders>
+            <w:tcMar>
+              <w:top w:type="dxa" w:w="60"/>
+              <w:left w:type="dxa" w:w="100"/>
+              <w:bottom w:type="dxa" w:w="60"/>
+              <w:right w:type="dxa" w:w="100"/>
+            </w:tcMar>
+            <w:vAlign w:val="center"/>
+          </w:tcPr>
+          <w:p>
+            <w:pPr>
+              <w:keepNext/>
+            </w:pPr>
+            <w:r>
+              <w:rPr>
+                <w:sz w:val="19"/>
+                <w:szCs w:val="19"/>
+              </w:rPr>
+              <w:t xml:space="preserve">Prólogo</w:t>
+            </w:r>
+          </w:p>
+        </w:tc>
+        <w:tc>
+          <w:tcPr>
+            <w:tcW w:type="dxa" w:w="7132"/>
+            <w:tcBorders>
+              <w:top w:val="single" w:color="C9B8A0" w:sz="4"/>
+              <w:left w:val="single" w:color="C9B8A0" w:sz="4"/>
+              <w:bottom w:val="single" w:color="C9B8A0" w:sz="4"/>
+              <w:right w:val="single" w:color="C9B8A0" w:sz="4"/>
+            </w:tcBorders>
+            <w:tcMar>
+              <w:top w:type="dxa" w:w="60"/>
+              <w:left w:type="dxa" w:w="100"/>
+              <w:bottom w:type="dxa" w:w="60"/>
+              <w:right w:type="dxa" w:w="100"/>
+            </w:tcMar>
+            <w:vAlign w:val="center"/>
+          </w:tcPr>
+          <w:p>
+            <w:pPr>
+              <w:keepNext/>
+            </w:pPr>
+            <w:r>
+              <w:rPr>
+                <w:sz w:val="19"/>
+                <w:szCs w:val="19"/>
+              </w:rPr>
+              <w:t xml:space="preserve">"Morre" na explosão da oficina, segurando os soldados para Kael e Eco fugirem</w:t>
+            </w:r>
+          </w:p>
+        </w:tc>
+      </w:tr>
+      <w:tr>
+        <w:trPr>
+          <w:cantSplit/>
+        </w:trPr>
+        <w:tc>
+          <w:tcPr>
+            <w:tcW w:type="dxa" w:w="2506"/>
+            <w:tcBorders>
+              <w:top w:val="single" w:color="C9B8A0" w:sz="4"/>
+              <w:left w:val="single" w:color="C9B8A0" w:sz="4"/>
+              <w:bottom w:val="single" w:color="C9B8A0" w:sz="4"/>
+              <w:right w:val="single" w:color="C9B8A0" w:sz="4"/>
+            </w:tcBorders>
+            <w:tcMar>
+              <w:top w:type="dxa" w:w="60"/>
+              <w:left w:type="dxa" w:w="100"/>
+              <w:bottom w:type="dxa" w:w="60"/>
+              <w:right w:type="dxa" w:w="100"/>
+            </w:tcMar>
+            <w:vAlign w:val="center"/>
+          </w:tcPr>
+          <w:p>
+            <w:pPr>
+              <w:keepNext/>
+            </w:pPr>
+            <w:r>
+              <w:rPr>
+                <w:sz w:val="19"/>
+                <w:szCs w:val="19"/>
+              </w:rPr>
+              <w:t xml:space="preserve">Verdade</w:t>
+            </w:r>
+          </w:p>
+        </w:tc>
+        <w:tc>
+          <w:tcPr>
+            <w:tcW w:type="dxa" w:w="7132"/>
+            <w:tcBorders>
+              <w:top w:val="single" w:color="C9B8A0" w:sz="4"/>
+              <w:left w:val="single" w:color="C9B8A0" w:sz="4"/>
+              <w:bottom w:val="single" w:color="C9B8A0" w:sz="4"/>
+              <w:right w:val="single" w:color="C9B8A0" w:sz="4"/>
+            </w:tcBorders>
+            <w:tcMar>
+              <w:top w:type="dxa" w:w="60"/>
+              <w:left w:type="dxa" w:w="100"/>
+              <w:bottom w:type="dxa" w:w="60"/>
+              <w:right w:type="dxa" w:w="100"/>
+            </w:tcMar>
+            <w:vAlign w:val="center"/>
+          </w:tcPr>
+          <w:p>
+            <w:pPr>
+              <w:keepNext/>
+            </w:pPr>
+            <w:r>
+              <w:rPr>
+                <w:sz w:val="19"/>
+                <w:szCs w:val="19"/>
+              </w:rPr>
+              <w:t xml:space="preserve">Sobreviveu; Voss o levou para Brasaforte e o obrigou a completar o Coração — por isso o Império conseguiu terminá-lo</w:t>
+            </w:r>
+          </w:p>
+        </w:tc>
+      </w:tr>
+      <w:tr>
+        <w:trPr>
+          <w:cantSplit/>
+        </w:trPr>
+        <w:tc>
+          <w:tcPr>
+            <w:tcW w:type="dxa" w:w="2506"/>
+            <w:tcBorders>
+              <w:top w:val="single" w:color="C9B8A0" w:sz="4"/>
+              <w:left w:val="single" w:color="C9B8A0" w:sz="4"/>
+              <w:bottom w:val="single" w:color="C9B8A0" w:sz="4"/>
+              <w:right w:val="single" w:color="C9B8A0" w:sz="4"/>
+            </w:tcBorders>
+            <w:tcMar>
+              <w:top w:type="dxa" w:w="60"/>
+              <w:left w:type="dxa" w:w="100"/>
+              <w:bottom w:type="dxa" w:w="60"/>
+              <w:right w:type="dxa" w:w="100"/>
+            </w:tcMar>
+            <w:vAlign w:val="center"/>
+          </w:tcPr>
+          <w:p>
+            <w:pPr>
+              <w:keepNext/>
+            </w:pPr>
+            <w:r>
+              <w:rPr>
+                <w:sz w:val="19"/>
+                <w:szCs w:val="19"/>
+              </w:rPr>
+              <w:t xml:space="preserve">Ato 2</w:t>
+            </w:r>
+          </w:p>
+        </w:tc>
+        <w:tc>
+          <w:tcPr>
+            <w:tcW w:type="dxa" w:w="7132"/>
+            <w:tcBorders>
+              <w:top w:val="single" w:color="C9B8A0" w:sz="4"/>
+              <w:left w:val="single" w:color="C9B8A0" w:sz="4"/>
+              <w:bottom w:val="single" w:color="C9B8A0" w:sz="4"/>
+              <w:right w:val="single" w:color="C9B8A0" w:sz="4"/>
+            </w:tcBorders>
+            <w:tcMar>
+              <w:top w:type="dxa" w:w="60"/>
+              <w:left w:type="dxa" w:w="100"/>
+              <w:bottom w:type="dxa" w:w="60"/>
+              <w:right w:type="dxa" w:w="100"/>
+            </w:tcMar>
+            <w:vAlign w:val="center"/>
+          </w:tcPr>
+          <w:p>
+            <w:pPr>
+              <w:keepNext/>
+            </w:pPr>
+            <w:r>
+              <w:rPr>
+                <w:sz w:val="19"/>
+                <w:szCs w:val="19"/>
+              </w:rPr>
+              <w:t xml:space="preserve">Pista: Isolde fala de "um velho prisioneiro que conversa com as engrenagens"; o grupo não o encontra</w:t>
+            </w:r>
+          </w:p>
+        </w:tc>
+      </w:tr>
+      <w:tr>
+        <w:trPr>
+          <w:cantSplit/>
+        </w:trPr>
+        <w:tc>
+          <w:tcPr>
+            <w:tcW w:type="dxa" w:w="2506"/>
+            <w:tcBorders>
+              <w:top w:val="single" w:color="C9B8A0" w:sz="4"/>
+              <w:left w:val="single" w:color="C9B8A0" w:sz="4"/>
+              <w:bottom w:val="single" w:color="C9B8A0" w:sz="4"/>
+              <w:right w:val="single" w:color="C9B8A0" w:sz="4"/>
+            </w:tcBorders>
+            <w:tcMar>
+              <w:top w:type="dxa" w:w="60"/>
+              <w:left w:type="dxa" w:w="100"/>
+              <w:bottom w:type="dxa" w:w="60"/>
+              <w:right w:type="dxa" w:w="100"/>
+            </w:tcMar>
+            <w:vAlign w:val="center"/>
+          </w:tcPr>
+          <w:p>
+            <w:pPr>
+              <w:keepNext/>
+            </w:pPr>
+            <w:r>
+              <w:rPr>
+                <w:sz w:val="19"/>
+                <w:szCs w:val="19"/>
+              </w:rPr>
+              <w:t xml:space="preserve">Ato 3</w:t>
+            </w:r>
+          </w:p>
+        </w:tc>
+        <w:tc>
+          <w:tcPr>
+            <w:tcW w:type="dxa" w:w="7132"/>
+            <w:tcBorders>
+              <w:top w:val="single" w:color="C9B8A0" w:sz="4"/>
+              <w:left w:val="single" w:color="C9B8A0" w:sz="4"/>
+              <w:bottom w:val="single" w:color="C9B8A0" w:sz="4"/>
+              <w:right w:val="single" w:color="C9B8A0" w:sz="4"/>
+            </w:tcBorders>
+            <w:tcMar>
+              <w:top w:type="dxa" w:w="60"/>
+              <w:left w:type="dxa" w:w="100"/>
+              <w:bottom w:type="dxa" w:w="60"/>
+              <w:right w:type="dxa" w:w="100"/>
+            </w:tcMar>
+            <w:vAlign w:val="center"/>
+          </w:tcPr>
+          <w:p>
+            <w:pPr>
+              <w:keepNext/>
+            </w:pPr>
+            <w:r>
+              <w:rPr>
+                <w:sz w:val="19"/>
+                <w:szCs w:val="19"/>
+              </w:rPr>
+              <w:t xml:space="preserve">Reaparece no mundo partido; melhora o dirigível Andorinha, guia o grupo até Aethel e sabe como abrir o Coração. Personagem convidado em algumas batalhas</w:t>
+            </w:r>
+          </w:p>
+        </w:tc>
+      </w:tr>
+      <w:tr>
+        <w:trPr>
+          <w:cantSplit/>
+        </w:trPr>
+        <w:tc>
+          <w:tcPr>
+            <w:tcW w:type="dxa" w:w="2506"/>
+            <w:tcBorders>
+              <w:top w:val="single" w:color="C9B8A0" w:sz="4"/>
+              <w:left w:val="single" w:color="C9B8A0" w:sz="4"/>
+              <w:bottom w:val="single" w:color="C9B8A0" w:sz="4"/>
+              <w:right w:val="single" w:color="C9B8A0" w:sz="4"/>
+            </w:tcBorders>
+            <w:tcMar>
+              <w:top w:type="dxa" w:w="60"/>
+              <w:left w:type="dxa" w:w="100"/>
+              <w:bottom w:type="dxa" w:w="60"/>
+              <w:right w:type="dxa" w:w="100"/>
+            </w:tcMar>
+            <w:vAlign w:val="center"/>
+          </w:tcPr>
+          <w:p>
+            <w:pPr>
+              <w:keepNext w:val="false"/>
+            </w:pPr>
+            <w:r>
+              <w:rPr>
+                <w:sz w:val="19"/>
+                <w:szCs w:val="19"/>
+              </w:rPr>
+              <w:t xml:space="preserve">Combate (convidado)</w:t>
+            </w:r>
+          </w:p>
+        </w:tc>
+        <w:tc>
+          <w:tcPr>
+            <w:tcW w:type="dxa" w:w="7132"/>
+            <w:tcBorders>
+              <w:top w:val="single" w:color="C9B8A0" w:sz="4"/>
+              <w:left w:val="single" w:color="C9B8A0" w:sz="4"/>
+              <w:bottom w:val="single" w:color="C9B8A0" w:sz="4"/>
+              <w:right w:val="single" w:color="C9B8A0" w:sz="4"/>
+            </w:tcBorders>
+            <w:tcMar>
+              <w:top w:type="dxa" w:w="60"/>
+              <w:left w:type="dxa" w:w="100"/>
+              <w:bottom w:type="dxa" w:w="60"/>
+              <w:right w:type="dxa" w:w="100"/>
+            </w:tcMar>
+            <w:vAlign w:val="center"/>
+          </w:tcPr>
+          <w:p>
+            <w:pPr>
+              <w:keepNext w:val="false"/>
+            </w:pPr>
+            <w:r>
+              <w:rPr>
+                <w:sz w:val="19"/>
+                <w:szCs w:val="19"/>
+              </w:rPr>
+              <w:t xml:space="preserve">Bombas de oficina, reparo de aliados mecânicos (Eco, torretas de Isolde)</w:t>
+            </w:r>
+          </w:p>
+        </w:tc>
+      </w:tr>
+    </w:tbl>
+    <w:p>
+      <w:pPr>
+        <w:spacing w:after="120"/>
+      </w:pPr>
+    </w:p>
+    <w:p>
+      <w:pPr>
+        <w:pStyle w:val="Heading2"/>
+      </w:pPr>
+      <w:r>
+        <w:t xml:space="preserve">Triângulo amoroso: Kael, Lyra e Isolde</w:t>
+      </w:r>
+    </w:p>
+    <w:p>
+      <w:pPr>
+        <w:keepNext w:val="false"/>
+        <w:spacing w:after="120"/>
+      </w:pPr>
+      <w:r>
+        <w:t xml:space="preserve">O romance espelha o tema central: </w:t>
+      </w:r>
+      <w:r>
+        <w:rPr>
+          <w:b/>
+          <w:bCs/>
+        </w:rPr>
+        <w:t xml:space="preserve">Lyra</w:t>
+      </w:r>
+      <w:r>
+        <w:t xml:space="preserve"> representa a magia e a natureza; </w:t>
+      </w:r>
+      <w:r>
+        <w:rPr>
+          <w:b/>
+          <w:bCs/>
+        </w:rPr>
+        <w:t xml:space="preserve">Isolde</w:t>
+      </w:r>
+      <w:r>
+        <w:t xml:space="preserve">, a tecnologia e o progresso. A escolha do jogador não é "certa" ou "errada" — ela muda o epílogo e o tom do final.</w:t>
+      </w:r>
+    </w:p>
+    <w:tbl>
+      <w:tblPr>
+        <w:tblW w:type="dxa" w:w="9638"/>
+        <w:tblBorders>
+          <w:top w:val="single" w:color="auto" w:sz="4"/>
+          <w:left w:val="single" w:color="auto" w:sz="4"/>
+          <w:bottom w:val="single" w:color="auto" w:sz="4"/>
+          <w:right w:val="single" w:color="auto" w:sz="4"/>
+          <w:insideH w:val="single" w:color="auto" w:sz="4"/>
+          <w:insideV w:val="single" w:color="auto" w:sz="4"/>
+        </w:tblBorders>
+      </w:tblPr>
+      <w:tblGrid>
+        <w:gridCol w:w="2410"/>
+        <w:gridCol w:w="7228"/>
+      </w:tblGrid>
+      <w:tr>
+        <w:trPr>
+          <w:cantSplit/>
+          <w:tblHeader/>
+        </w:trPr>
+        <w:tc>
+          <w:tcPr>
+            <w:tcW w:type="dxa" w:w="2410"/>
+            <w:tcBorders>
+              <w:top w:val="single" w:color="C9B8A0" w:sz="4"/>
+              <w:left w:val="single" w:color="C9B8A0" w:sz="4"/>
+              <w:bottom w:val="single" w:color="C9B8A0" w:sz="4"/>
+              <w:right w:val="single" w:color="C9B8A0" w:sz="4"/>
+            </w:tcBorders>
+            <w:shd w:fill="5A3A1A" w:color="auto" w:val="clear"/>
+            <w:tcMar>
+              <w:top w:type="dxa" w:w="60"/>
+              <w:left w:type="dxa" w:w="100"/>
+              <w:bottom w:type="dxa" w:w="60"/>
+              <w:right w:type="dxa" w:w="100"/>
+            </w:tcMar>
+            <w:vAlign w:val="center"/>
+          </w:tcPr>
+          <w:p>
+            <w:pPr>
+              <w:keepNext/>
+            </w:pPr>
+            <w:r>
+              <w:rPr>
+                <w:b/>
+                <w:bCs/>
+                <w:color w:val="FFFFFF"/>
+                <w:sz w:val="19"/>
+                <w:szCs w:val="19"/>
+              </w:rPr>
+              <w:t xml:space="preserve">Elemento</w:t>
+            </w:r>
+          </w:p>
+        </w:tc>
+        <w:tc>
+          <w:tcPr>
+            <w:tcW w:type="dxa" w:w="7228"/>
+            <w:tcBorders>
+              <w:top w:val="single" w:color="C9B8A0" w:sz="4"/>
+              <w:left w:val="single" w:color="C9B8A0" w:sz="4"/>
+              <w:bottom w:val="single" w:color="C9B8A0" w:sz="4"/>
+              <w:right w:val="single" w:color="C9B8A0" w:sz="4"/>
+            </w:tcBorders>
+            <w:shd w:fill="5A3A1A" w:color="auto" w:val="clear"/>
+            <w:tcMar>
+              <w:top w:type="dxa" w:w="60"/>
+              <w:left w:type="dxa" w:w="100"/>
+              <w:bottom w:type="dxa" w:w="60"/>
+              <w:right w:type="dxa" w:w="100"/>
+            </w:tcMar>
+            <w:vAlign w:val="center"/>
+          </w:tcPr>
+          <w:p>
+            <w:pPr>
+              <w:keepNext/>
+            </w:pPr>
+            <w:r>
+              <w:rPr>
+                <w:b/>
+                <w:bCs/>
+                <w:color w:val="FFFFFF"/>
+                <w:sz w:val="19"/>
+                <w:szCs w:val="19"/>
+              </w:rPr>
+              <w:t xml:space="preserve">Como funciona</w:t>
+            </w:r>
+          </w:p>
+        </w:tc>
+      </w:tr>
+      <w:tr>
+        <w:trPr>
+          <w:cantSplit/>
+        </w:trPr>
+        <w:tc>
+          <w:tcPr>
+            <w:tcW w:type="dxa" w:w="2410"/>
+            <w:tcBorders>
+              <w:top w:val="single" w:color="C9B8A0" w:sz="4"/>
+              <w:left w:val="single" w:color="C9B8A0" w:sz="4"/>
+              <w:bottom w:val="single" w:color="C9B8A0" w:sz="4"/>
+              <w:right w:val="single" w:color="C9B8A0" w:sz="4"/>
+            </w:tcBorders>
+            <w:tcMar>
+              <w:top w:type="dxa" w:w="60"/>
+              <w:left w:type="dxa" w:w="100"/>
+              <w:bottom w:type="dxa" w:w="60"/>
+              <w:right w:type="dxa" w:w="100"/>
+            </w:tcMar>
+            <w:vAlign w:val="center"/>
+          </w:tcPr>
+          <w:p>
+            <w:pPr>
+              <w:keepNext/>
+            </w:pPr>
+            <w:r>
+              <w:rPr>
+                <w:sz w:val="19"/>
+                <w:szCs w:val="19"/>
+              </w:rPr>
+              <w:t xml:space="preserve">Afinidade</w:t>
+            </w:r>
+          </w:p>
+        </w:tc>
+        <w:tc>
+          <w:tcPr>
+            <w:tcW w:type="dxa" w:w="7228"/>
+            <w:tcBorders>
+              <w:top w:val="single" w:color="C9B8A0" w:sz="4"/>
+              <w:left w:val="single" w:color="C9B8A0" w:sz="4"/>
+              <w:bottom w:val="single" w:color="C9B8A0" w:sz="4"/>
+              <w:right w:val="single" w:color="C9B8A0" w:sz="4"/>
+            </w:tcBorders>
+            <w:tcMar>
+              <w:top w:type="dxa" w:w="60"/>
+              <w:left w:type="dxa" w:w="100"/>
+              <w:bottom w:type="dxa" w:w="60"/>
+              <w:right w:type="dxa" w:w="100"/>
+            </w:tcMar>
+            <w:vAlign w:val="center"/>
+          </w:tcPr>
+          <w:p>
+            <w:pPr>
+              <w:keepNext/>
+            </w:pPr>
+            <w:r>
+              <w:rPr>
+                <w:sz w:val="19"/>
+                <w:szCs w:val="19"/>
+              </w:rPr>
+              <w:t xml:space="preserve">Valor oculto com Lyra e com Isolde (e com o resto do grupo). Sobe e desce com escolhas de diálogo e ações</w:t>
+            </w:r>
+          </w:p>
+        </w:tc>
+      </w:tr>
+      <w:tr>
+        <w:trPr>
+          <w:cantSplit/>
+        </w:trPr>
+        <w:tc>
+          <w:tcPr>
+            <w:tcW w:type="dxa" w:w="2410"/>
+            <w:tcBorders>
+              <w:top w:val="single" w:color="C9B8A0" w:sz="4"/>
+              <w:left w:val="single" w:color="C9B8A0" w:sz="4"/>
+              <w:bottom w:val="single" w:color="C9B8A0" w:sz="4"/>
+              <w:right w:val="single" w:color="C9B8A0" w:sz="4"/>
+            </w:tcBorders>
+            <w:tcMar>
+              <w:top w:type="dxa" w:w="60"/>
+              <w:left w:type="dxa" w:w="100"/>
+              <w:bottom w:type="dxa" w:w="60"/>
+              <w:right w:type="dxa" w:w="100"/>
+            </w:tcMar>
+            <w:vAlign w:val="center"/>
+          </w:tcPr>
+          <w:p>
+            <w:pPr>
+              <w:keepNext/>
+            </w:pPr>
+            <w:r>
+              <w:rPr>
+                <w:sz w:val="19"/>
+                <w:szCs w:val="19"/>
+              </w:rPr>
+              <w:t xml:space="preserve">Momentos-chave</w:t>
+            </w:r>
+          </w:p>
+        </w:tc>
+        <w:tc>
+          <w:tcPr>
+            <w:tcW w:type="dxa" w:w="7228"/>
+            <w:tcBorders>
+              <w:top w:val="single" w:color="C9B8A0" w:sz="4"/>
+              <w:left w:val="single" w:color="C9B8A0" w:sz="4"/>
+              <w:bottom w:val="single" w:color="C9B8A0" w:sz="4"/>
+              <w:right w:val="single" w:color="C9B8A0" w:sz="4"/>
+            </w:tcBorders>
+            <w:tcMar>
+              <w:top w:type="dxa" w:w="60"/>
+              <w:left w:type="dxa" w:w="100"/>
+              <w:bottom w:type="dxa" w:w="60"/>
+              <w:right w:type="dxa" w:w="100"/>
+            </w:tcMar>
+            <w:vAlign w:val="center"/>
+          </w:tcPr>
+          <w:p>
+            <w:pPr>
+              <w:keepNext/>
+            </w:pPr>
+            <w:r>
+              <w:rPr>
+                <w:sz w:val="19"/>
+                <w:szCs w:val="19"/>
+              </w:rPr>
+              <w:t xml:space="preserve">4–5 cenas com escolhas marcantes (ex.: noite no convés da Andorinha no Ato 2, a escolha de quem salvar primeiro no colapso do Coração)</w:t>
+            </w:r>
+          </w:p>
+        </w:tc>
+      </w:tr>
+      <w:tr>
+        <w:trPr>
+          <w:cantSplit/>
+        </w:trPr>
+        <w:tc>
+          <w:tcPr>
+            <w:tcW w:type="dxa" w:w="2410"/>
+            <w:tcBorders>
+              <w:top w:val="single" w:color="C9B8A0" w:sz="4"/>
+              <w:left w:val="single" w:color="C9B8A0" w:sz="4"/>
+              <w:bottom w:val="single" w:color="C9B8A0" w:sz="4"/>
+              <w:right w:val="single" w:color="C9B8A0" w:sz="4"/>
+            </w:tcBorders>
+            <w:tcMar>
+              <w:top w:type="dxa" w:w="60"/>
+              <w:left w:type="dxa" w:w="100"/>
+              <w:bottom w:type="dxa" w:w="60"/>
+              <w:right w:type="dxa" w:w="100"/>
+            </w:tcMar>
+            <w:vAlign w:val="center"/>
+          </w:tcPr>
+          <w:p>
+            <w:pPr>
+              <w:keepNext/>
+            </w:pPr>
+            <w:r>
+              <w:rPr>
+                <w:sz w:val="19"/>
+                <w:szCs w:val="19"/>
+              </w:rPr>
+              <w:t xml:space="preserve">Tensão entre as duas</w:t>
+            </w:r>
+          </w:p>
+        </w:tc>
+        <w:tc>
+          <w:tcPr>
+            <w:tcW w:type="dxa" w:w="7228"/>
+            <w:tcBorders>
+              <w:top w:val="single" w:color="C9B8A0" w:sz="4"/>
+              <w:left w:val="single" w:color="C9B8A0" w:sz="4"/>
+              <w:bottom w:val="single" w:color="C9B8A0" w:sz="4"/>
+              <w:right w:val="single" w:color="C9B8A0" w:sz="4"/>
+            </w:tcBorders>
+            <w:tcMar>
+              <w:top w:type="dxa" w:w="60"/>
+              <w:left w:type="dxa" w:w="100"/>
+              <w:bottom w:type="dxa" w:w="60"/>
+              <w:right w:type="dxa" w:w="100"/>
+            </w:tcMar>
+            <w:vAlign w:val="center"/>
+          </w:tcPr>
+          <w:p>
+            <w:pPr>
+              <w:keepNext/>
+            </w:pPr>
+            <w:r>
+              <w:rPr>
+                <w:sz w:val="19"/>
+                <w:szCs w:val="19"/>
+              </w:rPr>
+              <w:t xml:space="preserve">Lyra e Isolde começam como opostas (natureza x máquina) e aprendem a se respeitar; rivalidade, não ódio</w:t>
+            </w:r>
+          </w:p>
+        </w:tc>
+      </w:tr>
+      <w:tr>
+        <w:trPr>
+          <w:cantSplit/>
+        </w:trPr>
+        <w:tc>
+          <w:tcPr>
+            <w:tcW w:type="dxa" w:w="2410"/>
+            <w:tcBorders>
+              <w:top w:val="single" w:color="C9B8A0" w:sz="4"/>
+              <w:left w:val="single" w:color="C9B8A0" w:sz="4"/>
+              <w:bottom w:val="single" w:color="C9B8A0" w:sz="4"/>
+              <w:right w:val="single" w:color="C9B8A0" w:sz="4"/>
+            </w:tcBorders>
+            <w:tcMar>
+              <w:top w:type="dxa" w:w="60"/>
+              <w:left w:type="dxa" w:w="100"/>
+              <w:bottom w:type="dxa" w:w="60"/>
+              <w:right w:type="dxa" w:w="100"/>
+            </w:tcMar>
+            <w:vAlign w:val="center"/>
+          </w:tcPr>
+          <w:p>
+            <w:pPr>
+              <w:keepNext/>
+            </w:pPr>
+            <w:r>
+              <w:rPr>
+                <w:sz w:val="19"/>
+                <w:szCs w:val="19"/>
+              </w:rPr>
+              <w:t xml:space="preserve">Antes do Ato 2</w:t>
+            </w:r>
+          </w:p>
+        </w:tc>
+        <w:tc>
+          <w:tcPr>
+            <w:tcW w:type="dxa" w:w="7228"/>
+            <w:tcBorders>
+              <w:top w:val="single" w:color="C9B8A0" w:sz="4"/>
+              <w:left w:val="single" w:color="C9B8A0" w:sz="4"/>
+              <w:bottom w:val="single" w:color="C9B8A0" w:sz="4"/>
+              <w:right w:val="single" w:color="C9B8A0" w:sz="4"/>
+            </w:tcBorders>
+            <w:tcMar>
+              <w:top w:type="dxa" w:w="60"/>
+              <w:left w:type="dxa" w:w="100"/>
+              <w:bottom w:type="dxa" w:w="60"/>
+              <w:right w:type="dxa" w:w="100"/>
+            </w:tcMar>
+            <w:vAlign w:val="center"/>
+          </w:tcPr>
+          <w:p>
+            <w:pPr>
+              <w:keepNext/>
+            </w:pPr>
+            <w:r>
+              <w:rPr>
+                <w:sz w:val="19"/>
+                <w:szCs w:val="19"/>
+              </w:rPr>
+              <w:t xml:space="preserve">Isolde só entra no Ato 2, então no Ato 1 a afinidade com Lyra já existe e Isolde precisa "alcançar"</w:t>
+            </w:r>
+          </w:p>
+        </w:tc>
+      </w:tr>
+      <w:tr>
+        <w:trPr>
+          <w:cantSplit/>
+        </w:trPr>
+        <w:tc>
+          <w:tcPr>
+            <w:tcW w:type="dxa" w:w="2410"/>
+            <w:tcBorders>
+              <w:top w:val="single" w:color="C9B8A0" w:sz="4"/>
+              <w:left w:val="single" w:color="C9B8A0" w:sz="4"/>
+              <w:bottom w:val="single" w:color="C9B8A0" w:sz="4"/>
+              <w:right w:val="single" w:color="C9B8A0" w:sz="4"/>
+            </w:tcBorders>
+            <w:tcMar>
+              <w:top w:type="dxa" w:w="60"/>
+              <w:left w:type="dxa" w:w="100"/>
+              <w:bottom w:type="dxa" w:w="60"/>
+              <w:right w:type="dxa" w:w="100"/>
+            </w:tcMar>
+            <w:vAlign w:val="center"/>
+          </w:tcPr>
+          <w:p>
+            <w:pPr>
+              <w:keepNext w:val="false"/>
+            </w:pPr>
+            <w:r>
+              <w:rPr>
+                <w:sz w:val="19"/>
+                <w:szCs w:val="19"/>
+              </w:rPr>
+              <w:t xml:space="preserve">Sem romance</w:t>
+            </w:r>
+          </w:p>
+        </w:tc>
+        <w:tc>
+          <w:tcPr>
+            <w:tcW w:type="dxa" w:w="7228"/>
+            <w:tcBorders>
+              <w:top w:val="single" w:color="C9B8A0" w:sz="4"/>
+              <w:left w:val="single" w:color="C9B8A0" w:sz="4"/>
+              <w:bottom w:val="single" w:color="C9B8A0" w:sz="4"/>
+              <w:right w:val="single" w:color="C9B8A0" w:sz="4"/>
+            </w:tcBorders>
+            <w:tcMar>
+              <w:top w:type="dxa" w:w="60"/>
+              <w:left w:type="dxa" w:w="100"/>
+              <w:bottom w:type="dxa" w:w="60"/>
+              <w:right w:type="dxa" w:w="100"/>
+            </w:tcMar>
+            <w:vAlign w:val="center"/>
+          </w:tcPr>
+          <w:p>
+            <w:pPr>
+              <w:keepNext w:val="false"/>
+            </w:pPr>
+            <w:r>
+              <w:rPr>
+                <w:sz w:val="19"/>
+                <w:szCs w:val="19"/>
+              </w:rPr>
+              <w:t xml:space="preserve">Opção válida: manter as duas como amigas leva a um epílogo focado no grupo</w:t>
+            </w:r>
+          </w:p>
+        </w:tc>
+      </w:tr>
+    </w:tbl>
+    <w:p>
+      <w:pPr>
+        <w:spacing w:after="120"/>
+      </w:pPr>
+    </w:p>
+    <w:p>
+      <w:pPr>
         <w:pStyle w:val="Heading1"/>
         <w:pageBreakBefore/>
       </w:pPr>
@@ -8962,7 +10143,7 @@
         <w:spacing w:after="60"/>
       </w:pPr>
       <w:r>
-        <w:t xml:space="preserve">Gerd se sacrifica para que Kael e Eco fujam. </w:t>
+        <w:t xml:space="preserve">Gerd segura os soldados e a oficina explode — o jogador acredita que ele morreu. </w:t>
       </w:r>
       <w:r>
         <w:rPr>
@@ -9112,7 +10293,7 @@
         <w:spacing w:after="60"/>
       </w:pPr>
       <w:r>
-        <w:t xml:space="preserve">Resgate de Eco; Eco começa a recuperar memórias e lembra de Vaeloth.</w:t>
+        <w:t xml:space="preserve">Pista sobre Gerd: Isolde menciona um velho prisioneiro que "conversa com as engrenagens".</w:t>
       </w:r>
     </w:p>
     <w:p>
@@ -9125,7 +10306,7 @@
         <w:spacing w:after="60"/>
       </w:pPr>
       <w:r>
-        <w:t xml:space="preserve">Revelação: Morvain é Vaeloth; o Imperador tenta impedi-lo e é morto.</w:t>
+        <w:t xml:space="preserve">Noite no convés da Andorinha: primeiro momento-chave do triângulo amoroso.</w:t>
       </w:r>
     </w:p>
     <w:p>
@@ -9138,22 +10319,7 @@
         <w:spacing w:after="60"/>
       </w:pPr>
       <w:r>
-        <w:rPr>
-          <w:b/>
-          <w:bCs/>
-        </w:rPr>
-        <w:t xml:space="preserve">Clímax:</w:t>
-      </w:r>
-      <w:r>
-        <w:t xml:space="preserve"> o Coração desperta; as refinarias sugam o Éter restante; o mundo se parte (continentes rachados, céu dourado). Grupo separado.</w:t>
-      </w:r>
-    </w:p>
-    <w:p>
-      <w:pPr>
-        <w:pStyle w:val="Heading2"/>
-      </w:pPr>
-      <w:r>
-        <w:t xml:space="preserve">Ato 3 — "O Mundo Partido" (3–5 h + opcional)</w:t>
+        <w:t xml:space="preserve">Resgate de Eco; Eco começa a recuperar memórias e lembra de Vaeloth.</w:t>
       </w:r>
     </w:p>
     <w:p>
@@ -9166,7 +10332,7 @@
         <w:spacing w:after="60"/>
       </w:pPr>
       <w:r>
-        <w:t xml:space="preserve">Kael acorda sozinho um ano depois; reúne o grupo (ordem livre, cada resgate é uma missão).</w:t>
+        <w:t xml:space="preserve">Revelação: Morvain é Vaeloth; o Imperador tenta impedi-lo e é morto.</w:t>
       </w:r>
     </w:p>
     <w:p>
@@ -9179,7 +10345,22 @@
         <w:spacing w:after="60"/>
       </w:pPr>
       <w:r>
-        <w:t xml:space="preserve">Missões pessoais opcionais de cada personagem (afetam o final).</w:t>
+        <w:rPr>
+          <w:b/>
+          <w:bCs/>
+        </w:rPr>
+        <w:t xml:space="preserve">Clímax:</w:t>
+      </w:r>
+      <w:r>
+        <w:t xml:space="preserve"> o Coração desperta; as refinarias sugam o Éter restante; o mundo se parte (continentes rachados, céu dourado). Grupo separado.</w:t>
+      </w:r>
+    </w:p>
+    <w:p>
+      <w:pPr>
+        <w:pStyle w:val="Heading2"/>
+      </w:pPr>
+      <w:r>
+        <w:t xml:space="preserve">Ato 3 — "O Mundo Partido" (3–5 h + opcional)</w:t>
       </w:r>
     </w:p>
     <w:p>
@@ -9192,7 +10373,7 @@
         <w:spacing w:after="60"/>
       </w:pPr>
       <w:r>
-        <w:t xml:space="preserve">Aethel, a Cidade Submersa: verdade sobre Eco e a linhagem de Kael.</w:t>
+        <w:t xml:space="preserve">Kael acorda sozinho um ano depois; reúne o grupo (ordem livre, cada resgate é uma missão).</w:t>
       </w:r>
     </w:p>
     <w:p>
@@ -9205,15 +10386,14 @@
         <w:spacing w:after="60"/>
       </w:pPr>
       <w:r>
-        <w:t xml:space="preserve">Invasão do Coração de Éter; batalha contra Voss (poupar ou não), Morvain e Vaeloth.</w:t>
-      </w:r>
-    </w:p>
-    <w:p>
-      <w:pPr>
-        <w:pStyle w:val="Heading2"/>
-      </w:pPr>
-      <w:r>
-        <w:t xml:space="preserve">Final — "O Preço do Futuro"</w:t>
+        <w:rPr>
+          <w:b/>
+          <w:bCs/>
+        </w:rPr>
+        <w:t xml:space="preserve">Reviravolta:</w:t>
+      </w:r>
+      <w:r>
+        <w:t xml:space="preserve"> Gerd está vivo — escapou de Brasaforte no colapso. Reencontro emocional; ele melhora a Andorinha e revela como abrir o Coração.</w:t>
       </w:r>
     </w:p>
     <w:p>
@@ -9226,7 +10406,7 @@
         <w:spacing w:after="60"/>
       </w:pPr>
       <w:r>
-        <w:t xml:space="preserve">Para derrotar Vaeloth, o Éter precisa voltar a circular livre — o que desliga a maioria das máquinas.</w:t>
+        <w:t xml:space="preserve">Missões pessoais opcionais de cada personagem (afetam o final).</w:t>
       </w:r>
     </w:p>
     <w:p>
@@ -9239,14 +10419,7 @@
         <w:spacing w:after="60"/>
       </w:pPr>
       <w:r>
-        <w:rPr>
-          <w:b/>
-          <w:bCs/>
-        </w:rPr>
-        <w:t xml:space="preserve">Final padrão (agridoce):</w:t>
-      </w:r>
-      <w:r>
-        <w:t xml:space="preserve"> Eco usa sua alma de Éter para libertar o Coração e se desliga; a magia volta, a era do vapor termina.</w:t>
+        <w:t xml:space="preserve">Aethel, a Cidade Submersa: verdade sobre Eco e a linhagem de Kael.</w:t>
       </w:r>
     </w:p>
     <w:p>
@@ -9259,14 +10432,15 @@
         <w:spacing w:after="60"/>
       </w:pPr>
       <w:r>
-        <w:rPr>
-          <w:b/>
-          <w:bCs/>
-        </w:rPr>
-        <w:t xml:space="preserve">Final completo (missões pessoais + Voss poupado):</w:t>
-      </w:r>
-      <w:r>
-        <w:t xml:space="preserve"> Kael "ouve" Eco dentro do Éter livre e o traz de volta; Isolde e Kael projetam máquinas que usam o Éter sem consumi-lo — o terceiro caminho.</w:t>
+        <w:t xml:space="preserve">Invasão do Coração de Éter; batalha contra Voss (poupar ou não), Morvain e Vaeloth.</w:t>
+      </w:r>
+    </w:p>
+    <w:p>
+      <w:pPr>
+        <w:pStyle w:val="Heading2"/>
+      </w:pPr>
+      <w:r>
+        <w:t xml:space="preserve">Final — "O Preço do Futuro"</w:t>
       </w:r>
     </w:p>
     <w:p>
@@ -9279,8 +10453,507 @@
         <w:spacing w:after="60"/>
       </w:pPr>
       <w:r>
+        <w:t xml:space="preserve">Para derrotar Vaeloth, o Éter precisa voltar a circular livre — o que desliga a maioria das máquinas.</w:t>
+      </w:r>
+    </w:p>
+    <w:p>
+      <w:pPr>
+        <w:pStyle w:val="ListParagraph"/>
+        <w:numPr>
+          <w:ilvl w:val="0"/>
+          <w:numId w:val="2"/>
+        </w:numPr>
+        <w:spacing w:after="60"/>
+      </w:pPr>
+      <w:r>
+        <w:rPr>
+          <w:b/>
+          <w:bCs/>
+        </w:rPr>
+        <w:t xml:space="preserve">Final padrão (agridoce):</w:t>
+      </w:r>
+      <w:r>
+        <w:t xml:space="preserve"> Eco usa sua alma de Éter para libertar o Coração e se desliga; a magia volta, a era do vapor termina.</w:t>
+      </w:r>
+    </w:p>
+    <w:p>
+      <w:pPr>
+        <w:pStyle w:val="ListParagraph"/>
+        <w:numPr>
+          <w:ilvl w:val="0"/>
+          <w:numId w:val="2"/>
+        </w:numPr>
+        <w:spacing w:after="60"/>
+      </w:pPr>
+      <w:r>
+        <w:rPr>
+          <w:b/>
+          <w:bCs/>
+        </w:rPr>
+        <w:t xml:space="preserve">Final completo (missões pessoais + Voss poupado):</w:t>
+      </w:r>
+      <w:r>
+        <w:t xml:space="preserve"> Kael "ouve" Eco dentro do Éter livre e o traz de volta; o grupo encontra o terceiro caminho — máquinas que usam o Éter sem consumi-lo.</w:t>
+      </w:r>
+    </w:p>
+    <w:p>
+      <w:pPr>
+        <w:pStyle w:val="ListParagraph"/>
+        <w:numPr>
+          <w:ilvl w:val="0"/>
+          <w:numId w:val="2"/>
+        </w:numPr>
+        <w:spacing w:after="60"/>
+      </w:pPr>
+      <w:r>
+        <w:t xml:space="preserve">O epílogo de cada final muda conforme o triângulo amoroso (ver matriz abaixo).</w:t>
+      </w:r>
+    </w:p>
+    <w:p>
+      <w:pPr>
+        <w:pStyle w:val="ListParagraph"/>
+        <w:numPr>
+          <w:ilvl w:val="0"/>
+          <w:numId w:val="2"/>
+        </w:numPr>
+        <w:spacing w:after="60"/>
+      </w:pPr>
+      <w:r>
         <w:t xml:space="preserve">Pós-jogo: New Game+ e chefes secretos (a definir).</w:t>
       </w:r>
+    </w:p>
+    <w:p>
+      <w:pPr>
+        <w:pStyle w:val="Heading2"/>
+      </w:pPr>
+      <w:r>
+        <w:t xml:space="preserve">Matriz de finais</w:t>
+      </w:r>
+    </w:p>
+    <w:p>
+      <w:pPr>
+        <w:keepNext w:val="false"/>
+        <w:spacing w:after="120"/>
+      </w:pPr>
+      <w:r>
+        <w:t xml:space="preserve">Dois finais principais, cada um com um epílogo definido pelo triângulo amoroso — 6 combinações.</w:t>
+      </w:r>
+    </w:p>
+    <w:tbl>
+      <w:tblPr>
+        <w:tblW w:type="dxa" w:w="9638"/>
+        <w:tblBorders>
+          <w:top w:val="single" w:color="auto" w:sz="4"/>
+          <w:left w:val="single" w:color="auto" w:sz="4"/>
+          <w:bottom w:val="single" w:color="auto" w:sz="4"/>
+          <w:right w:val="single" w:color="auto" w:sz="4"/>
+          <w:insideH w:val="single" w:color="auto" w:sz="4"/>
+          <w:insideV w:val="single" w:color="auto" w:sz="4"/>
+        </w:tblBorders>
+      </w:tblPr>
+      <w:tblGrid>
+        <w:gridCol w:w="1735"/>
+        <w:gridCol w:w="3952"/>
+        <w:gridCol w:w="3951"/>
+      </w:tblGrid>
+      <w:tr>
+        <w:trPr>
+          <w:cantSplit/>
+          <w:tblHeader/>
+        </w:trPr>
+        <w:tc>
+          <w:tcPr>
+            <w:tcW w:type="dxa" w:w="1735"/>
+            <w:tcBorders>
+              <w:top w:val="single" w:color="C9B8A0" w:sz="4"/>
+              <w:left w:val="single" w:color="C9B8A0" w:sz="4"/>
+              <w:bottom w:val="single" w:color="C9B8A0" w:sz="4"/>
+              <w:right w:val="single" w:color="C9B8A0" w:sz="4"/>
+            </w:tcBorders>
+            <w:shd w:fill="5A3A1A" w:color="auto" w:val="clear"/>
+            <w:tcMar>
+              <w:top w:type="dxa" w:w="60"/>
+              <w:left w:type="dxa" w:w="100"/>
+              <w:bottom w:type="dxa" w:w="60"/>
+              <w:right w:type="dxa" w:w="100"/>
+            </w:tcMar>
+            <w:vAlign w:val="center"/>
+          </w:tcPr>
+          <w:p>
+            <w:pPr>
+              <w:keepNext/>
+            </w:pPr>
+            <w:r>
+              <w:rPr>
+                <w:b/>
+                <w:bCs/>
+                <w:color w:val="FFFFFF"/>
+                <w:sz w:val="19"/>
+                <w:szCs w:val="19"/>
+              </w:rPr>
+              <w:t xml:space="preserve">Epílogo</w:t>
+            </w:r>
+          </w:p>
+        </w:tc>
+        <w:tc>
+          <w:tcPr>
+            <w:tcW w:type="dxa" w:w="3952"/>
+            <w:tcBorders>
+              <w:top w:val="single" w:color="C9B8A0" w:sz="4"/>
+              <w:left w:val="single" w:color="C9B8A0" w:sz="4"/>
+              <w:bottom w:val="single" w:color="C9B8A0" w:sz="4"/>
+              <w:right w:val="single" w:color="C9B8A0" w:sz="4"/>
+            </w:tcBorders>
+            <w:shd w:fill="5A3A1A" w:color="auto" w:val="clear"/>
+            <w:tcMar>
+              <w:top w:type="dxa" w:w="60"/>
+              <w:left w:type="dxa" w:w="100"/>
+              <w:bottom w:type="dxa" w:w="60"/>
+              <w:right w:type="dxa" w:w="100"/>
+            </w:tcMar>
+            <w:vAlign w:val="center"/>
+          </w:tcPr>
+          <w:p>
+            <w:pPr>
+              <w:keepNext/>
+            </w:pPr>
+            <w:r>
+              <w:rPr>
+                <w:b/>
+                <w:bCs/>
+                <w:color w:val="FFFFFF"/>
+                <w:sz w:val="19"/>
+                <w:szCs w:val="19"/>
+              </w:rPr>
+              <w:t xml:space="preserve">Final agridoce (Eco se desliga)</w:t>
+            </w:r>
+          </w:p>
+        </w:tc>
+        <w:tc>
+          <w:tcPr>
+            <w:tcW w:type="dxa" w:w="3951"/>
+            <w:tcBorders>
+              <w:top w:val="single" w:color="C9B8A0" w:sz="4"/>
+              <w:left w:val="single" w:color="C9B8A0" w:sz="4"/>
+              <w:bottom w:val="single" w:color="C9B8A0" w:sz="4"/>
+              <w:right w:val="single" w:color="C9B8A0" w:sz="4"/>
+            </w:tcBorders>
+            <w:shd w:fill="5A3A1A" w:color="auto" w:val="clear"/>
+            <w:tcMar>
+              <w:top w:type="dxa" w:w="60"/>
+              <w:left w:type="dxa" w:w="100"/>
+              <w:bottom w:type="dxa" w:w="60"/>
+              <w:right w:type="dxa" w:w="100"/>
+            </w:tcMar>
+            <w:vAlign w:val="center"/>
+          </w:tcPr>
+          <w:p>
+            <w:pPr>
+              <w:keepNext/>
+            </w:pPr>
+            <w:r>
+              <w:rPr>
+                <w:b/>
+                <w:bCs/>
+                <w:color w:val="FFFFFF"/>
+                <w:sz w:val="19"/>
+                <w:szCs w:val="19"/>
+              </w:rPr>
+              <w:t xml:space="preserve">Final completo (Eco volta)</w:t>
+            </w:r>
+          </w:p>
+        </w:tc>
+      </w:tr>
+      <w:tr>
+        <w:trPr>
+          <w:cantSplit/>
+        </w:trPr>
+        <w:tc>
+          <w:tcPr>
+            <w:tcW w:type="dxa" w:w="1735"/>
+            <w:tcBorders>
+              <w:top w:val="single" w:color="C9B8A0" w:sz="4"/>
+              <w:left w:val="single" w:color="C9B8A0" w:sz="4"/>
+              <w:bottom w:val="single" w:color="C9B8A0" w:sz="4"/>
+              <w:right w:val="single" w:color="C9B8A0" w:sz="4"/>
+            </w:tcBorders>
+            <w:tcMar>
+              <w:top w:type="dxa" w:w="60"/>
+              <w:left w:type="dxa" w:w="100"/>
+              <w:bottom w:type="dxa" w:w="60"/>
+              <w:right w:type="dxa" w:w="100"/>
+            </w:tcMar>
+            <w:vAlign w:val="center"/>
+          </w:tcPr>
+          <w:p>
+            <w:pPr>
+              <w:keepNext/>
+            </w:pPr>
+            <w:r>
+              <w:rPr>
+                <w:sz w:val="19"/>
+                <w:szCs w:val="19"/>
+              </w:rPr>
+              <w:t xml:space="preserve">Lyra</w:t>
+            </w:r>
+          </w:p>
+        </w:tc>
+        <w:tc>
+          <w:tcPr>
+            <w:tcW w:type="dxa" w:w="3952"/>
+            <w:tcBorders>
+              <w:top w:val="single" w:color="C9B8A0" w:sz="4"/>
+              <w:left w:val="single" w:color="C9B8A0" w:sz="4"/>
+              <w:bottom w:val="single" w:color="C9B8A0" w:sz="4"/>
+              <w:right w:val="single" w:color="C9B8A0" w:sz="4"/>
+            </w:tcBorders>
+            <w:tcMar>
+              <w:top w:type="dxa" w:w="60"/>
+              <w:left w:type="dxa" w:w="100"/>
+              <w:bottom w:type="dxa" w:w="60"/>
+              <w:right w:type="dxa" w:w="100"/>
+            </w:tcMar>
+            <w:vAlign w:val="center"/>
+          </w:tcPr>
+          <w:p>
+            <w:pPr>
+              <w:keepNext/>
+            </w:pPr>
+            <w:r>
+              <w:rPr>
+                <w:sz w:val="19"/>
+                <w:szCs w:val="19"/>
+              </w:rPr>
+              <w:t xml:space="preserve">Kael e Lyra replantam Sylvaran; a floresta renasce, mas sem Eco</w:t>
+            </w:r>
+          </w:p>
+        </w:tc>
+        <w:tc>
+          <w:tcPr>
+            <w:tcW w:type="dxa" w:w="3951"/>
+            <w:tcBorders>
+              <w:top w:val="single" w:color="C9B8A0" w:sz="4"/>
+              <w:left w:val="single" w:color="C9B8A0" w:sz="4"/>
+              <w:bottom w:val="single" w:color="C9B8A0" w:sz="4"/>
+              <w:right w:val="single" w:color="C9B8A0" w:sz="4"/>
+            </w:tcBorders>
+            <w:tcMar>
+              <w:top w:type="dxa" w:w="60"/>
+              <w:left w:type="dxa" w:w="100"/>
+              <w:bottom w:type="dxa" w:w="60"/>
+              <w:right w:type="dxa" w:w="100"/>
+            </w:tcMar>
+            <w:vAlign w:val="center"/>
+          </w:tcPr>
+          <w:p>
+            <w:pPr>
+              <w:keepNext/>
+            </w:pPr>
+            <w:r>
+              <w:rPr>
+                <w:sz w:val="19"/>
+                <w:szCs w:val="19"/>
+              </w:rPr>
+              <w:t xml:space="preserve">Kael, Lyra e Eco cuidam da floresta; máquinas e raízes crescem juntas</w:t>
+            </w:r>
+          </w:p>
+        </w:tc>
+      </w:tr>
+      <w:tr>
+        <w:trPr>
+          <w:cantSplit/>
+        </w:trPr>
+        <w:tc>
+          <w:tcPr>
+            <w:tcW w:type="dxa" w:w="1735"/>
+            <w:tcBorders>
+              <w:top w:val="single" w:color="C9B8A0" w:sz="4"/>
+              <w:left w:val="single" w:color="C9B8A0" w:sz="4"/>
+              <w:bottom w:val="single" w:color="C9B8A0" w:sz="4"/>
+              <w:right w:val="single" w:color="C9B8A0" w:sz="4"/>
+            </w:tcBorders>
+            <w:tcMar>
+              <w:top w:type="dxa" w:w="60"/>
+              <w:left w:type="dxa" w:w="100"/>
+              <w:bottom w:type="dxa" w:w="60"/>
+              <w:right w:type="dxa" w:w="100"/>
+            </w:tcMar>
+            <w:vAlign w:val="center"/>
+          </w:tcPr>
+          <w:p>
+            <w:pPr>
+              <w:keepNext/>
+            </w:pPr>
+            <w:r>
+              <w:rPr>
+                <w:sz w:val="19"/>
+                <w:szCs w:val="19"/>
+              </w:rPr>
+              <w:t xml:space="preserve">Isolde</w:t>
+            </w:r>
+          </w:p>
+        </w:tc>
+        <w:tc>
+          <w:tcPr>
+            <w:tcW w:type="dxa" w:w="3952"/>
+            <w:tcBorders>
+              <w:top w:val="single" w:color="C9B8A0" w:sz="4"/>
+              <w:left w:val="single" w:color="C9B8A0" w:sz="4"/>
+              <w:bottom w:val="single" w:color="C9B8A0" w:sz="4"/>
+              <w:right w:val="single" w:color="C9B8A0" w:sz="4"/>
+            </w:tcBorders>
+            <w:tcMar>
+              <w:top w:type="dxa" w:w="60"/>
+              <w:left w:type="dxa" w:w="100"/>
+              <w:bottom w:type="dxa" w:w="60"/>
+              <w:right w:type="dxa" w:w="100"/>
+            </w:tcMar>
+            <w:vAlign w:val="center"/>
+          </w:tcPr>
+          <w:p>
+            <w:pPr>
+              <w:keepNext/>
+            </w:pPr>
+            <w:r>
+              <w:rPr>
+                <w:sz w:val="19"/>
+                <w:szCs w:val="19"/>
+              </w:rPr>
+              <w:t xml:space="preserve">Kael e Isolde reconstroem Brasaforte sem Éter, em luto por Eco</w:t>
+            </w:r>
+          </w:p>
+        </w:tc>
+        <w:tc>
+          <w:tcPr>
+            <w:tcW w:type="dxa" w:w="3951"/>
+            <w:tcBorders>
+              <w:top w:val="single" w:color="C9B8A0" w:sz="4"/>
+              <w:left w:val="single" w:color="C9B8A0" w:sz="4"/>
+              <w:bottom w:val="single" w:color="C9B8A0" w:sz="4"/>
+              <w:right w:val="single" w:color="C9B8A0" w:sz="4"/>
+            </w:tcBorders>
+            <w:tcMar>
+              <w:top w:type="dxa" w:w="60"/>
+              <w:left w:type="dxa" w:w="100"/>
+              <w:bottom w:type="dxa" w:w="60"/>
+              <w:right w:type="dxa" w:w="100"/>
+            </w:tcMar>
+            <w:vAlign w:val="center"/>
+          </w:tcPr>
+          <w:p>
+            <w:pPr>
+              <w:keepNext/>
+            </w:pPr>
+            <w:r>
+              <w:rPr>
+                <w:sz w:val="19"/>
+                <w:szCs w:val="19"/>
+              </w:rPr>
+              <w:t xml:space="preserve">Kael, Isolde e Eco criam as máquinas que usam o Éter sem consumi-lo</w:t>
+            </w:r>
+          </w:p>
+        </w:tc>
+      </w:tr>
+      <w:tr>
+        <w:trPr>
+          <w:cantSplit/>
+        </w:trPr>
+        <w:tc>
+          <w:tcPr>
+            <w:tcW w:type="dxa" w:w="1735"/>
+            <w:tcBorders>
+              <w:top w:val="single" w:color="C9B8A0" w:sz="4"/>
+              <w:left w:val="single" w:color="C9B8A0" w:sz="4"/>
+              <w:bottom w:val="single" w:color="C9B8A0" w:sz="4"/>
+              <w:right w:val="single" w:color="C9B8A0" w:sz="4"/>
+            </w:tcBorders>
+            <w:tcMar>
+              <w:top w:type="dxa" w:w="60"/>
+              <w:left w:type="dxa" w:w="100"/>
+              <w:bottom w:type="dxa" w:w="60"/>
+              <w:right w:type="dxa" w:w="100"/>
+            </w:tcMar>
+            <w:vAlign w:val="center"/>
+          </w:tcPr>
+          <w:p>
+            <w:pPr>
+              <w:keepNext w:val="false"/>
+            </w:pPr>
+            <w:r>
+              <w:rPr>
+                <w:sz w:val="19"/>
+                <w:szCs w:val="19"/>
+              </w:rPr>
+              <w:t xml:space="preserve">Sem romance</w:t>
+            </w:r>
+          </w:p>
+        </w:tc>
+        <w:tc>
+          <w:tcPr>
+            <w:tcW w:type="dxa" w:w="3952"/>
+            <w:tcBorders>
+              <w:top w:val="single" w:color="C9B8A0" w:sz="4"/>
+              <w:left w:val="single" w:color="C9B8A0" w:sz="4"/>
+              <w:bottom w:val="single" w:color="C9B8A0" w:sz="4"/>
+              <w:right w:val="single" w:color="C9B8A0" w:sz="4"/>
+            </w:tcBorders>
+            <w:tcMar>
+              <w:top w:type="dxa" w:w="60"/>
+              <w:left w:type="dxa" w:w="100"/>
+              <w:bottom w:type="dxa" w:w="60"/>
+              <w:right w:type="dxa" w:w="100"/>
+            </w:tcMar>
+            <w:vAlign w:val="center"/>
+          </w:tcPr>
+          <w:p>
+            <w:pPr>
+              <w:keepNext w:val="false"/>
+            </w:pPr>
+            <w:r>
+              <w:rPr>
+                <w:sz w:val="19"/>
+                <w:szCs w:val="19"/>
+              </w:rPr>
+              <w:t xml:space="preserve">O grupo se despede e cada um segue seu caminho</w:t>
+            </w:r>
+          </w:p>
+        </w:tc>
+        <w:tc>
+          <w:tcPr>
+            <w:tcW w:type="dxa" w:w="3951"/>
+            <w:tcBorders>
+              <w:top w:val="single" w:color="C9B8A0" w:sz="4"/>
+              <w:left w:val="single" w:color="C9B8A0" w:sz="4"/>
+              <w:bottom w:val="single" w:color="C9B8A0" w:sz="4"/>
+              <w:right w:val="single" w:color="C9B8A0" w:sz="4"/>
+            </w:tcBorders>
+            <w:tcMar>
+              <w:top w:type="dxa" w:w="60"/>
+              <w:left w:type="dxa" w:w="100"/>
+              <w:bottom w:type="dxa" w:w="60"/>
+              <w:right w:type="dxa" w:w="100"/>
+            </w:tcMar>
+            <w:vAlign w:val="center"/>
+          </w:tcPr>
+          <w:p>
+            <w:pPr>
+              <w:keepNext w:val="false"/>
+            </w:pPr>
+            <w:r>
+              <w:rPr>
+                <w:sz w:val="19"/>
+                <w:szCs w:val="19"/>
+              </w:rPr>
+              <w:t xml:space="preserve">O grupo reunido funda uma oficina; Gerd e Eco discutem sobre engrenagens</w:t>
+            </w:r>
+          </w:p>
+        </w:tc>
+      </w:tr>
+    </w:tbl>
+    <w:p>
+      <w:pPr>
+        <w:spacing w:after="120"/>
+      </w:pPr>
     </w:p>
     <w:p>
       <w:pPr>
@@ -10002,7 +11675,7 @@
         <w:pageBreakBefore/>
       </w:pPr>
       <w:r>
-        <w:t xml:space="preserve">7. Pontos em aberto para o Diretor</w:t>
+        <w:t xml:space="preserve">7. Decisões da história</w:t>
       </w:r>
     </w:p>
     <w:tbl>
@@ -10019,8 +11692,8 @@
       </w:tblPr>
       <w:tblGrid>
         <w:gridCol w:w="964"/>
+        <w:gridCol w:w="3855"/>
         <w:gridCol w:w="4819"/>
-        <w:gridCol w:w="3855"/>
       </w:tblGrid>
       <w:tr>
         <w:trPr>
@@ -10063,7 +11736,7 @@
         </w:tc>
         <w:tc>
           <w:tcPr>
-            <w:tcW w:type="dxa" w:w="4819"/>
+            <w:tcW w:type="dxa" w:w="3855"/>
             <w:tcBorders>
               <w:top w:val="single" w:color="C9B8A0" w:sz="4"/>
               <w:left w:val="single" w:color="C9B8A0" w:sz="4"/>
@@ -10097,7 +11770,7 @@
         </w:tc>
         <w:tc>
           <w:tcPr>
-            <w:tcW w:type="dxa" w:w="3855"/>
+            <w:tcW w:type="dxa" w:w="4819"/>
             <w:tcBorders>
               <w:top w:val="single" w:color="C9B8A0" w:sz="4"/>
               <w:left w:val="single" w:color="C9B8A0" w:sz="4"/>
@@ -10125,7 +11798,7 @@
                 <w:sz w:val="19"/>
                 <w:szCs w:val="19"/>
               </w:rPr>
-              <w:t xml:space="preserve">Proposta atual</w:t>
+              <w:t xml:space="preserve">Decisão</w:t>
             </w:r>
           </w:p>
         </w:tc>
@@ -10166,6 +11839,36 @@
         </w:tc>
         <w:tc>
           <w:tcPr>
+            <w:tcW w:type="dxa" w:w="3855"/>
+            <w:tcBorders>
+              <w:top w:val="single" w:color="C9B8A0" w:sz="4"/>
+              <w:left w:val="single" w:color="C9B8A0" w:sz="4"/>
+              <w:bottom w:val="single" w:color="C9B8A0" w:sz="4"/>
+              <w:right w:val="single" w:color="C9B8A0" w:sz="4"/>
+            </w:tcBorders>
+            <w:tcMar>
+              <w:top w:type="dxa" w:w="60"/>
+              <w:left w:type="dxa" w:w="100"/>
+              <w:bottom w:type="dxa" w:w="60"/>
+              <w:right w:type="dxa" w:w="100"/>
+            </w:tcMar>
+            <w:vAlign w:val="center"/>
+          </w:tcPr>
+          <w:p>
+            <w:pPr>
+              <w:keepNext/>
+            </w:pPr>
+            <w:r>
+              <w:rPr>
+                <w:sz w:val="19"/>
+                <w:szCs w:val="19"/>
+              </w:rPr>
+              <w:t xml:space="preserve">Nomes (Velmora, Ferrovar, Kael, Eco…)</w:t>
+            </w:r>
+          </w:p>
+        </w:tc>
+        <w:tc>
+          <w:tcPr>
             <w:tcW w:type="dxa" w:w="4819"/>
             <w:tcBorders>
               <w:top w:val="single" w:color="C9B8A0" w:sz="4"/>
@@ -10190,7 +11893,42 @@
                 <w:sz w:val="19"/>
                 <w:szCs w:val="19"/>
               </w:rPr>
-              <w:t xml:space="preserve">Nomes estão bons? (Velmora, Ferrovar, Kael, Eco…)</w:t>
+              <w:t xml:space="preserve">Aprovados</w:t>
+            </w:r>
+          </w:p>
+        </w:tc>
+      </w:tr>
+      <w:tr>
+        <w:trPr>
+          <w:cantSplit/>
+        </w:trPr>
+        <w:tc>
+          <w:tcPr>
+            <w:tcW w:type="dxa" w:w="964"/>
+            <w:tcBorders>
+              <w:top w:val="single" w:color="C9B8A0" w:sz="4"/>
+              <w:left w:val="single" w:color="C9B8A0" w:sz="4"/>
+              <w:bottom w:val="single" w:color="C9B8A0" w:sz="4"/>
+              <w:right w:val="single" w:color="C9B8A0" w:sz="4"/>
+            </w:tcBorders>
+            <w:tcMar>
+              <w:top w:type="dxa" w:w="60"/>
+              <w:left w:type="dxa" w:w="100"/>
+              <w:bottom w:type="dxa" w:w="60"/>
+              <w:right w:type="dxa" w:w="100"/>
+            </w:tcMar>
+            <w:vAlign w:val="center"/>
+          </w:tcPr>
+          <w:p>
+            <w:pPr>
+              <w:keepNext/>
+            </w:pPr>
+            <w:r>
+              <w:rPr>
+                <w:sz w:val="19"/>
+                <w:szCs w:val="19"/>
+              </w:rPr>
+              <w:t xml:space="preserve">H-02</w:t>
             </w:r>
           </w:p>
         </w:tc>
@@ -10220,7 +11958,37 @@
                 <w:sz w:val="19"/>
                 <w:szCs w:val="19"/>
               </w:rPr>
-              <w:t xml:space="preserve">Todos provisórios</w:t>
+              <w:t xml:space="preserve">Número de personagens jogáveis</w:t>
+            </w:r>
+          </w:p>
+        </w:tc>
+        <w:tc>
+          <w:tcPr>
+            <w:tcW w:type="dxa" w:w="4819"/>
+            <w:tcBorders>
+              <w:top w:val="single" w:color="C9B8A0" w:sz="4"/>
+              <w:left w:val="single" w:color="C9B8A0" w:sz="4"/>
+              <w:bottom w:val="single" w:color="C9B8A0" w:sz="4"/>
+              <w:right w:val="single" w:color="C9B8A0" w:sz="4"/>
+            </w:tcBorders>
+            <w:tcMar>
+              <w:top w:type="dxa" w:w="60"/>
+              <w:left w:type="dxa" w:w="100"/>
+              <w:bottom w:type="dxa" w:w="60"/>
+              <w:right w:type="dxa" w:w="100"/>
+            </w:tcMar>
+            <w:vAlign w:val="center"/>
+          </w:tcPr>
+          <w:p>
+            <w:pPr>
+              <w:keepNext/>
+            </w:pPr>
+            <w:r>
+              <w:rPr>
+                <w:sz w:val="19"/>
+                <w:szCs w:val="19"/>
+              </w:rPr>
+              <w:t xml:space="preserve">7 (Isolde entra no Ato 2)</w:t>
             </w:r>
           </w:p>
         </w:tc>
@@ -10255,7 +12023,37 @@
                 <w:sz w:val="19"/>
                 <w:szCs w:val="19"/>
               </w:rPr>
-              <w:t xml:space="preserve">H-02</w:t>
+              <w:t xml:space="preserve">H-03</w:t>
+            </w:r>
+          </w:p>
+        </w:tc>
+        <w:tc>
+          <w:tcPr>
+            <w:tcW w:type="dxa" w:w="3855"/>
+            <w:tcBorders>
+              <w:top w:val="single" w:color="C9B8A0" w:sz="4"/>
+              <w:left w:val="single" w:color="C9B8A0" w:sz="4"/>
+              <w:bottom w:val="single" w:color="C9B8A0" w:sz="4"/>
+              <w:right w:val="single" w:color="C9B8A0" w:sz="4"/>
+            </w:tcBorders>
+            <w:tcMar>
+              <w:top w:type="dxa" w:w="60"/>
+              <w:left w:type="dxa" w:w="100"/>
+              <w:bottom w:type="dxa" w:w="60"/>
+              <w:right w:type="dxa" w:w="100"/>
+            </w:tcMar>
+            <w:vAlign w:val="center"/>
+          </w:tcPr>
+          <w:p>
+            <w:pPr>
+              <w:keepNext/>
+            </w:pPr>
+            <w:r>
+              <w:rPr>
+                <w:sz w:val="19"/>
+                <w:szCs w:val="19"/>
+              </w:rPr>
+              <w:t xml:space="preserve">O mundo se parte no Ato 2?</w:t>
             </w:r>
           </w:p>
         </w:tc>
@@ -10285,7 +12083,42 @@
                 <w:sz w:val="19"/>
                 <w:szCs w:val="19"/>
               </w:rPr>
-              <w:t xml:space="preserve">Sete personagens jogáveis é o número certo?</w:t>
+              <w:t xml:space="preserve">Sim — reaproveita mapas em versão "devastada"</w:t>
+            </w:r>
+          </w:p>
+        </w:tc>
+      </w:tr>
+      <w:tr>
+        <w:trPr>
+          <w:cantSplit/>
+        </w:trPr>
+        <w:tc>
+          <w:tcPr>
+            <w:tcW w:type="dxa" w:w="964"/>
+            <w:tcBorders>
+              <w:top w:val="single" w:color="C9B8A0" w:sz="4"/>
+              <w:left w:val="single" w:color="C9B8A0" w:sz="4"/>
+              <w:bottom w:val="single" w:color="C9B8A0" w:sz="4"/>
+              <w:right w:val="single" w:color="C9B8A0" w:sz="4"/>
+            </w:tcBorders>
+            <w:tcMar>
+              <w:top w:type="dxa" w:w="60"/>
+              <w:left w:type="dxa" w:w="100"/>
+              <w:bottom w:type="dxa" w:w="60"/>
+              <w:right w:type="dxa" w:w="100"/>
+            </w:tcMar>
+            <w:vAlign w:val="center"/>
+          </w:tcPr>
+          <w:p>
+            <w:pPr>
+              <w:keepNext/>
+            </w:pPr>
+            <w:r>
+              <w:rPr>
+                <w:sz w:val="19"/>
+                <w:szCs w:val="19"/>
+              </w:rPr>
+              <w:t xml:space="preserve">H-04</w:t>
             </w:r>
           </w:p>
         </w:tc>
@@ -10315,7 +12148,37 @@
                 <w:sz w:val="19"/>
                 <w:szCs w:val="19"/>
               </w:rPr>
-              <w:t xml:space="preserve">7 (Isolde entra no Ato 2)</w:t>
+              <w:t xml:space="preserve">Quantos finais?</w:t>
+            </w:r>
+          </w:p>
+        </w:tc>
+        <w:tc>
+          <w:tcPr>
+            <w:tcW w:type="dxa" w:w="4819"/>
+            <w:tcBorders>
+              <w:top w:val="single" w:color="C9B8A0" w:sz="4"/>
+              <w:left w:val="single" w:color="C9B8A0" w:sz="4"/>
+              <w:bottom w:val="single" w:color="C9B8A0" w:sz="4"/>
+              <w:right w:val="single" w:color="C9B8A0" w:sz="4"/>
+            </w:tcBorders>
+            <w:tcMar>
+              <w:top w:type="dxa" w:w="60"/>
+              <w:left w:type="dxa" w:w="100"/>
+              <w:bottom w:type="dxa" w:w="60"/>
+              <w:right w:type="dxa" w:w="100"/>
+            </w:tcMar>
+            <w:vAlign w:val="center"/>
+          </w:tcPr>
+          <w:p>
+            <w:pPr>
+              <w:keepNext/>
+            </w:pPr>
+            <w:r>
+              <w:rPr>
+                <w:sz w:val="19"/>
+                <w:szCs w:val="19"/>
+              </w:rPr>
+              <w:t xml:space="preserve">2 principais (agridoce e completo), cada um com epílogo definido pelo romance</w:t>
             </w:r>
           </w:p>
         </w:tc>
@@ -10350,7 +12213,37 @@
                 <w:sz w:val="19"/>
                 <w:szCs w:val="19"/>
               </w:rPr>
-              <w:t xml:space="preserve">H-03</w:t>
+              <w:t xml:space="preserve">H-05</w:t>
+            </w:r>
+          </w:p>
+        </w:tc>
+        <w:tc>
+          <w:tcPr>
+            <w:tcW w:type="dxa" w:w="3855"/>
+            <w:tcBorders>
+              <w:top w:val="single" w:color="C9B8A0" w:sz="4"/>
+              <w:left w:val="single" w:color="C9B8A0" w:sz="4"/>
+              <w:bottom w:val="single" w:color="C9B8A0" w:sz="4"/>
+              <w:right w:val="single" w:color="C9B8A0" w:sz="4"/>
+            </w:tcBorders>
+            <w:tcMar>
+              <w:top w:type="dxa" w:w="60"/>
+              <w:left w:type="dxa" w:w="100"/>
+              <w:bottom w:type="dxa" w:w="60"/>
+              <w:right w:type="dxa" w:w="100"/>
+            </w:tcMar>
+            <w:vAlign w:val="center"/>
+          </w:tcPr>
+          <w:p>
+            <w:pPr>
+              <w:keepNext/>
+            </w:pPr>
+            <w:r>
+              <w:rPr>
+                <w:sz w:val="19"/>
+                <w:szCs w:val="19"/>
+              </w:rPr>
+              <w:t xml:space="preserve">Mestre Gerd morre no prólogo?</w:t>
             </w:r>
           </w:p>
         </w:tc>
@@ -10380,7 +12273,42 @@
                 <w:sz w:val="19"/>
                 <w:szCs w:val="19"/>
               </w:rPr>
-              <w:t xml:space="preserve">O mundo se parte no Ato 2 (estilo FF6)?</w:t>
+              <w:t xml:space="preserve">Morte simulada; ele volta no Ato 3 para ajudar o grupo</w:t>
+            </w:r>
+          </w:p>
+        </w:tc>
+      </w:tr>
+      <w:tr>
+        <w:trPr>
+          <w:cantSplit/>
+        </w:trPr>
+        <w:tc>
+          <w:tcPr>
+            <w:tcW w:type="dxa" w:w="964"/>
+            <w:tcBorders>
+              <w:top w:val="single" w:color="C9B8A0" w:sz="4"/>
+              <w:left w:val="single" w:color="C9B8A0" w:sz="4"/>
+              <w:bottom w:val="single" w:color="C9B8A0" w:sz="4"/>
+              <w:right w:val="single" w:color="C9B8A0" w:sz="4"/>
+            </w:tcBorders>
+            <w:tcMar>
+              <w:top w:type="dxa" w:w="60"/>
+              <w:left w:type="dxa" w:w="100"/>
+              <w:bottom w:type="dxa" w:w="60"/>
+              <w:right w:type="dxa" w:w="100"/>
+            </w:tcMar>
+            <w:vAlign w:val="center"/>
+          </w:tcPr>
+          <w:p>
+            <w:pPr>
+              <w:keepNext w:val="false"/>
+            </w:pPr>
+            <w:r>
+              <w:rPr>
+                <w:sz w:val="19"/>
+                <w:szCs w:val="19"/>
+              </w:rPr>
+              <w:t xml:space="preserve">H-06</w:t>
             </w:r>
           </w:p>
         </w:tc>
@@ -10403,49 +12331,14 @@
           </w:tcPr>
           <w:p>
             <w:pPr>
-              <w:keepNext/>
-            </w:pPr>
-            <w:r>
-              <w:rPr>
-                <w:sz w:val="19"/>
-                <w:szCs w:val="19"/>
-              </w:rPr>
-              <w:t xml:space="preserve">Sim — reaproveita mapas em versão "devastada"</w:t>
-            </w:r>
-          </w:p>
-        </w:tc>
-      </w:tr>
-      <w:tr>
-        <w:trPr>
-          <w:cantSplit/>
-        </w:trPr>
-        <w:tc>
-          <w:tcPr>
-            <w:tcW w:type="dxa" w:w="964"/>
-            <w:tcBorders>
-              <w:top w:val="single" w:color="C9B8A0" w:sz="4"/>
-              <w:left w:val="single" w:color="C9B8A0" w:sz="4"/>
-              <w:bottom w:val="single" w:color="C9B8A0" w:sz="4"/>
-              <w:right w:val="single" w:color="C9B8A0" w:sz="4"/>
-            </w:tcBorders>
-            <w:tcMar>
-              <w:top w:type="dxa" w:w="60"/>
-              <w:left w:type="dxa" w:w="100"/>
-              <w:bottom w:type="dxa" w:w="60"/>
-              <w:right w:type="dxa" w:w="100"/>
-            </w:tcMar>
-            <w:vAlign w:val="center"/>
-          </w:tcPr>
-          <w:p>
-            <w:pPr>
-              <w:keepNext/>
-            </w:pPr>
-            <w:r>
-              <w:rPr>
-                <w:sz w:val="19"/>
-                <w:szCs w:val="19"/>
-              </w:rPr>
-              <w:t xml:space="preserve">H-04</w:t>
+              <w:keepNext w:val="false"/>
+            </w:pPr>
+            <w:r>
+              <w:rPr>
+                <w:sz w:val="19"/>
+                <w:szCs w:val="19"/>
+              </w:rPr>
+              <w:t xml:space="preserve">Romance entre personagens?</w:t>
             </w:r>
           </w:p>
         </w:tc>
@@ -10468,166 +12361,6 @@
           </w:tcPr>
           <w:p>
             <w:pPr>
-              <w:keepNext/>
-            </w:pPr>
-            <w:r>
-              <w:rPr>
-                <w:sz w:val="19"/>
-                <w:szCs w:val="19"/>
-              </w:rPr>
-              <w:t xml:space="preserve">Quantos finais?</w:t>
-            </w:r>
-          </w:p>
-        </w:tc>
-        <w:tc>
-          <w:tcPr>
-            <w:tcW w:type="dxa" w:w="3855"/>
-            <w:tcBorders>
-              <w:top w:val="single" w:color="C9B8A0" w:sz="4"/>
-              <w:left w:val="single" w:color="C9B8A0" w:sz="4"/>
-              <w:bottom w:val="single" w:color="C9B8A0" w:sz="4"/>
-              <w:right w:val="single" w:color="C9B8A0" w:sz="4"/>
-            </w:tcBorders>
-            <w:tcMar>
-              <w:top w:type="dxa" w:w="60"/>
-              <w:left w:type="dxa" w:w="100"/>
-              <w:bottom w:type="dxa" w:w="60"/>
-              <w:right w:type="dxa" w:w="100"/>
-            </w:tcMar>
-            <w:vAlign w:val="center"/>
-          </w:tcPr>
-          <w:p>
-            <w:pPr>
-              <w:keepNext/>
-            </w:pPr>
-            <w:r>
-              <w:rPr>
-                <w:sz w:val="19"/>
-                <w:szCs w:val="19"/>
-              </w:rPr>
-              <w:t xml:space="preserve">2 (agridoce e completo)</w:t>
-            </w:r>
-          </w:p>
-        </w:tc>
-      </w:tr>
-      <w:tr>
-        <w:trPr>
-          <w:cantSplit/>
-        </w:trPr>
-        <w:tc>
-          <w:tcPr>
-            <w:tcW w:type="dxa" w:w="964"/>
-            <w:tcBorders>
-              <w:top w:val="single" w:color="C9B8A0" w:sz="4"/>
-              <w:left w:val="single" w:color="C9B8A0" w:sz="4"/>
-              <w:bottom w:val="single" w:color="C9B8A0" w:sz="4"/>
-              <w:right w:val="single" w:color="C9B8A0" w:sz="4"/>
-            </w:tcBorders>
-            <w:tcMar>
-              <w:top w:type="dxa" w:w="60"/>
-              <w:left w:type="dxa" w:w="100"/>
-              <w:bottom w:type="dxa" w:w="60"/>
-              <w:right w:type="dxa" w:w="100"/>
-            </w:tcMar>
-            <w:vAlign w:val="center"/>
-          </w:tcPr>
-          <w:p>
-            <w:pPr>
-              <w:keepNext/>
-            </w:pPr>
-            <w:r>
-              <w:rPr>
-                <w:sz w:val="19"/>
-                <w:szCs w:val="19"/>
-              </w:rPr>
-              <w:t xml:space="preserve">H-05</w:t>
-            </w:r>
-          </w:p>
-        </w:tc>
-        <w:tc>
-          <w:tcPr>
-            <w:tcW w:type="dxa" w:w="4819"/>
-            <w:tcBorders>
-              <w:top w:val="single" w:color="C9B8A0" w:sz="4"/>
-              <w:left w:val="single" w:color="C9B8A0" w:sz="4"/>
-              <w:bottom w:val="single" w:color="C9B8A0" w:sz="4"/>
-              <w:right w:val="single" w:color="C9B8A0" w:sz="4"/>
-            </w:tcBorders>
-            <w:tcMar>
-              <w:top w:type="dxa" w:w="60"/>
-              <w:left w:type="dxa" w:w="100"/>
-              <w:bottom w:type="dxa" w:w="60"/>
-              <w:right w:type="dxa" w:w="100"/>
-            </w:tcMar>
-            <w:vAlign w:val="center"/>
-          </w:tcPr>
-          <w:p>
-            <w:pPr>
-              <w:keepNext/>
-            </w:pPr>
-            <w:r>
-              <w:rPr>
-                <w:sz w:val="19"/>
-                <w:szCs w:val="19"/>
-              </w:rPr>
-              <w:t xml:space="preserve">Mestre Gerd morre no prólogo?</w:t>
-            </w:r>
-          </w:p>
-        </w:tc>
-        <w:tc>
-          <w:tcPr>
-            <w:tcW w:type="dxa" w:w="3855"/>
-            <w:tcBorders>
-              <w:top w:val="single" w:color="C9B8A0" w:sz="4"/>
-              <w:left w:val="single" w:color="C9B8A0" w:sz="4"/>
-              <w:bottom w:val="single" w:color="C9B8A0" w:sz="4"/>
-              <w:right w:val="single" w:color="C9B8A0" w:sz="4"/>
-            </w:tcBorders>
-            <w:tcMar>
-              <w:top w:type="dxa" w:w="60"/>
-              <w:left w:type="dxa" w:w="100"/>
-              <w:bottom w:type="dxa" w:w="60"/>
-              <w:right w:type="dxa" w:w="100"/>
-            </w:tcMar>
-            <w:vAlign w:val="center"/>
-          </w:tcPr>
-          <w:p>
-            <w:pPr>
-              <w:keepNext/>
-            </w:pPr>
-            <w:r>
-              <w:rPr>
-                <w:sz w:val="19"/>
-                <w:szCs w:val="19"/>
-              </w:rPr>
-              <w:t xml:space="preserve">Sim — primeira perda</w:t>
-            </w:r>
-          </w:p>
-        </w:tc>
-      </w:tr>
-      <w:tr>
-        <w:trPr>
-          <w:cantSplit/>
-        </w:trPr>
-        <w:tc>
-          <w:tcPr>
-            <w:tcW w:type="dxa" w:w="964"/>
-            <w:tcBorders>
-              <w:top w:val="single" w:color="C9B8A0" w:sz="4"/>
-              <w:left w:val="single" w:color="C9B8A0" w:sz="4"/>
-              <w:bottom w:val="single" w:color="C9B8A0" w:sz="4"/>
-              <w:right w:val="single" w:color="C9B8A0" w:sz="4"/>
-            </w:tcBorders>
-            <w:tcMar>
-              <w:top w:type="dxa" w:w="60"/>
-              <w:left w:type="dxa" w:w="100"/>
-              <w:bottom w:type="dxa" w:w="60"/>
-              <w:right w:type="dxa" w:w="100"/>
-            </w:tcMar>
-            <w:vAlign w:val="center"/>
-          </w:tcPr>
-          <w:p>
-            <w:pPr>
               <w:keepNext w:val="false"/>
             </w:pPr>
             <w:r>
@@ -10635,67 +12368,7 @@
                 <w:sz w:val="19"/>
                 <w:szCs w:val="19"/>
               </w:rPr>
-              <w:t xml:space="preserve">H-06</w:t>
-            </w:r>
-          </w:p>
-        </w:tc>
-        <w:tc>
-          <w:tcPr>
-            <w:tcW w:type="dxa" w:w="4819"/>
-            <w:tcBorders>
-              <w:top w:val="single" w:color="C9B8A0" w:sz="4"/>
-              <w:left w:val="single" w:color="C9B8A0" w:sz="4"/>
-              <w:bottom w:val="single" w:color="C9B8A0" w:sz="4"/>
-              <w:right w:val="single" w:color="C9B8A0" w:sz="4"/>
-            </w:tcBorders>
-            <w:tcMar>
-              <w:top w:type="dxa" w:w="60"/>
-              <w:left w:type="dxa" w:w="100"/>
-              <w:bottom w:type="dxa" w:w="60"/>
-              <w:right w:type="dxa" w:w="100"/>
-            </w:tcMar>
-            <w:vAlign w:val="center"/>
-          </w:tcPr>
-          <w:p>
-            <w:pPr>
-              <w:keepNext w:val="false"/>
-            </w:pPr>
-            <w:r>
-              <w:rPr>
-                <w:sz w:val="19"/>
-                <w:szCs w:val="19"/>
-              </w:rPr>
-              <w:t xml:space="preserve">Romance entre personagens?</w:t>
-            </w:r>
-          </w:p>
-        </w:tc>
-        <w:tc>
-          <w:tcPr>
-            <w:tcW w:type="dxa" w:w="3855"/>
-            <w:tcBorders>
-              <w:top w:val="single" w:color="C9B8A0" w:sz="4"/>
-              <w:left w:val="single" w:color="C9B8A0" w:sz="4"/>
-              <w:bottom w:val="single" w:color="C9B8A0" w:sz="4"/>
-              <w:right w:val="single" w:color="C9B8A0" w:sz="4"/>
-            </w:tcBorders>
-            <w:tcMar>
-              <w:top w:type="dxa" w:w="60"/>
-              <w:left w:type="dxa" w:w="100"/>
-              <w:bottom w:type="dxa" w:w="60"/>
-              <w:right w:type="dxa" w:w="100"/>
-            </w:tcMar>
-            <w:vAlign w:val="center"/>
-          </w:tcPr>
-          <w:p>
-            <w:pPr>
-              <w:keepNext w:val="false"/>
-            </w:pPr>
-            <w:r>
-              <w:rPr>
-                <w:sz w:val="19"/>
-                <w:szCs w:val="19"/>
-              </w:rPr>
-              <w:t xml:space="preserve">Sutil, sem ser central</w:t>
+              <w:t xml:space="preserve">Triângulo Kael–Lyra–Isolde com afinidade; muda o epílogo</w:t>
             </w:r>
           </w:p>
         </w:tc>

</xml_diff>